<commit_message>
Update Lab 2 Microservices Edge Case Testing Report and add sleep for timeout testing
- Revised the report for clarity and structure, including a test coverage matrix and detailed sequential curl procedures.
- Added deterministic pre-conditions for database resets to ensure consistent testing.
- Included specific curl commands for testing various edge cases, including validation errors, not found errors, and duplicate entries.
- Implemented a temporary sleep in the StudentController for simulating service timeout during testing.
</commit_message>
<xml_diff>
--- a/lab1/docs/lab1-report.docx
+++ b/lab1/docs/lab1-report.docx
@@ -4,6 +4,25 @@
   <w:body>
     <w:p>
       <w:pPr>
+        <w:spacing w:before="60" w:after="60"/>
+        <w:jc w:val="center"/>
+        <w:rPr>
+          <w:rFonts w:asciiTheme="minorHAnsi" w:hAnsiTheme="minorHAnsi"/>
+          <w:sz w:val="22"/>
+        </w:rPr>
+      </w:pPr>
+      <w:r>
+        <w:rPr>
+          <w:rFonts w:asciiTheme="minorHAnsi" w:eastAsia="Cambria" w:hAnsiTheme="minorHAnsi"/>
+          <w:b/>
+          <w:bCs/>
+          <w:sz w:val="22"/>
+        </w:rPr>
+        <w:t>ITSAR2 313 – SYSTEM INTEGRATION AND ARCHITECTURE 2</w:t>
+      </w:r>
+    </w:p>
+    <w:p>
+      <w:pPr>
         <w:spacing w:after="120"/>
         <w:jc w:val="center"/>
         <w:rPr>
@@ -22,7 +41,7 @@
     </w:p>
     <w:p>
       <w:pPr>
-        <w:spacing w:after="240"/>
+        <w:spacing w:after="0" w:line="240" w:lineRule="auto"/>
         <w:jc w:val="center"/>
         <w:rPr>
           <w:rFonts w:asciiTheme="minorHAnsi" w:hAnsiTheme="minorHAnsi"/>
@@ -31,211 +50,250 @@
       </w:pPr>
       <w:r>
         <w:rPr>
-          <w:rFonts w:asciiTheme="minorHAnsi" w:hAnsiTheme="minorHAnsi"/>
-          <w:sz w:val="22"/>
-        </w:rPr>
-        <w:t>Sagum, Patrick R</w:t>
-      </w:r>
-      <w:r>
-        <w:rPr>
-          <w:rFonts w:asciiTheme="minorHAnsi" w:hAnsiTheme="minorHAnsi"/>
-          <w:sz w:val="22"/>
-        </w:rPr>
-        <w:t>uiz</w:t>
-      </w:r>
-      <w:r>
-        <w:rPr>
-          <w:rFonts w:asciiTheme="minorHAnsi" w:hAnsiTheme="minorHAnsi"/>
-          <w:sz w:val="22"/>
-        </w:rPr>
-        <w:t>.; Henson, Princess Terana Caram Rasonable;</w:t>
-      </w:r>
-      <w:r>
-        <w:rPr>
-          <w:rFonts w:asciiTheme="minorHAnsi" w:hAnsiTheme="minorHAnsi"/>
-          <w:sz w:val="22"/>
-        </w:rPr>
-        <w:br/>
-      </w:r>
-      <w:r>
-        <w:rPr>
-          <w:rFonts w:asciiTheme="minorHAnsi" w:hAnsiTheme="minorHAnsi"/>
-          <w:sz w:val="22"/>
-        </w:rPr>
-        <w:t>Gargarita, Trisha Faith Casiano; Mogat, Ela Mae Trojillo;</w:t>
-      </w:r>
-      <w:r>
-        <w:rPr>
-          <w:rFonts w:asciiTheme="minorHAnsi" w:hAnsiTheme="minorHAnsi"/>
-          <w:sz w:val="22"/>
-        </w:rPr>
-        <w:br/>
-      </w:r>
-      <w:r>
-        <w:rPr>
-          <w:rFonts w:asciiTheme="minorHAnsi" w:hAnsiTheme="minorHAnsi"/>
-          <w:sz w:val="22"/>
-        </w:rPr>
-        <w:t>Tibo-oc, Paul Felippe Gelle</w:t>
-      </w:r>
-      <w:r>
-        <w:rPr>
-          <w:rFonts w:asciiTheme="minorHAnsi" w:hAnsiTheme="minorHAnsi"/>
-          <w:sz w:val="22"/>
-        </w:rPr>
-        <w:br/>
-      </w:r>
-      <w:r>
-        <w:rPr>
-          <w:rFonts w:asciiTheme="minorHAnsi" w:hAnsiTheme="minorHAnsi"/>
-          <w:i/>
-          <w:sz w:val="22"/>
-        </w:rPr>
-        <w:t>Information Technology, College of Computer Studies</w:t>
-      </w:r>
-      <w:r>
-        <w:rPr>
-          <w:rFonts w:asciiTheme="minorHAnsi" w:hAnsiTheme="minorHAnsi"/>
-          <w:i/>
-          <w:sz w:val="22"/>
-        </w:rPr>
-        <w:br/>
-      </w:r>
-      <w:r>
-        <w:rPr>
-          <w:rFonts w:asciiTheme="minorHAnsi" w:hAnsiTheme="minorHAnsi"/>
-          <w:i/>
-          <w:sz w:val="22"/>
-        </w:rPr>
-        <w:t>Carlos Hilado Memorial State University</w:t>
+          <w:rFonts w:asciiTheme="minorHAnsi" w:eastAsia="Cambria" w:hAnsiTheme="minorHAnsi"/>
+          <w:sz w:val="22"/>
+        </w:rPr>
+        <w:t xml:space="preserve">Sagum, Patrick Ruiz; Henson, Princess </w:t>
+      </w:r>
+      <w:proofErr w:type="spellStart"/>
+      <w:r>
+        <w:rPr>
+          <w:rFonts w:asciiTheme="minorHAnsi" w:eastAsia="Cambria" w:hAnsiTheme="minorHAnsi"/>
+          <w:sz w:val="22"/>
+        </w:rPr>
+        <w:t>Terana</w:t>
+      </w:r>
+      <w:proofErr w:type="spellEnd"/>
+      <w:r>
+        <w:rPr>
+          <w:rFonts w:asciiTheme="minorHAnsi" w:eastAsia="Cambria" w:hAnsiTheme="minorHAnsi"/>
+          <w:sz w:val="22"/>
+        </w:rPr>
+        <w:t xml:space="preserve"> </w:t>
+      </w:r>
+      <w:proofErr w:type="spellStart"/>
+      <w:r>
+        <w:rPr>
+          <w:rFonts w:asciiTheme="minorHAnsi" w:eastAsia="Cambria" w:hAnsiTheme="minorHAnsi"/>
+          <w:sz w:val="22"/>
+        </w:rPr>
+        <w:t>Caram</w:t>
+      </w:r>
+      <w:proofErr w:type="spellEnd"/>
+      <w:r>
+        <w:rPr>
+          <w:rFonts w:asciiTheme="minorHAnsi" w:eastAsia="Cambria" w:hAnsiTheme="minorHAnsi"/>
+          <w:sz w:val="22"/>
+        </w:rPr>
+        <w:t xml:space="preserve"> </w:t>
+      </w:r>
+      <w:proofErr w:type="spellStart"/>
+      <w:r>
+        <w:rPr>
+          <w:rFonts w:asciiTheme="minorHAnsi" w:eastAsia="Cambria" w:hAnsiTheme="minorHAnsi"/>
+          <w:sz w:val="22"/>
+        </w:rPr>
+        <w:t>Rasonable</w:t>
+      </w:r>
+      <w:proofErr w:type="spellEnd"/>
+      <w:r>
+        <w:rPr>
+          <w:rFonts w:asciiTheme="minorHAnsi" w:eastAsia="Cambria" w:hAnsiTheme="minorHAnsi"/>
+          <w:sz w:val="22"/>
+        </w:rPr>
+        <w:t>;</w:t>
       </w:r>
     </w:p>
     <w:p>
       <w:pPr>
-        <w:spacing w:before="240" w:after="120"/>
-        <w:rPr>
-          <w:rFonts w:asciiTheme="minorHAnsi" w:hAnsiTheme="minorHAnsi"/>
-          <w:sz w:val="22"/>
-        </w:rPr>
-      </w:pPr>
-      <w:r>
-        <w:rPr>
-          <w:rFonts w:asciiTheme="minorHAnsi" w:hAnsiTheme="minorHAnsi"/>
-          <w:b/>
-          <w:sz w:val="22"/>
-        </w:rPr>
-        <w:t>Abstract</w:t>
+        <w:spacing w:after="0" w:line="240" w:lineRule="auto"/>
+        <w:jc w:val="center"/>
+        <w:rPr>
+          <w:rFonts w:asciiTheme="minorHAnsi" w:hAnsiTheme="minorHAnsi"/>
+          <w:sz w:val="22"/>
+        </w:rPr>
+      </w:pPr>
+      <w:proofErr w:type="spellStart"/>
+      <w:r>
+        <w:rPr>
+          <w:rFonts w:asciiTheme="minorHAnsi" w:eastAsia="Cambria" w:hAnsiTheme="minorHAnsi"/>
+          <w:sz w:val="22"/>
+        </w:rPr>
+        <w:t>Gargarita</w:t>
+      </w:r>
+      <w:proofErr w:type="spellEnd"/>
+      <w:r>
+        <w:rPr>
+          <w:rFonts w:asciiTheme="minorHAnsi" w:eastAsia="Cambria" w:hAnsiTheme="minorHAnsi"/>
+          <w:sz w:val="22"/>
+        </w:rPr>
+        <w:t xml:space="preserve">, Trisha Faith </w:t>
+      </w:r>
+      <w:proofErr w:type="spellStart"/>
+      <w:r>
+        <w:rPr>
+          <w:rFonts w:asciiTheme="minorHAnsi" w:eastAsia="Cambria" w:hAnsiTheme="minorHAnsi"/>
+          <w:sz w:val="22"/>
+        </w:rPr>
+        <w:t>Casiano</w:t>
+      </w:r>
+      <w:proofErr w:type="spellEnd"/>
+      <w:r>
+        <w:rPr>
+          <w:rFonts w:asciiTheme="minorHAnsi" w:eastAsia="Cambria" w:hAnsiTheme="minorHAnsi"/>
+          <w:sz w:val="22"/>
+        </w:rPr>
+        <w:t xml:space="preserve">; </w:t>
+      </w:r>
+      <w:proofErr w:type="spellStart"/>
+      <w:r>
+        <w:rPr>
+          <w:rFonts w:asciiTheme="minorHAnsi" w:eastAsia="Cambria" w:hAnsiTheme="minorHAnsi"/>
+          <w:sz w:val="22"/>
+        </w:rPr>
+        <w:t>Mogat</w:t>
+      </w:r>
+      <w:proofErr w:type="spellEnd"/>
+      <w:r>
+        <w:rPr>
+          <w:rFonts w:asciiTheme="minorHAnsi" w:eastAsia="Cambria" w:hAnsiTheme="minorHAnsi"/>
+          <w:sz w:val="22"/>
+        </w:rPr>
+        <w:t xml:space="preserve">, Ela Mae </w:t>
+      </w:r>
+      <w:proofErr w:type="spellStart"/>
+      <w:r>
+        <w:rPr>
+          <w:rFonts w:asciiTheme="minorHAnsi" w:eastAsia="Cambria" w:hAnsiTheme="minorHAnsi"/>
+          <w:sz w:val="22"/>
+        </w:rPr>
+        <w:t>Trojillo</w:t>
+      </w:r>
+      <w:proofErr w:type="spellEnd"/>
+      <w:r>
+        <w:rPr>
+          <w:rFonts w:asciiTheme="minorHAnsi" w:eastAsia="Cambria" w:hAnsiTheme="minorHAnsi"/>
+          <w:sz w:val="22"/>
+        </w:rPr>
+        <w:t>;</w:t>
       </w:r>
     </w:p>
     <w:p>
       <w:pPr>
-        <w:rPr>
-          <w:rFonts w:asciiTheme="minorHAnsi" w:hAnsiTheme="minorHAnsi"/>
-          <w:sz w:val="22"/>
-        </w:rPr>
-      </w:pPr>
-      <w:r>
-        <w:rPr>
-          <w:rFonts w:asciiTheme="minorHAnsi" w:hAnsiTheme="minorHAnsi"/>
-          <w:sz w:val="22"/>
-        </w:rPr>
-        <w:t>This laboratory exercise involved building a monolithic Laravel application (lab1/academe/) and three independent microservices (student-service, course-service, enrollment-service) using the Model–View–Cont</w:t>
-      </w:r>
-      <w:r>
-        <w:rPr>
-          <w:rFonts w:asciiTheme="minorHAnsi" w:hAnsiTheme="minorHAnsi"/>
-          <w:sz w:val="22"/>
-        </w:rPr>
-        <w:t>roller–Repository (MVCR) pattern. An ENV switch mechanism via APP_BACKEND in .env allows the same Blade frontend to route requests to either the local Repository (monolithic mode) or HTTP Service Clients (microservices mode). The key finding is that the mo</w:t>
-      </w:r>
-      <w:r>
-        <w:rPr>
-          <w:rFonts w:asciiTheme="minorHAnsi" w:hAnsiTheme="minorHAnsi"/>
-          <w:sz w:val="22"/>
-        </w:rPr>
-        <w:t xml:space="preserve">nolithic architecture is simpler at this scale — one codebase, one database, one deployment command — while the microservices architecture demonstrates independent scalability and fault isolation. The preferred architecture is monolithic for student-scale </w:t>
-      </w:r>
-      <w:r>
-        <w:rPr>
-          <w:rFonts w:asciiTheme="minorHAnsi" w:hAnsiTheme="minorHAnsi"/>
-          <w:sz w:val="22"/>
-        </w:rPr>
-        <w:t>systems and microservices for team-scale systems.</w:t>
-      </w:r>
+        <w:spacing w:after="0" w:line="240" w:lineRule="auto"/>
+        <w:jc w:val="center"/>
+        <w:rPr>
+          <w:rFonts w:asciiTheme="minorHAnsi" w:hAnsiTheme="minorHAnsi"/>
+          <w:sz w:val="22"/>
+        </w:rPr>
+      </w:pPr>
+      <w:proofErr w:type="spellStart"/>
+      <w:r>
+        <w:rPr>
+          <w:rFonts w:asciiTheme="minorHAnsi" w:eastAsia="Cambria" w:hAnsiTheme="minorHAnsi"/>
+          <w:sz w:val="22"/>
+        </w:rPr>
+        <w:t>Tibo-oc</w:t>
+      </w:r>
+      <w:proofErr w:type="spellEnd"/>
+      <w:r>
+        <w:rPr>
+          <w:rFonts w:asciiTheme="minorHAnsi" w:eastAsia="Cambria" w:hAnsiTheme="minorHAnsi"/>
+          <w:sz w:val="22"/>
+        </w:rPr>
+        <w:t xml:space="preserve">, Paul </w:t>
+      </w:r>
+      <w:proofErr w:type="spellStart"/>
+      <w:r>
+        <w:rPr>
+          <w:rFonts w:asciiTheme="minorHAnsi" w:eastAsia="Cambria" w:hAnsiTheme="minorHAnsi"/>
+          <w:sz w:val="22"/>
+        </w:rPr>
+        <w:t>Felippe</w:t>
+      </w:r>
+      <w:proofErr w:type="spellEnd"/>
+      <w:r>
+        <w:rPr>
+          <w:rFonts w:asciiTheme="minorHAnsi" w:eastAsia="Cambria" w:hAnsiTheme="minorHAnsi"/>
+          <w:sz w:val="22"/>
+        </w:rPr>
+        <w:t xml:space="preserve"> </w:t>
+      </w:r>
+      <w:proofErr w:type="spellStart"/>
+      <w:r>
+        <w:rPr>
+          <w:rFonts w:asciiTheme="minorHAnsi" w:eastAsia="Cambria" w:hAnsiTheme="minorHAnsi"/>
+          <w:sz w:val="22"/>
+        </w:rPr>
+        <w:t>Gelle</w:t>
+      </w:r>
+      <w:proofErr w:type="spellEnd"/>
     </w:p>
     <w:p>
       <w:pPr>
-        <w:spacing w:before="240" w:after="120"/>
-        <w:rPr>
-          <w:rFonts w:asciiTheme="minorHAnsi" w:hAnsiTheme="minorHAnsi"/>
-          <w:sz w:val="22"/>
-        </w:rPr>
-      </w:pPr>
-      <w:r>
-        <w:rPr>
-          <w:rFonts w:asciiTheme="minorHAnsi" w:hAnsiTheme="minorHAnsi"/>
-          <w:b/>
-          <w:sz w:val="22"/>
-        </w:rPr>
-        <w:t>I. INTRODUCTION</w:t>
+        <w:spacing w:after="0" w:line="240" w:lineRule="auto"/>
+        <w:jc w:val="center"/>
+        <w:rPr>
+          <w:rFonts w:asciiTheme="minorHAnsi" w:hAnsiTheme="minorHAnsi"/>
+          <w:sz w:val="22"/>
+        </w:rPr>
+      </w:pPr>
+      <w:r>
+        <w:rPr>
+          <w:rFonts w:asciiTheme="minorHAnsi" w:eastAsia="Cambria" w:hAnsiTheme="minorHAnsi"/>
+          <w:sz w:val="22"/>
+        </w:rPr>
+        <w:t>Information Technology, College of Computer Studies</w:t>
       </w:r>
     </w:p>
     <w:p>
       <w:pPr>
-        <w:rPr>
-          <w:rFonts w:asciiTheme="minorHAnsi" w:hAnsiTheme="minorHAnsi"/>
-          <w:sz w:val="22"/>
-        </w:rPr>
-      </w:pPr>
-      <w:r>
-        <w:rPr>
-          <w:rFonts w:asciiTheme="minorHAnsi" w:hAnsiTheme="minorHAnsi"/>
-          <w:sz w:val="22"/>
-        </w:rPr>
-        <w:t>Monolithic architecture is a software design approach where all application components — user interface, business logic, and data access — are built and deployed as a single unit. The entire</w:t>
-      </w:r>
-      <w:r>
-        <w:rPr>
-          <w:rFonts w:asciiTheme="minorHAnsi" w:hAnsiTheme="minorHAnsi"/>
-          <w:sz w:val="22"/>
-        </w:rPr>
-        <w:t xml:space="preserve"> application shares one codebase and one database. Components are tightly coupled through direct method calls and shared memory. Deployment is straightforward: a single command starts the entire system. However, scaling individual components independently </w:t>
-      </w:r>
-      <w:r>
-        <w:rPr>
-          <w:rFonts w:asciiTheme="minorHAnsi" w:hAnsiTheme="minorHAnsi"/>
-          <w:sz w:val="22"/>
-        </w:rPr>
-        <w:t>is not possible — the entire application must scale as one unit, and a failure in any component affects the whole system.</w:t>
+        <w:spacing w:after="0" w:line="240" w:lineRule="auto"/>
+        <w:jc w:val="center"/>
+        <w:rPr>
+          <w:rFonts w:asciiTheme="minorHAnsi" w:hAnsiTheme="minorHAnsi"/>
+          <w:sz w:val="22"/>
+        </w:rPr>
+      </w:pPr>
+      <w:r>
+        <w:rPr>
+          <w:rFonts w:asciiTheme="minorHAnsi" w:eastAsia="Cambria" w:hAnsiTheme="minorHAnsi"/>
+          <w:sz w:val="22"/>
+        </w:rPr>
+        <w:t xml:space="preserve">Carlos </w:t>
+      </w:r>
+      <w:proofErr w:type="spellStart"/>
+      <w:r>
+        <w:rPr>
+          <w:rFonts w:asciiTheme="minorHAnsi" w:eastAsia="Cambria" w:hAnsiTheme="minorHAnsi"/>
+          <w:sz w:val="22"/>
+        </w:rPr>
+        <w:t>Hilado</w:t>
+      </w:r>
+      <w:proofErr w:type="spellEnd"/>
+      <w:r>
+        <w:rPr>
+          <w:rFonts w:asciiTheme="minorHAnsi" w:eastAsia="Cambria" w:hAnsiTheme="minorHAnsi"/>
+          <w:sz w:val="22"/>
+        </w:rPr>
+        <w:t xml:space="preserve"> Memorial State University</w:t>
       </w:r>
     </w:p>
     <w:p>
       <w:pPr>
-        <w:rPr>
-          <w:rFonts w:asciiTheme="minorHAnsi" w:hAnsiTheme="minorHAnsi"/>
-          <w:sz w:val="22"/>
-        </w:rPr>
-      </w:pPr>
-      <w:r>
-        <w:rPr>
-          <w:rFonts w:asciiTheme="minorHAnsi" w:hAnsiTheme="minorHAnsi"/>
-          <w:sz w:val="22"/>
-        </w:rPr>
-        <w:t>Microservices architecture decomposes the application into independently deployable services, each owning its own database and communi</w:t>
-      </w:r>
-      <w:r>
-        <w:rPr>
-          <w:rFonts w:asciiTheme="minorHAnsi" w:hAnsiTheme="minorHAnsi"/>
-          <w:sz w:val="22"/>
-        </w:rPr>
-        <w:t>cating via network protocols such as HTTP. Each service can be developed, tested, deployed, and scaled independently. Fault isolation prevents a failure in one service from cascading to others. The trade-off is operational complexity: service discovery, in</w:t>
-      </w:r>
-      <w:r>
-        <w:rPr>
-          <w:rFonts w:asciiTheme="minorHAnsi" w:hAnsiTheme="minorHAnsi"/>
-          <w:sz w:val="22"/>
-        </w:rPr>
-        <w:t>ter-service communication, distributed data consistency, and the need for monitoring and observability across service boundaries.</w:t>
+        <w:spacing w:before="240" w:after="120"/>
+        <w:rPr>
+          <w:rFonts w:asciiTheme="minorHAnsi" w:hAnsiTheme="minorHAnsi"/>
+          <w:sz w:val="22"/>
+        </w:rPr>
+      </w:pPr>
+      <w:r>
+        <w:rPr>
+          <w:rFonts w:asciiTheme="minorHAnsi" w:hAnsiTheme="minorHAnsi"/>
+          <w:b/>
+          <w:sz w:val="22"/>
+        </w:rPr>
+        <w:t>Abstract</w:t>
       </w:r>
     </w:p>
     <w:p>
@@ -250,37 +308,130 @@
           <w:rFonts w:asciiTheme="minorHAnsi" w:hAnsiTheme="minorHAnsi"/>
           <w:sz w:val="22"/>
         </w:rPr>
-        <w:t>The standard Model–View–Controller (MVC) pattern has the Controller talking directly to the Model — Eloquent calls are embedde</w:t>
-      </w:r>
-      <w:r>
-        <w:rPr>
-          <w:rFonts w:asciiTheme="minorHAnsi" w:hAnsiTheme="minorHAnsi"/>
-          <w:sz w:val="22"/>
-        </w:rPr>
-        <w:t>d in controller methods. The MVCR extension adds a Repository Interface between the Controller and the Model. The Controller type-hints an interface and Laravel’s service container injects the concrete implementation. The Controller has no knowledge of whe</w:t>
-      </w:r>
-      <w:r>
-        <w:rPr>
-          <w:rFonts w:asciiTheme="minorHAnsi" w:hAnsiTheme="minorHAnsi"/>
-          <w:sz w:val="22"/>
-        </w:rPr>
-        <w:t>ther data comes from SQLite, a remote API, or any other source. This abstraction is what makes the APP_BACKEND environment switch possible — swapping from Repository to Service Client is a binding change in the service provider, not a code change in the Co</w:t>
-      </w:r>
-      <w:r>
-        <w:rPr>
-          <w:rFonts w:asciiTheme="minorHAnsi" w:hAnsiTheme="minorHAnsi"/>
-          <w:sz w:val="22"/>
-        </w:rPr>
-        <w:t>ntroller.</w:t>
+        <w:t xml:space="preserve">This laboratory exercise involved building a monolithic </w:t>
+      </w:r>
+      <w:proofErr w:type="spellStart"/>
+      <w:r>
+        <w:rPr>
+          <w:rFonts w:asciiTheme="minorHAnsi" w:hAnsiTheme="minorHAnsi"/>
+          <w:sz w:val="22"/>
+        </w:rPr>
+        <w:t>Laravel</w:t>
+      </w:r>
+      <w:proofErr w:type="spellEnd"/>
+      <w:r>
+        <w:rPr>
+          <w:rFonts w:asciiTheme="minorHAnsi" w:hAnsiTheme="minorHAnsi"/>
+          <w:sz w:val="22"/>
+        </w:rPr>
+        <w:t xml:space="preserve"> application (lab1/academe/) and three independent </w:t>
+      </w:r>
+      <w:proofErr w:type="spellStart"/>
+      <w:r>
+        <w:rPr>
+          <w:rFonts w:asciiTheme="minorHAnsi" w:hAnsiTheme="minorHAnsi"/>
+          <w:sz w:val="22"/>
+        </w:rPr>
+        <w:t>microservices</w:t>
+      </w:r>
+      <w:proofErr w:type="spellEnd"/>
+      <w:r>
+        <w:rPr>
+          <w:rFonts w:asciiTheme="minorHAnsi" w:hAnsiTheme="minorHAnsi"/>
+          <w:sz w:val="22"/>
+        </w:rPr>
+        <w:t xml:space="preserve"> (student-service, course-service, enrollment-service) using the Model–View–Controller–Repository (MVCR) pattern. An ENV switch mechanism via APP_BACKEND </w:t>
+      </w:r>
+      <w:proofErr w:type="gramStart"/>
+      <w:r>
+        <w:rPr>
+          <w:rFonts w:asciiTheme="minorHAnsi" w:hAnsiTheme="minorHAnsi"/>
+          <w:sz w:val="22"/>
+        </w:rPr>
+        <w:t>in .</w:t>
+      </w:r>
+      <w:proofErr w:type="spellStart"/>
+      <w:r>
+        <w:rPr>
+          <w:rFonts w:asciiTheme="minorHAnsi" w:hAnsiTheme="minorHAnsi"/>
+          <w:sz w:val="22"/>
+        </w:rPr>
+        <w:t>env</w:t>
+      </w:r>
+      <w:proofErr w:type="spellEnd"/>
+      <w:proofErr w:type="gramEnd"/>
+      <w:r>
+        <w:rPr>
+          <w:rFonts w:asciiTheme="minorHAnsi" w:hAnsiTheme="minorHAnsi"/>
+          <w:sz w:val="22"/>
+        </w:rPr>
+        <w:t xml:space="preserve"> allows the same Blade frontend to route requests to either the local Repository (monolithic mode) or HTTP Service Clients (</w:t>
+      </w:r>
+      <w:proofErr w:type="spellStart"/>
+      <w:r>
+        <w:rPr>
+          <w:rFonts w:asciiTheme="minorHAnsi" w:hAnsiTheme="minorHAnsi"/>
+          <w:sz w:val="22"/>
+        </w:rPr>
+        <w:t>microservices</w:t>
+      </w:r>
+      <w:proofErr w:type="spellEnd"/>
+      <w:r>
+        <w:rPr>
+          <w:rFonts w:asciiTheme="minorHAnsi" w:hAnsiTheme="minorHAnsi"/>
+          <w:sz w:val="22"/>
+        </w:rPr>
+        <w:t xml:space="preserve"> mode). The key finding is that the monolithic architecture is simpler at this scale — one codebase, one database, one deployment command — while the </w:t>
+      </w:r>
+      <w:proofErr w:type="spellStart"/>
+      <w:r>
+        <w:rPr>
+          <w:rFonts w:asciiTheme="minorHAnsi" w:hAnsiTheme="minorHAnsi"/>
+          <w:sz w:val="22"/>
+        </w:rPr>
+        <w:t>microservices</w:t>
+      </w:r>
+      <w:proofErr w:type="spellEnd"/>
+      <w:r>
+        <w:rPr>
+          <w:rFonts w:asciiTheme="minorHAnsi" w:hAnsiTheme="minorHAnsi"/>
+          <w:sz w:val="22"/>
+        </w:rPr>
+        <w:t xml:space="preserve"> architecture demonstrates independent scalability and fault isolation. The preferred architecture is monolithic for student-scale systems and </w:t>
+      </w:r>
+      <w:proofErr w:type="spellStart"/>
+      <w:r>
+        <w:rPr>
+          <w:rFonts w:asciiTheme="minorHAnsi" w:hAnsiTheme="minorHAnsi"/>
+          <w:sz w:val="22"/>
+        </w:rPr>
+        <w:t>microservices</w:t>
+      </w:r>
+      <w:proofErr w:type="spellEnd"/>
+      <w:r>
+        <w:rPr>
+          <w:rFonts w:asciiTheme="minorHAnsi" w:hAnsiTheme="minorHAnsi"/>
+          <w:sz w:val="22"/>
+        </w:rPr>
+        <w:t xml:space="preserve"> for team-scale systems.</w:t>
       </w:r>
     </w:p>
     <w:p>
       <w:pPr>
-        <w:rPr>
-          <w:rFonts w:asciiTheme="minorHAnsi" w:hAnsiTheme="minorHAnsi"/>
-          <w:sz w:val="22"/>
-        </w:rPr>
-      </w:pPr>
+        <w:spacing w:before="240" w:after="120"/>
+        <w:rPr>
+          <w:rFonts w:asciiTheme="minorHAnsi" w:hAnsiTheme="minorHAnsi"/>
+          <w:sz w:val="22"/>
+        </w:rPr>
+      </w:pPr>
+      <w:r>
+        <w:rPr>
+          <w:rFonts w:asciiTheme="minorHAnsi" w:hAnsiTheme="minorHAnsi"/>
+          <w:b/>
+          <w:sz w:val="22"/>
+        </w:rPr>
+        <w:t>I. INTRODUCTION</w:t>
+      </w:r>
     </w:p>
     <w:p>
       <w:pPr>
@@ -289,23 +440,36 @@
           <w:sz w:val="22"/>
         </w:rPr>
       </w:pPr>
+      <w:r>
+        <w:rPr>
+          <w:rFonts w:asciiTheme="minorHAnsi" w:hAnsiTheme="minorHAnsi"/>
+          <w:sz w:val="22"/>
+        </w:rPr>
+        <w:t>Monolithic architecture is a software design approach where all application components — user interface, business logic, and data access — are built and deployed as a single unit. The entire application shares one codebase and one database. Components are tightly coupled through direct method calls and shared memory. Deployment is straightforward: a single command starts the entire system. However, scaling individual components independently is not possible — the entire application must scale as one unit, and a failure in any component affects the whole system.</w:t>
+      </w:r>
     </w:p>
     <w:p>
       <w:pPr>
-        <w:spacing w:before="240" w:after="120"/>
-        <w:rPr>
-          <w:rFonts w:asciiTheme="minorHAnsi" w:hAnsiTheme="minorHAnsi"/>
-          <w:sz w:val="22"/>
-        </w:rPr>
-      </w:pPr>
-      <w:r>
-        <w:rPr>
-          <w:rFonts w:asciiTheme="minorHAnsi" w:hAnsiTheme="minorHAnsi"/>
-          <w:b/>
-          <w:sz w:val="22"/>
-        </w:rPr>
-        <w:lastRenderedPageBreak/>
-        <w:t>II. METHODOLOGY / IMPLEMENTATION</w:t>
+        <w:rPr>
+          <w:rFonts w:asciiTheme="minorHAnsi" w:hAnsiTheme="minorHAnsi"/>
+          <w:sz w:val="22"/>
+        </w:rPr>
+      </w:pPr>
+      <w:proofErr w:type="spellStart"/>
+      <w:r>
+        <w:rPr>
+          <w:rFonts w:asciiTheme="minorHAnsi" w:hAnsiTheme="minorHAnsi"/>
+          <w:sz w:val="22"/>
+        </w:rPr>
+        <w:t>Microservices</w:t>
+      </w:r>
+      <w:proofErr w:type="spellEnd"/>
+      <w:r>
+        <w:rPr>
+          <w:rFonts w:asciiTheme="minorHAnsi" w:hAnsiTheme="minorHAnsi"/>
+          <w:sz w:val="22"/>
+        </w:rPr>
+        <w:t xml:space="preserve"> architecture decomposes the application into independently deployable services, each owning its own database and communicating via network protocols such as HTTP. Each service can be developed, tested, deployed, and scaled independently. Fault isolation prevents a failure in one service from cascading to others. The trade-off is operational complexity: service discovery, inter-service communication, distributed data consistency, and the need for monitoring and observability across service boundaries.</w:t>
       </w:r>
     </w:p>
     <w:p>
@@ -315,27 +479,6 @@
           <w:sz w:val="22"/>
         </w:rPr>
       </w:pPr>
-      <w:r>
-        <w:rPr>
-          <w:rFonts w:asciiTheme="minorHAnsi" w:hAnsiTheme="minorHAnsi"/>
-          <w:sz w:val="22"/>
-        </w:rPr>
-        <w:t>The monolithic implementation is a single Laravel application in lab1/academe/. It follows the MVCR pattern: Controllers inject Repository Interfaces, which are bound to Eloquent Repository Implementations in AppS</w:t>
-      </w:r>
-      <w:r>
-        <w:rPr>
-          <w:rFonts w:asciiTheme="minorHAnsi" w:hAnsiTheme="minorHAnsi"/>
-          <w:sz w:val="22"/>
-        </w:rPr>
-        <w:t>erviceProvider. Each Repository talks to Eloquent Models that read from and write to a single SQLite database file. Input validation is handled by FormRequest classes (StoreStudentRequest, StoreEnrollmentRequest) that execute before the Controller method r</w:t>
-      </w:r>
-      <w:r>
-        <w:rPr>
-          <w:rFonts w:asciiTheme="minorHAnsi" w:hAnsiTheme="minorHAnsi"/>
-          <w:sz w:val="22"/>
-        </w:rPr>
-        <w:t>uns. The frontend uses Blade server-side rendering — the server renders complete HTML pages, and the browser receives fully formed markup. The configuration file config/backend.php reads the APP_BACKEND value from .env to determine the active backend mode.</w:t>
-      </w:r>
     </w:p>
     <w:p>
       <w:pPr>
@@ -344,27 +487,6 @@
           <w:sz w:val="22"/>
         </w:rPr>
       </w:pPr>
-      <w:r>
-        <w:rPr>
-          <w:rFonts w:asciiTheme="minorHAnsi" w:hAnsiTheme="minorHAnsi"/>
-          <w:sz w:val="22"/>
-        </w:rPr>
-        <w:t>The microservices implementation consists of three independent Laravel applications running on ports 8001 (student-service), 8002 (course-service), and 8003 (enrollment-service). Each service owns its own SQLite database file. The enrollment-service valid</w:t>
-      </w:r>
-      <w:r>
-        <w:rPr>
-          <w:rFonts w:asciiTheme="minorHAnsi" w:hAnsiTheme="minorHAnsi"/>
-          <w:sz w:val="22"/>
-        </w:rPr>
-        <w:t>ates foreign keys by making synchronous HTTP GET calls to the student-service and course-service using Http::timeout(5). Connection failures produce HTTP 503 (Service Unavailable) and timeouts produce HTTP 504 (Gateway Timeout). Each service follows the sa</w:t>
-      </w:r>
-      <w:r>
-        <w:rPr>
-          <w:rFonts w:asciiTheme="minorHAnsi" w:hAnsiTheme="minorHAnsi"/>
-          <w:sz w:val="22"/>
-        </w:rPr>
-        <w:t>me MVCR pattern internally.</w:t>
-      </w:r>
     </w:p>
     <w:p>
       <w:pPr>
@@ -373,30 +495,819 @@
           <w:sz w:val="22"/>
         </w:rPr>
       </w:pPr>
-      <w:r>
-        <w:rPr>
-          <w:rFonts w:asciiTheme="minorHAnsi" w:hAnsiTheme="minorHAnsi"/>
-          <w:sz w:val="22"/>
-        </w:rPr>
-        <w:t>The ENV switch works as follows: when APP_BACKEND=microservices is set, the Controller routes calls through Service Clients that make HTTP requests to the three microservices on their respective ports. When APP_BACKEND=monolithi</w:t>
-      </w:r>
-      <w:r>
-        <w:rPr>
-          <w:rFonts w:asciiTheme="minorHAnsi" w:hAnsiTheme="minorHAnsi"/>
-          <w:sz w:val="22"/>
-        </w:rPr>
-        <w:t xml:space="preserve">c is set, the Controller routes through Repository implementations that query the local SQLite database via Eloquent. Data from Service Clients is normalized to stdClass objects before being passed to Blade views, so views render identically regardless of </w:t>
-      </w:r>
-      <w:r>
-        <w:rPr>
-          <w:rFonts w:asciiTheme="minorHAnsi" w:hAnsiTheme="minorHAnsi"/>
-          <w:sz w:val="22"/>
-        </w:rPr>
-        <w:t>which backend is active.</w:t>
-      </w:r>
     </w:p>
     <w:p>
       <w:pPr>
+        <w:spacing w:after="66"/>
+        <w:ind w:left="427"/>
+        <w:rPr>
+          <w:sz w:val="22"/>
+        </w:rPr>
+      </w:pPr>
+      <w:r>
+        <w:rPr>
+          <w:noProof/>
+          <w:sz w:val="22"/>
+        </w:rPr>
+        <mc:AlternateContent>
+          <mc:Choice Requires="wpg">
+            <w:drawing>
+              <wp:inline distT="0" distB="0" distL="0" distR="0" wp14:anchorId="2BC9140B" wp14:editId="5C12B778">
+                <wp:extent cx="5405120" cy="38100"/>
+                <wp:effectExtent l="0" t="0" r="0" b="0"/>
+                <wp:docPr id="13" name="Group 13"/>
+                <wp:cNvGraphicFramePr/>
+                <a:graphic xmlns:a="http://schemas.openxmlformats.org/drawingml/2006/main">
+                  <a:graphicData uri="http://schemas.microsoft.com/office/word/2010/wordprocessingGroup">
+                    <wpg:wgp>
+                      <wpg:cNvGrpSpPr/>
+                      <wpg:grpSpPr>
+                        <a:xfrm>
+                          <a:off x="0" y="0"/>
+                          <a:ext cx="5405120" cy="38100"/>
+                          <a:chOff x="0" y="0"/>
+                          <a:chExt cx="5405120" cy="38100"/>
+                        </a:xfrm>
+                      </wpg:grpSpPr>
+                      <wps:wsp>
+                        <wps:cNvPr id="14" name="Shape 7"/>
+                        <wps:cNvSpPr/>
+                        <wps:spPr>
+                          <a:xfrm>
+                            <a:off x="4445" y="0"/>
+                            <a:ext cx="5400675" cy="0"/>
+                          </a:xfrm>
+                          <a:custGeom>
+                            <a:avLst/>
+                            <a:gdLst/>
+                            <a:ahLst/>
+                            <a:cxnLst/>
+                            <a:rect l="0" t="0" r="0" b="0"/>
+                            <a:pathLst>
+                              <a:path w="5400675">
+                                <a:moveTo>
+                                  <a:pt x="0" y="0"/>
+                                </a:moveTo>
+                                <a:lnTo>
+                                  <a:pt x="5400675" y="0"/>
+                                </a:lnTo>
+                              </a:path>
+                            </a:pathLst>
+                          </a:custGeom>
+                          <a:ln w="19050" cap="flat">
+                            <a:miter lim="100000"/>
+                          </a:ln>
+                        </wps:spPr>
+                        <wps:style>
+                          <a:lnRef idx="1">
+                            <a:srgbClr val="000000"/>
+                          </a:lnRef>
+                          <a:fillRef idx="0">
+                            <a:srgbClr val="000000">
+                              <a:alpha val="0"/>
+                            </a:srgbClr>
+                          </a:fillRef>
+                          <a:effectRef idx="0">
+                            <a:scrgbClr r="0" g="0" b="0"/>
+                          </a:effectRef>
+                          <a:fontRef idx="none"/>
+                        </wps:style>
+                        <wps:bodyPr/>
+                      </wps:wsp>
+                      <wps:wsp>
+                        <wps:cNvPr id="15" name="Shape 8"/>
+                        <wps:cNvSpPr/>
+                        <wps:spPr>
+                          <a:xfrm>
+                            <a:off x="0" y="38100"/>
+                            <a:ext cx="5400675" cy="0"/>
+                          </a:xfrm>
+                          <a:custGeom>
+                            <a:avLst/>
+                            <a:gdLst/>
+                            <a:ahLst/>
+                            <a:cxnLst/>
+                            <a:rect l="0" t="0" r="0" b="0"/>
+                            <a:pathLst>
+                              <a:path w="5400675">
+                                <a:moveTo>
+                                  <a:pt x="0" y="0"/>
+                                </a:moveTo>
+                                <a:lnTo>
+                                  <a:pt x="5400675" y="0"/>
+                                </a:lnTo>
+                              </a:path>
+                            </a:pathLst>
+                          </a:custGeom>
+                          <a:ln w="9525" cap="flat">
+                            <a:miter lim="100000"/>
+                          </a:ln>
+                        </wps:spPr>
+                        <wps:style>
+                          <a:lnRef idx="1">
+                            <a:srgbClr val="000000"/>
+                          </a:lnRef>
+                          <a:fillRef idx="0">
+                            <a:srgbClr val="000000">
+                              <a:alpha val="0"/>
+                            </a:srgbClr>
+                          </a:fillRef>
+                          <a:effectRef idx="0">
+                            <a:scrgbClr r="0" g="0" b="0"/>
+                          </a:effectRef>
+                          <a:fontRef idx="none"/>
+                        </wps:style>
+                        <wps:bodyPr/>
+                      </wps:wsp>
+                    </wpg:wgp>
+                  </a:graphicData>
+                </a:graphic>
+              </wp:inline>
+            </w:drawing>
+          </mc:Choice>
+          <mc:Fallback>
+            <w:pict>
+              <v:group w14:anchorId="0A880C89" id="Group 13" o:spid="_x0000_s1026" style="width:425.6pt;height:3pt;mso-position-horizontal-relative:char;mso-position-vertical-relative:line" coordsize="54051,381" o:gfxdata="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">
+                <v:shape id="Shape 7" o:spid="_x0000_s1027" style="position:absolute;left:44;width:54007;height:0;visibility:visible;mso-wrap-style:square;v-text-anchor:top" coordsize="5400675,0" o:gfxdata="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" path="m,l5400675,e" filled="f" strokeweight="1.5pt">
+                  <v:stroke miterlimit="1" joinstyle="miter"/>
+                  <v:path arrowok="t" textboxrect="0,0,5400675,0"/>
+                </v:shape>
+                <v:shape id="Shape 8" o:spid="_x0000_s1028" style="position:absolute;top:381;width:54006;height:0;visibility:visible;mso-wrap-style:square;v-text-anchor:top" coordsize="5400675,0" o:gfxdata="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" path="m,l5400675,e" filled="f">
+                  <v:stroke miterlimit="1" joinstyle="miter"/>
+                  <v:path arrowok="t" textboxrect="0,0,5400675,0"/>
+                </v:shape>
+                <w10:anchorlock/>
+              </v:group>
+            </w:pict>
+          </mc:Fallback>
+        </mc:AlternateContent>
+      </w:r>
+    </w:p>
+    <w:p>
+      <w:pPr>
+        <w:spacing w:after="0"/>
+        <w:ind w:left="367"/>
+        <w:rPr>
+          <w:sz w:val="22"/>
+        </w:rPr>
+      </w:pPr>
+      <w:r>
+        <w:rPr>
+          <w:b/>
+          <w:sz w:val="22"/>
+        </w:rPr>
+        <w:t xml:space="preserve">ITSAR2 313 – SYSTEM INTEGRATION AND ARCHICTECTURE 2                              </w:t>
+      </w:r>
+      <w:r>
+        <w:rPr>
+          <w:sz w:val="22"/>
+        </w:rPr>
+        <w:t>Page 1 of 9</w:t>
+      </w:r>
+    </w:p>
+    <w:p>
+      <w:pPr>
+        <w:spacing w:after="0"/>
+        <w:ind w:left="367"/>
+        <w:rPr>
+          <w:sz w:val="22"/>
+        </w:rPr>
+      </w:pPr>
+      <w:r>
+        <w:rPr>
+          <w:sz w:val="22"/>
+        </w:rPr>
+        <w:t xml:space="preserve">by:  </w:t>
+      </w:r>
+      <w:r>
+        <w:rPr>
+          <w:b/>
+          <w:sz w:val="22"/>
+        </w:rPr>
+        <w:t xml:space="preserve">Engr. Joao </w:t>
+      </w:r>
+      <w:proofErr w:type="spellStart"/>
+      <w:r>
+        <w:rPr>
+          <w:b/>
+          <w:sz w:val="22"/>
+        </w:rPr>
+        <w:t>Roumil</w:t>
+      </w:r>
+      <w:proofErr w:type="spellEnd"/>
+      <w:r>
+        <w:rPr>
+          <w:b/>
+          <w:sz w:val="22"/>
+        </w:rPr>
+        <w:t xml:space="preserve"> G. Vergara, </w:t>
+      </w:r>
+      <w:proofErr w:type="spellStart"/>
+      <w:r>
+        <w:rPr>
+          <w:b/>
+          <w:sz w:val="22"/>
+        </w:rPr>
+        <w:t>CpE</w:t>
+      </w:r>
+      <w:proofErr w:type="spellEnd"/>
+    </w:p>
+    <w:p>
+      <w:pPr>
+        <w:rPr>
+          <w:rFonts w:asciiTheme="minorHAnsi" w:hAnsiTheme="minorHAnsi"/>
+          <w:sz w:val="22"/>
+        </w:rPr>
+      </w:pPr>
+    </w:p>
+    <w:p>
+      <w:pPr>
+        <w:rPr>
+          <w:rFonts w:asciiTheme="minorHAnsi" w:hAnsiTheme="minorHAnsi"/>
+          <w:sz w:val="22"/>
+        </w:rPr>
+      </w:pPr>
+      <w:r>
+        <w:rPr>
+          <w:rFonts w:asciiTheme="minorHAnsi" w:hAnsiTheme="minorHAnsi"/>
+          <w:sz w:val="22"/>
+        </w:rPr>
+        <w:lastRenderedPageBreak/>
+        <w:t xml:space="preserve">The standard Model–View–Controller (MVC) pattern has the Controller talking directly to the Model — Eloquent calls are embedded in controller methods. The MVCR extension adds a Repository Interface between the Controller and the Model. The Controller type-hints an interface and </w:t>
+      </w:r>
+      <w:proofErr w:type="spellStart"/>
+      <w:r>
+        <w:rPr>
+          <w:rFonts w:asciiTheme="minorHAnsi" w:hAnsiTheme="minorHAnsi"/>
+          <w:sz w:val="22"/>
+        </w:rPr>
+        <w:t>Laravel’s</w:t>
+      </w:r>
+      <w:proofErr w:type="spellEnd"/>
+      <w:r>
+        <w:rPr>
+          <w:rFonts w:asciiTheme="minorHAnsi" w:hAnsiTheme="minorHAnsi"/>
+          <w:sz w:val="22"/>
+        </w:rPr>
+        <w:t xml:space="preserve"> service container injects the concrete implementation. The Controller has no knowledge of whether data comes from SQLite, a remote API, or any other source. This abstraction is what makes the APP_BACKEND environment switch possible — swapping from Repository to Service Client is a binding change in the service provider, not a code change in the Controller.</w:t>
+      </w:r>
+    </w:p>
+    <w:p>
+      <w:pPr>
+        <w:rPr>
+          <w:rFonts w:asciiTheme="minorHAnsi" w:hAnsiTheme="minorHAnsi"/>
+          <w:sz w:val="22"/>
+        </w:rPr>
+      </w:pPr>
+    </w:p>
+    <w:p>
+      <w:pPr>
+        <w:spacing w:before="240" w:after="120"/>
+        <w:rPr>
+          <w:rFonts w:asciiTheme="minorHAnsi" w:hAnsiTheme="minorHAnsi"/>
+          <w:sz w:val="22"/>
+        </w:rPr>
+      </w:pPr>
+      <w:r>
+        <w:rPr>
+          <w:rFonts w:asciiTheme="minorHAnsi" w:hAnsiTheme="minorHAnsi"/>
+          <w:b/>
+          <w:sz w:val="22"/>
+        </w:rPr>
+        <w:t>II. METHODOLOGY / IMPLEMENTATION</w:t>
+      </w:r>
+    </w:p>
+    <w:p>
+      <w:pPr>
+        <w:rPr>
+          <w:rFonts w:asciiTheme="minorHAnsi" w:hAnsiTheme="minorHAnsi"/>
+          <w:sz w:val="22"/>
+        </w:rPr>
+      </w:pPr>
+      <w:r>
+        <w:rPr>
+          <w:rFonts w:asciiTheme="minorHAnsi" w:hAnsiTheme="minorHAnsi"/>
+          <w:sz w:val="22"/>
+        </w:rPr>
+        <w:t xml:space="preserve">The monolithic implementation is a single </w:t>
+      </w:r>
+      <w:proofErr w:type="spellStart"/>
+      <w:r>
+        <w:rPr>
+          <w:rFonts w:asciiTheme="minorHAnsi" w:hAnsiTheme="minorHAnsi"/>
+          <w:sz w:val="22"/>
+        </w:rPr>
+        <w:t>Laravel</w:t>
+      </w:r>
+      <w:proofErr w:type="spellEnd"/>
+      <w:r>
+        <w:rPr>
+          <w:rFonts w:asciiTheme="minorHAnsi" w:hAnsiTheme="minorHAnsi"/>
+          <w:sz w:val="22"/>
+        </w:rPr>
+        <w:t xml:space="preserve"> application in lab1/academe/. It follows the MVCR pattern: Controllers inject Repository Interfaces, which are bound to Eloquent Repository Implementations in </w:t>
+      </w:r>
+      <w:proofErr w:type="spellStart"/>
+      <w:r>
+        <w:rPr>
+          <w:rFonts w:asciiTheme="minorHAnsi" w:hAnsiTheme="minorHAnsi"/>
+          <w:sz w:val="22"/>
+        </w:rPr>
+        <w:t>AppServiceProvider</w:t>
+      </w:r>
+      <w:proofErr w:type="spellEnd"/>
+      <w:r>
+        <w:rPr>
+          <w:rFonts w:asciiTheme="minorHAnsi" w:hAnsiTheme="minorHAnsi"/>
+          <w:sz w:val="22"/>
+        </w:rPr>
+        <w:t xml:space="preserve">. Each Repository talks to Eloquent Models that read from and write to a single SQLite database file. Input validation is handled by </w:t>
+      </w:r>
+      <w:proofErr w:type="spellStart"/>
+      <w:r>
+        <w:rPr>
+          <w:rFonts w:asciiTheme="minorHAnsi" w:hAnsiTheme="minorHAnsi"/>
+          <w:sz w:val="22"/>
+        </w:rPr>
+        <w:t>FormRequest</w:t>
+      </w:r>
+      <w:proofErr w:type="spellEnd"/>
+      <w:r>
+        <w:rPr>
+          <w:rFonts w:asciiTheme="minorHAnsi" w:hAnsiTheme="minorHAnsi"/>
+          <w:sz w:val="22"/>
+        </w:rPr>
+        <w:t xml:space="preserve"> classes (</w:t>
+      </w:r>
+      <w:proofErr w:type="spellStart"/>
+      <w:r>
+        <w:rPr>
+          <w:rFonts w:asciiTheme="minorHAnsi" w:hAnsiTheme="minorHAnsi"/>
+          <w:sz w:val="22"/>
+        </w:rPr>
+        <w:t>StoreStudentRequest</w:t>
+      </w:r>
+      <w:proofErr w:type="spellEnd"/>
+      <w:r>
+        <w:rPr>
+          <w:rFonts w:asciiTheme="minorHAnsi" w:hAnsiTheme="minorHAnsi"/>
+          <w:sz w:val="22"/>
+        </w:rPr>
+        <w:t xml:space="preserve">, </w:t>
+      </w:r>
+      <w:proofErr w:type="spellStart"/>
+      <w:r>
+        <w:rPr>
+          <w:rFonts w:asciiTheme="minorHAnsi" w:hAnsiTheme="minorHAnsi"/>
+          <w:sz w:val="22"/>
+        </w:rPr>
+        <w:t>StoreEnrollmentRequest</w:t>
+      </w:r>
+      <w:proofErr w:type="spellEnd"/>
+      <w:r>
+        <w:rPr>
+          <w:rFonts w:asciiTheme="minorHAnsi" w:hAnsiTheme="minorHAnsi"/>
+          <w:sz w:val="22"/>
+        </w:rPr>
+        <w:t xml:space="preserve">) that execute before the Controller method runs. The frontend uses Blade server-side rendering — the server renders complete HTML pages, and the browser receives fully formed markup. The configuration file </w:t>
+      </w:r>
+      <w:proofErr w:type="spellStart"/>
+      <w:r>
+        <w:rPr>
+          <w:rFonts w:asciiTheme="minorHAnsi" w:hAnsiTheme="minorHAnsi"/>
+          <w:sz w:val="22"/>
+        </w:rPr>
+        <w:t>config</w:t>
+      </w:r>
+      <w:proofErr w:type="spellEnd"/>
+      <w:r>
+        <w:rPr>
+          <w:rFonts w:asciiTheme="minorHAnsi" w:hAnsiTheme="minorHAnsi"/>
+          <w:sz w:val="22"/>
+        </w:rPr>
+        <w:t>/</w:t>
+      </w:r>
+      <w:proofErr w:type="spellStart"/>
+      <w:r>
+        <w:rPr>
+          <w:rFonts w:asciiTheme="minorHAnsi" w:hAnsiTheme="minorHAnsi"/>
+          <w:sz w:val="22"/>
+        </w:rPr>
+        <w:t>backend.php</w:t>
+      </w:r>
+      <w:proofErr w:type="spellEnd"/>
+      <w:r>
+        <w:rPr>
+          <w:rFonts w:asciiTheme="minorHAnsi" w:hAnsiTheme="minorHAnsi"/>
+          <w:sz w:val="22"/>
+        </w:rPr>
+        <w:t xml:space="preserve"> reads the APP_BACKEND value </w:t>
+      </w:r>
+      <w:proofErr w:type="gramStart"/>
+      <w:r>
+        <w:rPr>
+          <w:rFonts w:asciiTheme="minorHAnsi" w:hAnsiTheme="minorHAnsi"/>
+          <w:sz w:val="22"/>
+        </w:rPr>
+        <w:t>from .</w:t>
+      </w:r>
+      <w:proofErr w:type="spellStart"/>
+      <w:r>
+        <w:rPr>
+          <w:rFonts w:asciiTheme="minorHAnsi" w:hAnsiTheme="minorHAnsi"/>
+          <w:sz w:val="22"/>
+        </w:rPr>
+        <w:t>env</w:t>
+      </w:r>
+      <w:proofErr w:type="spellEnd"/>
+      <w:proofErr w:type="gramEnd"/>
+      <w:r>
+        <w:rPr>
+          <w:rFonts w:asciiTheme="minorHAnsi" w:hAnsiTheme="minorHAnsi"/>
+          <w:sz w:val="22"/>
+        </w:rPr>
+        <w:t xml:space="preserve"> to determine the active backend mode.</w:t>
+      </w:r>
+    </w:p>
+    <w:p>
+      <w:pPr>
+        <w:rPr>
+          <w:rFonts w:asciiTheme="minorHAnsi" w:hAnsiTheme="minorHAnsi"/>
+          <w:sz w:val="22"/>
+        </w:rPr>
+      </w:pPr>
+      <w:r>
+        <w:rPr>
+          <w:rFonts w:asciiTheme="minorHAnsi" w:hAnsiTheme="minorHAnsi"/>
+          <w:sz w:val="22"/>
+        </w:rPr>
+        <w:t xml:space="preserve">The </w:t>
+      </w:r>
+      <w:proofErr w:type="spellStart"/>
+      <w:r>
+        <w:rPr>
+          <w:rFonts w:asciiTheme="minorHAnsi" w:hAnsiTheme="minorHAnsi"/>
+          <w:sz w:val="22"/>
+        </w:rPr>
+        <w:t>microservices</w:t>
+      </w:r>
+      <w:proofErr w:type="spellEnd"/>
+      <w:r>
+        <w:rPr>
+          <w:rFonts w:asciiTheme="minorHAnsi" w:hAnsiTheme="minorHAnsi"/>
+          <w:sz w:val="22"/>
+        </w:rPr>
+        <w:t xml:space="preserve"> implementation consists of three independent </w:t>
+      </w:r>
+      <w:proofErr w:type="spellStart"/>
+      <w:r>
+        <w:rPr>
+          <w:rFonts w:asciiTheme="minorHAnsi" w:hAnsiTheme="minorHAnsi"/>
+          <w:sz w:val="22"/>
+        </w:rPr>
+        <w:t>Laravel</w:t>
+      </w:r>
+      <w:proofErr w:type="spellEnd"/>
+      <w:r>
+        <w:rPr>
+          <w:rFonts w:asciiTheme="minorHAnsi" w:hAnsiTheme="minorHAnsi"/>
+          <w:sz w:val="22"/>
+        </w:rPr>
+        <w:t xml:space="preserve"> applications running on ports 8001 (student-service), 8002 (course-service), and 8003 (enrollment-service). Each service owns its own SQLite database file. The enrollment-service validates foreign keys by making synchronous HTTP GET calls to the student-service and course-service using </w:t>
+      </w:r>
+      <w:proofErr w:type="gramStart"/>
+      <w:r>
+        <w:rPr>
+          <w:rFonts w:asciiTheme="minorHAnsi" w:hAnsiTheme="minorHAnsi"/>
+          <w:sz w:val="22"/>
+        </w:rPr>
+        <w:t>Http::</w:t>
+      </w:r>
+      <w:proofErr w:type="gramEnd"/>
+      <w:r>
+        <w:rPr>
+          <w:rFonts w:asciiTheme="minorHAnsi" w:hAnsiTheme="minorHAnsi"/>
+          <w:sz w:val="22"/>
+        </w:rPr>
+        <w:t>timeout(5). Connection failures produce HTTP 503 (Service Unavailable) and timeouts produce HTTP 504 (Gateway Timeout). Each service follows the same MVCR pattern internally.</w:t>
+      </w:r>
+    </w:p>
+    <w:p>
+      <w:pPr>
+        <w:rPr>
+          <w:rFonts w:asciiTheme="minorHAnsi" w:hAnsiTheme="minorHAnsi"/>
+          <w:sz w:val="22"/>
+        </w:rPr>
+      </w:pPr>
+      <w:r>
+        <w:rPr>
+          <w:rFonts w:asciiTheme="minorHAnsi" w:hAnsiTheme="minorHAnsi"/>
+          <w:sz w:val="22"/>
+        </w:rPr>
+        <w:t>The ENV switch works as follows: when APP_BACKEND=</w:t>
+      </w:r>
+      <w:proofErr w:type="spellStart"/>
+      <w:r>
+        <w:rPr>
+          <w:rFonts w:asciiTheme="minorHAnsi" w:hAnsiTheme="minorHAnsi"/>
+          <w:sz w:val="22"/>
+        </w:rPr>
+        <w:t>microservices</w:t>
+      </w:r>
+      <w:proofErr w:type="spellEnd"/>
+      <w:r>
+        <w:rPr>
+          <w:rFonts w:asciiTheme="minorHAnsi" w:hAnsiTheme="minorHAnsi"/>
+          <w:sz w:val="22"/>
+        </w:rPr>
+        <w:t xml:space="preserve"> is set, the Controller routes calls through Service Clients that make HTTP requests to the three </w:t>
+      </w:r>
+      <w:proofErr w:type="spellStart"/>
+      <w:r>
+        <w:rPr>
+          <w:rFonts w:asciiTheme="minorHAnsi" w:hAnsiTheme="minorHAnsi"/>
+          <w:sz w:val="22"/>
+        </w:rPr>
+        <w:t>microservices</w:t>
+      </w:r>
+      <w:proofErr w:type="spellEnd"/>
+      <w:r>
+        <w:rPr>
+          <w:rFonts w:asciiTheme="minorHAnsi" w:hAnsiTheme="minorHAnsi"/>
+          <w:sz w:val="22"/>
+        </w:rPr>
+        <w:t xml:space="preserve"> on their respective ports. When APP_BACKEND=monolithic is set, the Controller routes through Repository implementations that query the local SQLite database via Eloquent. Data from Service Clients is normalized to </w:t>
+      </w:r>
+      <w:proofErr w:type="spellStart"/>
+      <w:r>
+        <w:rPr>
+          <w:rFonts w:asciiTheme="minorHAnsi" w:hAnsiTheme="minorHAnsi"/>
+          <w:sz w:val="22"/>
+        </w:rPr>
+        <w:t>stdClass</w:t>
+      </w:r>
+      <w:proofErr w:type="spellEnd"/>
+      <w:r>
+        <w:rPr>
+          <w:rFonts w:asciiTheme="minorHAnsi" w:hAnsiTheme="minorHAnsi"/>
+          <w:sz w:val="22"/>
+        </w:rPr>
+        <w:t xml:space="preserve"> objects before being passed to Blade views, so views render identically regardless of which backend is active.</w:t>
+      </w:r>
+    </w:p>
+    <w:p>
+      <w:pPr>
+        <w:rPr>
+          <w:rFonts w:asciiTheme="minorHAnsi" w:hAnsiTheme="minorHAnsi"/>
+          <w:sz w:val="22"/>
+        </w:rPr>
+      </w:pPr>
+    </w:p>
+    <w:p>
+      <w:pPr>
+        <w:rPr>
+          <w:rFonts w:asciiTheme="minorHAnsi" w:hAnsiTheme="minorHAnsi"/>
+          <w:sz w:val="22"/>
+        </w:rPr>
+      </w:pPr>
+    </w:p>
+    <w:p>
+      <w:pPr>
+        <w:rPr>
+          <w:rFonts w:asciiTheme="minorHAnsi" w:hAnsiTheme="minorHAnsi"/>
+          <w:sz w:val="22"/>
+        </w:rPr>
+      </w:pPr>
+    </w:p>
+    <w:p>
+      <w:pPr>
+        <w:rPr>
+          <w:rFonts w:asciiTheme="minorHAnsi" w:hAnsiTheme="minorHAnsi"/>
+          <w:sz w:val="22"/>
+        </w:rPr>
+      </w:pPr>
+    </w:p>
+    <w:p>
+      <w:pPr>
+        <w:spacing w:after="66"/>
+        <w:ind w:left="427"/>
+        <w:rPr>
+          <w:sz w:val="22"/>
+        </w:rPr>
+      </w:pPr>
+      <w:r>
+        <w:rPr>
+          <w:noProof/>
+          <w:sz w:val="22"/>
+        </w:rPr>
+        <mc:AlternateContent>
+          <mc:Choice Requires="wpg">
+            <w:drawing>
+              <wp:inline distT="0" distB="0" distL="0" distR="0" wp14:anchorId="2BC9140B" wp14:editId="5C12B778">
+                <wp:extent cx="5405120" cy="38100"/>
+                <wp:effectExtent l="0" t="0" r="0" b="0"/>
+                <wp:docPr id="16" name="Group 16"/>
+                <wp:cNvGraphicFramePr/>
+                <a:graphic xmlns:a="http://schemas.openxmlformats.org/drawingml/2006/main">
+                  <a:graphicData uri="http://schemas.microsoft.com/office/word/2010/wordprocessingGroup">
+                    <wpg:wgp>
+                      <wpg:cNvGrpSpPr/>
+                      <wpg:grpSpPr>
+                        <a:xfrm>
+                          <a:off x="0" y="0"/>
+                          <a:ext cx="5405120" cy="38100"/>
+                          <a:chOff x="0" y="0"/>
+                          <a:chExt cx="5405120" cy="38100"/>
+                        </a:xfrm>
+                      </wpg:grpSpPr>
+                      <wps:wsp>
+                        <wps:cNvPr id="17" name="Shape 7"/>
+                        <wps:cNvSpPr/>
+                        <wps:spPr>
+                          <a:xfrm>
+                            <a:off x="4445" y="0"/>
+                            <a:ext cx="5400675" cy="0"/>
+                          </a:xfrm>
+                          <a:custGeom>
+                            <a:avLst/>
+                            <a:gdLst/>
+                            <a:ahLst/>
+                            <a:cxnLst/>
+                            <a:rect l="0" t="0" r="0" b="0"/>
+                            <a:pathLst>
+                              <a:path w="5400675">
+                                <a:moveTo>
+                                  <a:pt x="0" y="0"/>
+                                </a:moveTo>
+                                <a:lnTo>
+                                  <a:pt x="5400675" y="0"/>
+                                </a:lnTo>
+                              </a:path>
+                            </a:pathLst>
+                          </a:custGeom>
+                          <a:ln w="19050" cap="flat">
+                            <a:miter lim="100000"/>
+                          </a:ln>
+                        </wps:spPr>
+                        <wps:style>
+                          <a:lnRef idx="1">
+                            <a:srgbClr val="000000"/>
+                          </a:lnRef>
+                          <a:fillRef idx="0">
+                            <a:srgbClr val="000000">
+                              <a:alpha val="0"/>
+                            </a:srgbClr>
+                          </a:fillRef>
+                          <a:effectRef idx="0">
+                            <a:scrgbClr r="0" g="0" b="0"/>
+                          </a:effectRef>
+                          <a:fontRef idx="none"/>
+                        </wps:style>
+                        <wps:bodyPr/>
+                      </wps:wsp>
+                      <wps:wsp>
+                        <wps:cNvPr id="18" name="Shape 8"/>
+                        <wps:cNvSpPr/>
+                        <wps:spPr>
+                          <a:xfrm>
+                            <a:off x="0" y="38100"/>
+                            <a:ext cx="5400675" cy="0"/>
+                          </a:xfrm>
+                          <a:custGeom>
+                            <a:avLst/>
+                            <a:gdLst/>
+                            <a:ahLst/>
+                            <a:cxnLst/>
+                            <a:rect l="0" t="0" r="0" b="0"/>
+                            <a:pathLst>
+                              <a:path w="5400675">
+                                <a:moveTo>
+                                  <a:pt x="0" y="0"/>
+                                </a:moveTo>
+                                <a:lnTo>
+                                  <a:pt x="5400675" y="0"/>
+                                </a:lnTo>
+                              </a:path>
+                            </a:pathLst>
+                          </a:custGeom>
+                          <a:ln w="9525" cap="flat">
+                            <a:miter lim="100000"/>
+                          </a:ln>
+                        </wps:spPr>
+                        <wps:style>
+                          <a:lnRef idx="1">
+                            <a:srgbClr val="000000"/>
+                          </a:lnRef>
+                          <a:fillRef idx="0">
+                            <a:srgbClr val="000000">
+                              <a:alpha val="0"/>
+                            </a:srgbClr>
+                          </a:fillRef>
+                          <a:effectRef idx="0">
+                            <a:scrgbClr r="0" g="0" b="0"/>
+                          </a:effectRef>
+                          <a:fontRef idx="none"/>
+                        </wps:style>
+                        <wps:bodyPr/>
+                      </wps:wsp>
+                    </wpg:wgp>
+                  </a:graphicData>
+                </a:graphic>
+              </wp:inline>
+            </w:drawing>
+          </mc:Choice>
+          <mc:Fallback>
+            <w:pict>
+              <v:group w14:anchorId="438D832F" id="Group 16" o:spid="_x0000_s1026" style="width:425.6pt;height:3pt;mso-position-horizontal-relative:char;mso-position-vertical-relative:line" coordsize="54051,381" o:gfxdata="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">
+                <v:shape id="Shape 7" o:spid="_x0000_s1027" style="position:absolute;left:44;width:54007;height:0;visibility:visible;mso-wrap-style:square;v-text-anchor:top" coordsize="5400675,0" o:gfxdata="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" path="m,l5400675,e" filled="f" strokeweight="1.5pt">
+                  <v:stroke miterlimit="1" joinstyle="miter"/>
+                  <v:path arrowok="t" textboxrect="0,0,5400675,0"/>
+                </v:shape>
+                <v:shape id="Shape 8" o:spid="_x0000_s1028" style="position:absolute;top:381;width:54006;height:0;visibility:visible;mso-wrap-style:square;v-text-anchor:top" coordsize="5400675,0" o:gfxdata="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" path="m,l5400675,e" filled="f">
+                  <v:stroke miterlimit="1" joinstyle="miter"/>
+                  <v:path arrowok="t" textboxrect="0,0,5400675,0"/>
+                </v:shape>
+                <w10:anchorlock/>
+              </v:group>
+            </w:pict>
+          </mc:Fallback>
+        </mc:AlternateContent>
+      </w:r>
+    </w:p>
+    <w:p>
+      <w:pPr>
+        <w:tabs>
+          <w:tab w:val="right" w:pos="9360"/>
+        </w:tabs>
+        <w:spacing w:after="0"/>
+        <w:ind w:left="367"/>
+        <w:rPr>
+          <w:sz w:val="22"/>
+        </w:rPr>
+      </w:pPr>
+      <w:r>
+        <w:rPr>
+          <w:b/>
+          <w:sz w:val="22"/>
+        </w:rPr>
+        <w:t xml:space="preserve">ITSAR2 313 – SYSTEM INTEGRATION AND ARCHICTECTURE 2                              </w:t>
+      </w:r>
+      <w:r>
+        <w:rPr>
+          <w:sz w:val="22"/>
+        </w:rPr>
+        <w:t>Page 2 of 9</w:t>
+      </w:r>
+    </w:p>
+    <w:p>
+      <w:pPr>
+        <w:spacing w:after="0"/>
+        <w:ind w:left="367"/>
+        <w:rPr>
+          <w:sz w:val="22"/>
+        </w:rPr>
+      </w:pPr>
+      <w:r>
+        <w:rPr>
+          <w:sz w:val="22"/>
+        </w:rPr>
+        <w:t xml:space="preserve">by:  </w:t>
+      </w:r>
+      <w:r>
+        <w:rPr>
+          <w:b/>
+          <w:sz w:val="22"/>
+        </w:rPr>
+        <w:t xml:space="preserve">Engr. Joao </w:t>
+      </w:r>
+      <w:proofErr w:type="spellStart"/>
+      <w:r>
+        <w:rPr>
+          <w:b/>
+          <w:sz w:val="22"/>
+        </w:rPr>
+        <w:t>Roumil</w:t>
+      </w:r>
+      <w:proofErr w:type="spellEnd"/>
+      <w:r>
+        <w:rPr>
+          <w:b/>
+          <w:sz w:val="22"/>
+        </w:rPr>
+        <w:t xml:space="preserve"> G. Vergara, </w:t>
+      </w:r>
+      <w:proofErr w:type="spellStart"/>
+      <w:r>
+        <w:rPr>
+          <w:b/>
+          <w:sz w:val="22"/>
+        </w:rPr>
+        <w:t>CpE</w:t>
+      </w:r>
+      <w:proofErr w:type="spellEnd"/>
+    </w:p>
+    <w:p>
+      <w:pPr>
         <w:jc w:val="center"/>
         <w:rPr>
           <w:rFonts w:asciiTheme="minorHAnsi" w:hAnsiTheme="minorHAnsi"/>
@@ -412,8 +1323,10 @@
           <w:i/>
           <w:sz w:val="22"/>
         </w:rPr>
+        <w:lastRenderedPageBreak/>
         <w:t>“</w:t>
       </w:r>
+      <w:proofErr w:type="spellStart"/>
       <w:r>
         <w:rPr>
           <w:rFonts w:asciiTheme="minorHAnsi" w:hAnsiTheme="minorHAnsi"/>
@@ -421,8 +1334,9 @@
           <w:i/>
           <w:sz w:val="22"/>
         </w:rPr>
-        <w:t>Microservices Architecture Diagram</w:t>
-      </w:r>
+        <w:t>Microservices</w:t>
+      </w:r>
+      <w:proofErr w:type="spellEnd"/>
       <w:r>
         <w:rPr>
           <w:rFonts w:asciiTheme="minorHAnsi" w:hAnsiTheme="minorHAnsi"/>
@@ -430,7 +1344,7 @@
           <w:i/>
           <w:sz w:val="22"/>
         </w:rPr>
-        <w:t>”</w:t>
+        <w:t xml:space="preserve"> Architecture Diagram”</w:t>
       </w:r>
     </w:p>
     <w:p>
@@ -444,7 +1358,9 @@
       <w:r>
         <w:rPr>
           <w:rFonts w:asciiTheme="minorHAnsi" w:hAnsiTheme="minorHAnsi"/>
-          <w:sz w:val="22"/>
+          <w:noProof/>
+          <w:sz w:val="22"/>
+          <w:lang w:val="en-PH" w:eastAsia="en-PH"/>
         </w:rPr>
         <w:drawing>
           <wp:inline distT="0" distB="0" distL="0" distR="0" wp14:anchorId="6F92482A" wp14:editId="57A4CC03">
@@ -500,7 +1416,6 @@
           <w:i/>
           <w:sz w:val="22"/>
         </w:rPr>
-        <w:lastRenderedPageBreak/>
         <w:t>“</w:t>
       </w:r>
       <w:r>
@@ -535,11 +1450,13 @@
         <w:rPr>
           <w:rFonts w:asciiTheme="minorHAnsi" w:hAnsiTheme="minorHAnsi"/>
           <w:i/>
-          <w:sz w:val="22"/>
+          <w:noProof/>
+          <w:sz w:val="22"/>
+          <w:lang w:val="en-PH" w:eastAsia="en-PH"/>
         </w:rPr>
         <w:drawing>
           <wp:inline distT="0" distB="0" distL="0" distR="0" wp14:anchorId="207DC059" wp14:editId="5204AFFB">
-            <wp:extent cx="4408783" cy="3390900"/>
+            <wp:extent cx="4140200" cy="3184327"/>
             <wp:effectExtent l="0" t="0" r="0" b="0"/>
             <wp:docPr id="10" name="Picture 10"/>
             <wp:cNvGraphicFramePr>
@@ -561,7 +1478,7 @@
                   <pic:spPr>
                     <a:xfrm>
                       <a:off x="0" y="0"/>
-                      <a:ext cx="4416862" cy="3397114"/>
+                      <a:ext cx="4158242" cy="3198204"/>
                     </a:xfrm>
                     <a:prstGeom prst="rect">
                       <a:avLst/>
@@ -576,6 +1493,223 @@
     </w:p>
     <w:p>
       <w:pPr>
+        <w:spacing w:after="66"/>
+        <w:ind w:left="427"/>
+        <w:rPr>
+          <w:sz w:val="22"/>
+        </w:rPr>
+      </w:pPr>
+      <w:r>
+        <w:rPr>
+          <w:noProof/>
+          <w:sz w:val="22"/>
+        </w:rPr>
+        <mc:AlternateContent>
+          <mc:Choice Requires="wpg">
+            <w:drawing>
+              <wp:inline distT="0" distB="0" distL="0" distR="0" wp14:anchorId="2BC9140B" wp14:editId="5C12B778">
+                <wp:extent cx="5405120" cy="38100"/>
+                <wp:effectExtent l="0" t="0" r="0" b="0"/>
+                <wp:docPr id="22" name="Group 22"/>
+                <wp:cNvGraphicFramePr/>
+                <a:graphic xmlns:a="http://schemas.openxmlformats.org/drawingml/2006/main">
+                  <a:graphicData uri="http://schemas.microsoft.com/office/word/2010/wordprocessingGroup">
+                    <wpg:wgp>
+                      <wpg:cNvGrpSpPr/>
+                      <wpg:grpSpPr>
+                        <a:xfrm>
+                          <a:off x="0" y="0"/>
+                          <a:ext cx="5405120" cy="38100"/>
+                          <a:chOff x="0" y="0"/>
+                          <a:chExt cx="5405120" cy="38100"/>
+                        </a:xfrm>
+                      </wpg:grpSpPr>
+                      <wps:wsp>
+                        <wps:cNvPr id="23" name="Shape 7"/>
+                        <wps:cNvSpPr/>
+                        <wps:spPr>
+                          <a:xfrm>
+                            <a:off x="4445" y="0"/>
+                            <a:ext cx="5400675" cy="0"/>
+                          </a:xfrm>
+                          <a:custGeom>
+                            <a:avLst/>
+                            <a:gdLst/>
+                            <a:ahLst/>
+                            <a:cxnLst/>
+                            <a:rect l="0" t="0" r="0" b="0"/>
+                            <a:pathLst>
+                              <a:path w="5400675">
+                                <a:moveTo>
+                                  <a:pt x="0" y="0"/>
+                                </a:moveTo>
+                                <a:lnTo>
+                                  <a:pt x="5400675" y="0"/>
+                                </a:lnTo>
+                              </a:path>
+                            </a:pathLst>
+                          </a:custGeom>
+                          <a:ln w="19050" cap="flat">
+                            <a:miter lim="100000"/>
+                          </a:ln>
+                        </wps:spPr>
+                        <wps:style>
+                          <a:lnRef idx="1">
+                            <a:srgbClr val="000000"/>
+                          </a:lnRef>
+                          <a:fillRef idx="0">
+                            <a:srgbClr val="000000">
+                              <a:alpha val="0"/>
+                            </a:srgbClr>
+                          </a:fillRef>
+                          <a:effectRef idx="0">
+                            <a:scrgbClr r="0" g="0" b="0"/>
+                          </a:effectRef>
+                          <a:fontRef idx="none"/>
+                        </wps:style>
+                        <wps:bodyPr/>
+                      </wps:wsp>
+                      <wps:wsp>
+                        <wps:cNvPr id="24" name="Shape 8"/>
+                        <wps:cNvSpPr/>
+                        <wps:spPr>
+                          <a:xfrm>
+                            <a:off x="0" y="38100"/>
+                            <a:ext cx="5400675" cy="0"/>
+                          </a:xfrm>
+                          <a:custGeom>
+                            <a:avLst/>
+                            <a:gdLst/>
+                            <a:ahLst/>
+                            <a:cxnLst/>
+                            <a:rect l="0" t="0" r="0" b="0"/>
+                            <a:pathLst>
+                              <a:path w="5400675">
+                                <a:moveTo>
+                                  <a:pt x="0" y="0"/>
+                                </a:moveTo>
+                                <a:lnTo>
+                                  <a:pt x="5400675" y="0"/>
+                                </a:lnTo>
+                              </a:path>
+                            </a:pathLst>
+                          </a:custGeom>
+                          <a:ln w="9525" cap="flat">
+                            <a:miter lim="100000"/>
+                          </a:ln>
+                        </wps:spPr>
+                        <wps:style>
+                          <a:lnRef idx="1">
+                            <a:srgbClr val="000000"/>
+                          </a:lnRef>
+                          <a:fillRef idx="0">
+                            <a:srgbClr val="000000">
+                              <a:alpha val="0"/>
+                            </a:srgbClr>
+                          </a:fillRef>
+                          <a:effectRef idx="0">
+                            <a:scrgbClr r="0" g="0" b="0"/>
+                          </a:effectRef>
+                          <a:fontRef idx="none"/>
+                        </wps:style>
+                        <wps:bodyPr/>
+                      </wps:wsp>
+                    </wpg:wgp>
+                  </a:graphicData>
+                </a:graphic>
+              </wp:inline>
+            </w:drawing>
+          </mc:Choice>
+          <mc:Fallback>
+            <w:pict>
+              <v:group w14:anchorId="3BF76BA6" id="Group 22" o:spid="_x0000_s1026" style="width:425.6pt;height:3pt;mso-position-horizontal-relative:char;mso-position-vertical-relative:line" coordsize="54051,381" o:gfxdata="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">
+                <v:shape id="Shape 7" o:spid="_x0000_s1027" style="position:absolute;left:44;width:54007;height:0;visibility:visible;mso-wrap-style:square;v-text-anchor:top" coordsize="5400675,0" o:gfxdata="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" path="m,l5400675,e" filled="f" strokeweight="1.5pt">
+                  <v:stroke miterlimit="1" joinstyle="miter"/>
+                  <v:path arrowok="t" textboxrect="0,0,5400675,0"/>
+                </v:shape>
+                <v:shape id="Shape 8" o:spid="_x0000_s1028" style="position:absolute;top:381;width:54006;height:0;visibility:visible;mso-wrap-style:square;v-text-anchor:top" coordsize="5400675,0" o:gfxdata="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" path="m,l5400675,e" filled="f">
+                  <v:stroke miterlimit="1" joinstyle="miter"/>
+                  <v:path arrowok="t" textboxrect="0,0,5400675,0"/>
+                </v:shape>
+                <w10:anchorlock/>
+              </v:group>
+            </w:pict>
+          </mc:Fallback>
+        </mc:AlternateContent>
+      </w:r>
+    </w:p>
+    <w:p>
+      <w:pPr>
+        <w:spacing w:after="0"/>
+        <w:ind w:left="367"/>
+        <w:rPr>
+          <w:sz w:val="22"/>
+        </w:rPr>
+      </w:pPr>
+      <w:r>
+        <w:rPr>
+          <w:b/>
+          <w:sz w:val="22"/>
+        </w:rPr>
+        <w:t xml:space="preserve">ITSAR2 313 – SYSTEM INTEGRATION AND ARCHICTECTURE 2                              </w:t>
+      </w:r>
+      <w:r>
+        <w:rPr>
+          <w:sz w:val="22"/>
+        </w:rPr>
+        <w:t>Page 3 of 9</w:t>
+      </w:r>
+    </w:p>
+    <w:p>
+      <w:pPr>
+        <w:spacing w:after="0"/>
+        <w:ind w:left="367"/>
+        <w:rPr>
+          <w:sz w:val="22"/>
+        </w:rPr>
+      </w:pPr>
+      <w:r>
+        <w:rPr>
+          <w:sz w:val="22"/>
+        </w:rPr>
+        <w:t xml:space="preserve">by:  </w:t>
+      </w:r>
+      <w:r>
+        <w:rPr>
+          <w:b/>
+          <w:sz w:val="22"/>
+        </w:rPr>
+        <w:t xml:space="preserve">Engr. Joao </w:t>
+      </w:r>
+      <w:proofErr w:type="spellStart"/>
+      <w:r>
+        <w:rPr>
+          <w:b/>
+          <w:sz w:val="22"/>
+        </w:rPr>
+        <w:t>Roumil</w:t>
+      </w:r>
+      <w:proofErr w:type="spellEnd"/>
+      <w:r>
+        <w:rPr>
+          <w:b/>
+          <w:sz w:val="22"/>
+        </w:rPr>
+        <w:t xml:space="preserve"> G. Vergara, </w:t>
+      </w:r>
+      <w:proofErr w:type="spellStart"/>
+      <w:r>
+        <w:rPr>
+          <w:b/>
+          <w:sz w:val="22"/>
+        </w:rPr>
+        <w:t>CpE</w:t>
+      </w:r>
+      <w:proofErr w:type="spellEnd"/>
+    </w:p>
+    <w:p>
+      <w:pPr>
+        <w:jc w:val="center"/>
         <w:rPr>
           <w:rFonts w:asciiTheme="minorHAnsi" w:hAnsiTheme="minorHAnsi"/>
           <w:b/>
@@ -583,13 +1717,31 @@
           <w:sz w:val="22"/>
         </w:rPr>
       </w:pPr>
+      <w:r>
+        <w:rPr>
+          <w:rFonts w:asciiTheme="minorHAnsi" w:hAnsiTheme="minorHAnsi"/>
+          <w:b/>
+          <w:i/>
+          <w:sz w:val="22"/>
+        </w:rPr>
+        <w:lastRenderedPageBreak/>
+        <w:t>"Students list — seeded with group member data</w:t>
+      </w:r>
+      <w:r>
+        <w:rPr>
+          <w:rFonts w:asciiTheme="minorHAnsi" w:hAnsiTheme="minorHAnsi"/>
+          <w:b/>
+          <w:i/>
+          <w:sz w:val="22"/>
+        </w:rPr>
+        <w:t>”</w:t>
+      </w:r>
     </w:p>
     <w:p>
       <w:pPr>
         <w:jc w:val="center"/>
         <w:rPr>
           <w:rFonts w:asciiTheme="minorHAnsi" w:hAnsiTheme="minorHAnsi"/>
-          <w:b/>
           <w:i/>
           <w:sz w:val="22"/>
         </w:rPr>
@@ -597,40 +1749,14 @@
       <w:r>
         <w:rPr>
           <w:rFonts w:asciiTheme="minorHAnsi" w:hAnsiTheme="minorHAnsi"/>
-          <w:b/>
           <w:i/>
-          <w:sz w:val="22"/>
-        </w:rPr>
-        <w:t>"Students list — seeded with group member data</w:t>
-      </w:r>
-      <w:r>
-        <w:rPr>
-          <w:rFonts w:asciiTheme="minorHAnsi" w:hAnsiTheme="minorHAnsi"/>
-          <w:b/>
-          <w:i/>
-          <w:sz w:val="22"/>
-        </w:rPr>
-        <w:t>”</w:t>
-      </w:r>
-    </w:p>
-    <w:p>
-      <w:pPr>
-        <w:jc w:val="center"/>
-        <w:rPr>
-          <w:rFonts w:asciiTheme="minorHAnsi" w:hAnsiTheme="minorHAnsi"/>
-          <w:i/>
-          <w:sz w:val="22"/>
-        </w:rPr>
-      </w:pPr>
-      <w:r>
-        <w:rPr>
-          <w:rFonts w:asciiTheme="minorHAnsi" w:hAnsiTheme="minorHAnsi"/>
-          <w:i/>
-          <w:sz w:val="22"/>
+          <w:noProof/>
+          <w:sz w:val="22"/>
+          <w:lang w:val="en-PH" w:eastAsia="en-PH"/>
         </w:rPr>
         <w:drawing>
           <wp:inline distT="0" distB="0" distL="0" distR="0" wp14:anchorId="3549C257" wp14:editId="6C07C192">
-            <wp:extent cx="6362700" cy="3579020"/>
+            <wp:extent cx="5855168" cy="3293533"/>
             <wp:effectExtent l="0" t="0" r="0" b="2540"/>
             <wp:docPr id="2" name="Picture 2"/>
             <wp:cNvGraphicFramePr>
@@ -652,7 +1778,7 @@
                   <pic:spPr>
                     <a:xfrm>
                       <a:off x="0" y="0"/>
-                      <a:ext cx="6395172" cy="3597285"/>
+                      <a:ext cx="5893212" cy="3314933"/>
                     </a:xfrm>
                     <a:prstGeom prst="rect">
                       <a:avLst/>
@@ -682,7 +1808,6 @@
           <w:i/>
           <w:sz w:val="22"/>
         </w:rPr>
-        <w:lastRenderedPageBreak/>
         <w:t>“</w:t>
       </w:r>
       <w:r>
@@ -706,20 +1831,23 @@
     </w:p>
     <w:p>
       <w:pPr>
-        <w:rPr>
-          <w:rFonts w:asciiTheme="minorHAnsi" w:hAnsiTheme="minorHAnsi"/>
-          <w:sz w:val="22"/>
-        </w:rPr>
-      </w:pPr>
-      <w:r>
-        <w:rPr>
-          <w:rFonts w:asciiTheme="minorHAnsi" w:hAnsiTheme="minorHAnsi"/>
-          <w:sz w:val="22"/>
+        <w:jc w:val="center"/>
+        <w:rPr>
+          <w:rFonts w:asciiTheme="minorHAnsi" w:hAnsiTheme="minorHAnsi"/>
+          <w:sz w:val="22"/>
+        </w:rPr>
+      </w:pPr>
+      <w:r>
+        <w:rPr>
+          <w:rFonts w:asciiTheme="minorHAnsi" w:hAnsiTheme="minorHAnsi"/>
+          <w:noProof/>
+          <w:sz w:val="22"/>
+          <w:lang w:val="en-PH" w:eastAsia="en-PH"/>
         </w:rPr>
         <w:drawing>
           <wp:inline distT="0" distB="0" distL="0" distR="0" wp14:anchorId="62F6F119" wp14:editId="4BB8E226">
-            <wp:extent cx="5943600" cy="3343275"/>
-            <wp:effectExtent l="0" t="0" r="0" b="9525"/>
+            <wp:extent cx="5731933" cy="3224212"/>
+            <wp:effectExtent l="0" t="0" r="2540" b="0"/>
             <wp:docPr id="3" name="Picture 3"/>
             <wp:cNvGraphicFramePr>
               <a:graphicFrameLocks xmlns:a="http://schemas.openxmlformats.org/drawingml/2006/main" noChangeAspect="1"/>
@@ -740,7 +1868,7 @@
                   <pic:spPr>
                     <a:xfrm>
                       <a:off x="0" y="0"/>
-                      <a:ext cx="5943600" cy="3343275"/>
+                      <a:ext cx="5736040" cy="3226522"/>
                     </a:xfrm>
                     <a:prstGeom prst="rect">
                       <a:avLst/>
@@ -755,15 +1883,231 @@
     </w:p>
     <w:p>
       <w:pPr>
-        <w:rPr>
-          <w:rFonts w:asciiTheme="minorHAnsi" w:hAnsiTheme="minorHAnsi"/>
-          <w:i/>
-          <w:sz w:val="22"/>
-        </w:rPr>
-      </w:pPr>
+        <w:spacing w:after="66"/>
+        <w:ind w:left="427"/>
+        <w:rPr>
+          <w:sz w:val="22"/>
+        </w:rPr>
+      </w:pPr>
+      <w:r>
+        <w:rPr>
+          <w:noProof/>
+          <w:sz w:val="22"/>
+        </w:rPr>
+        <mc:AlternateContent>
+          <mc:Choice Requires="wpg">
+            <w:drawing>
+              <wp:inline distT="0" distB="0" distL="0" distR="0" wp14:anchorId="2BC9140B" wp14:editId="5C12B778">
+                <wp:extent cx="5405120" cy="38100"/>
+                <wp:effectExtent l="0" t="0" r="0" b="0"/>
+                <wp:docPr id="31" name="Group 31"/>
+                <wp:cNvGraphicFramePr/>
+                <a:graphic xmlns:a="http://schemas.openxmlformats.org/drawingml/2006/main">
+                  <a:graphicData uri="http://schemas.microsoft.com/office/word/2010/wordprocessingGroup">
+                    <wpg:wgp>
+                      <wpg:cNvGrpSpPr/>
+                      <wpg:grpSpPr>
+                        <a:xfrm>
+                          <a:off x="0" y="0"/>
+                          <a:ext cx="5405120" cy="38100"/>
+                          <a:chOff x="0" y="0"/>
+                          <a:chExt cx="5405120" cy="38100"/>
+                        </a:xfrm>
+                      </wpg:grpSpPr>
+                      <wps:wsp>
+                        <wps:cNvPr id="32" name="Shape 7"/>
+                        <wps:cNvSpPr/>
+                        <wps:spPr>
+                          <a:xfrm>
+                            <a:off x="4445" y="0"/>
+                            <a:ext cx="5400675" cy="0"/>
+                          </a:xfrm>
+                          <a:custGeom>
+                            <a:avLst/>
+                            <a:gdLst/>
+                            <a:ahLst/>
+                            <a:cxnLst/>
+                            <a:rect l="0" t="0" r="0" b="0"/>
+                            <a:pathLst>
+                              <a:path w="5400675">
+                                <a:moveTo>
+                                  <a:pt x="0" y="0"/>
+                                </a:moveTo>
+                                <a:lnTo>
+                                  <a:pt x="5400675" y="0"/>
+                                </a:lnTo>
+                              </a:path>
+                            </a:pathLst>
+                          </a:custGeom>
+                          <a:ln w="19050" cap="flat">
+                            <a:miter lim="100000"/>
+                          </a:ln>
+                        </wps:spPr>
+                        <wps:style>
+                          <a:lnRef idx="1">
+                            <a:srgbClr val="000000"/>
+                          </a:lnRef>
+                          <a:fillRef idx="0">
+                            <a:srgbClr val="000000">
+                              <a:alpha val="0"/>
+                            </a:srgbClr>
+                          </a:fillRef>
+                          <a:effectRef idx="0">
+                            <a:scrgbClr r="0" g="0" b="0"/>
+                          </a:effectRef>
+                          <a:fontRef idx="none"/>
+                        </wps:style>
+                        <wps:bodyPr/>
+                      </wps:wsp>
+                      <wps:wsp>
+                        <wps:cNvPr id="33" name="Shape 8"/>
+                        <wps:cNvSpPr/>
+                        <wps:spPr>
+                          <a:xfrm>
+                            <a:off x="0" y="38100"/>
+                            <a:ext cx="5400675" cy="0"/>
+                          </a:xfrm>
+                          <a:custGeom>
+                            <a:avLst/>
+                            <a:gdLst/>
+                            <a:ahLst/>
+                            <a:cxnLst/>
+                            <a:rect l="0" t="0" r="0" b="0"/>
+                            <a:pathLst>
+                              <a:path w="5400675">
+                                <a:moveTo>
+                                  <a:pt x="0" y="0"/>
+                                </a:moveTo>
+                                <a:lnTo>
+                                  <a:pt x="5400675" y="0"/>
+                                </a:lnTo>
+                              </a:path>
+                            </a:pathLst>
+                          </a:custGeom>
+                          <a:ln w="9525" cap="flat">
+                            <a:miter lim="100000"/>
+                          </a:ln>
+                        </wps:spPr>
+                        <wps:style>
+                          <a:lnRef idx="1">
+                            <a:srgbClr val="000000"/>
+                          </a:lnRef>
+                          <a:fillRef idx="0">
+                            <a:srgbClr val="000000">
+                              <a:alpha val="0"/>
+                            </a:srgbClr>
+                          </a:fillRef>
+                          <a:effectRef idx="0">
+                            <a:scrgbClr r="0" g="0" b="0"/>
+                          </a:effectRef>
+                          <a:fontRef idx="none"/>
+                        </wps:style>
+                        <wps:bodyPr/>
+                      </wps:wsp>
+                    </wpg:wgp>
+                  </a:graphicData>
+                </a:graphic>
+              </wp:inline>
+            </w:drawing>
+          </mc:Choice>
+          <mc:Fallback>
+            <w:pict>
+              <v:group w14:anchorId="34EF5DA7" id="Group 31" o:spid="_x0000_s1026" style="width:425.6pt;height:3pt;mso-position-horizontal-relative:char;mso-position-vertical-relative:line" coordsize="54051,381" o:gfxdata="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">
+                <v:shape id="Shape 7" o:spid="_x0000_s1027" style="position:absolute;left:44;width:54007;height:0;visibility:visible;mso-wrap-style:square;v-text-anchor:top" coordsize="5400675,0" o:gfxdata="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" path="m,l5400675,e" filled="f" strokeweight="1.5pt">
+                  <v:stroke miterlimit="1" joinstyle="miter"/>
+                  <v:path arrowok="t" textboxrect="0,0,5400675,0"/>
+                </v:shape>
+                <v:shape id="Shape 8" o:spid="_x0000_s1028" style="position:absolute;top:381;width:54006;height:0;visibility:visible;mso-wrap-style:square;v-text-anchor:top" coordsize="5400675,0" o:gfxdata="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" path="m,l5400675,e" filled="f">
+                  <v:stroke miterlimit="1" joinstyle="miter"/>
+                  <v:path arrowok="t" textboxrect="0,0,5400675,0"/>
+                </v:shape>
+                <w10:anchorlock/>
+              </v:group>
+            </w:pict>
+          </mc:Fallback>
+        </mc:AlternateContent>
+      </w:r>
     </w:p>
     <w:p>
       <w:pPr>
+        <w:spacing w:after="0"/>
+        <w:ind w:left="367"/>
+        <w:rPr>
+          <w:sz w:val="22"/>
+        </w:rPr>
+      </w:pPr>
+      <w:r>
+        <w:rPr>
+          <w:b/>
+          <w:sz w:val="22"/>
+        </w:rPr>
+        <w:t xml:space="preserve">ITSAR2 313 – SYSTEM INTEGRATION AND ARCHICTECTURE 2                              </w:t>
+      </w:r>
+      <w:r>
+        <w:rPr>
+          <w:sz w:val="22"/>
+        </w:rPr>
+        <w:t>Page 4 of 9</w:t>
+      </w:r>
+    </w:p>
+    <w:p>
+      <w:pPr>
+        <w:spacing w:after="0"/>
+        <w:ind w:left="367"/>
+        <w:rPr>
+          <w:sz w:val="22"/>
+        </w:rPr>
+      </w:pPr>
+      <w:r>
+        <w:rPr>
+          <w:sz w:val="22"/>
+        </w:rPr>
+        <w:t xml:space="preserve">by:  </w:t>
+      </w:r>
+      <w:r>
+        <w:rPr>
+          <w:b/>
+          <w:sz w:val="22"/>
+        </w:rPr>
+        <w:t xml:space="preserve">Engr. Joao </w:t>
+      </w:r>
+      <w:proofErr w:type="spellStart"/>
+      <w:r>
+        <w:rPr>
+          <w:b/>
+          <w:sz w:val="22"/>
+        </w:rPr>
+        <w:t>Roumil</w:t>
+      </w:r>
+      <w:proofErr w:type="spellEnd"/>
+      <w:r>
+        <w:rPr>
+          <w:b/>
+          <w:sz w:val="22"/>
+        </w:rPr>
+        <w:t xml:space="preserve"> G. Vergara, </w:t>
+      </w:r>
+      <w:proofErr w:type="spellStart"/>
+      <w:r>
+        <w:rPr>
+          <w:b/>
+          <w:sz w:val="22"/>
+        </w:rPr>
+        <w:t>CpE</w:t>
+      </w:r>
+      <w:proofErr w:type="spellEnd"/>
+    </w:p>
+    <w:p>
+      <w:pPr>
+        <w:rPr>
+          <w:rFonts w:asciiTheme="minorHAnsi" w:hAnsiTheme="minorHAnsi"/>
+          <w:i/>
+          <w:sz w:val="22"/>
+        </w:rPr>
+      </w:pPr>
+    </w:p>
+    <w:p>
+      <w:pPr>
         <w:jc w:val="center"/>
         <w:rPr>
           <w:rFonts w:asciiTheme="minorHAnsi" w:hAnsiTheme="minorHAnsi"/>
@@ -779,6 +2123,7 @@
           <w:i/>
           <w:sz w:val="22"/>
         </w:rPr>
+        <w:lastRenderedPageBreak/>
         <w:t>“</w:t>
       </w:r>
       <w:r>
@@ -810,7 +2155,9 @@
       <w:r>
         <w:rPr>
           <w:rFonts w:asciiTheme="minorHAnsi" w:hAnsiTheme="minorHAnsi"/>
-          <w:sz w:val="22"/>
+          <w:noProof/>
+          <w:sz w:val="22"/>
+          <w:lang w:val="en-PH" w:eastAsia="en-PH"/>
         </w:rPr>
         <w:drawing>
           <wp:inline distT="0" distB="0" distL="0" distR="0" wp14:anchorId="0ABDC45C" wp14:editId="2B024CA1">
@@ -877,9 +2224,9 @@
           <w:i/>
           <w:sz w:val="22"/>
         </w:rPr>
-        <w:lastRenderedPageBreak/>
         <w:t>“</w:t>
       </w:r>
+      <w:proofErr w:type="spellStart"/>
       <w:r>
         <w:rPr>
           <w:rFonts w:asciiTheme="minorHAnsi" w:hAnsiTheme="minorHAnsi"/>
@@ -887,8 +2234,9 @@
           <w:i/>
           <w:sz w:val="22"/>
         </w:rPr>
-        <w:t xml:space="preserve">Topbar badge — </w:t>
-      </w:r>
+        <w:t>Topbar</w:t>
+      </w:r>
+      <w:proofErr w:type="spellEnd"/>
       <w:r>
         <w:rPr>
           <w:rFonts w:asciiTheme="minorHAnsi" w:hAnsiTheme="minorHAnsi"/>
@@ -896,8 +2244,9 @@
           <w:i/>
           <w:sz w:val="22"/>
         </w:rPr>
-        <w:t>Microservices Mode</w:t>
-      </w:r>
+        <w:t xml:space="preserve"> badge — </w:t>
+      </w:r>
+      <w:proofErr w:type="spellStart"/>
       <w:r>
         <w:rPr>
           <w:rFonts w:asciiTheme="minorHAnsi" w:hAnsiTheme="minorHAnsi"/>
@@ -905,8 +2254,9 @@
           <w:i/>
           <w:sz w:val="22"/>
         </w:rPr>
-        <w:t xml:space="preserve"> and </w:t>
-      </w:r>
+        <w:t>Microservices</w:t>
+      </w:r>
+      <w:proofErr w:type="spellEnd"/>
       <w:r>
         <w:rPr>
           <w:rFonts w:asciiTheme="minorHAnsi" w:hAnsiTheme="minorHAnsi"/>
@@ -914,7 +2264,7 @@
           <w:i/>
           <w:sz w:val="22"/>
         </w:rPr>
-        <w:t>Monolithic Mode</w:t>
+        <w:t xml:space="preserve"> Mode and Monolithic Mode</w:t>
       </w:r>
       <w:r>
         <w:rPr>
@@ -939,7 +2289,9 @@
       <w:r>
         <w:rPr>
           <w:rFonts w:asciiTheme="minorHAnsi" w:hAnsiTheme="minorHAnsi"/>
-          <w:sz w:val="22"/>
+          <w:noProof/>
+          <w:sz w:val="22"/>
+          <w:lang w:val="en-PH" w:eastAsia="en-PH"/>
         </w:rPr>
         <w:drawing>
           <wp:inline distT="0" distB="0" distL="0" distR="0" wp14:anchorId="3A3B9C1F" wp14:editId="1BE1263C">
@@ -980,7 +2332,9 @@
       <w:r>
         <w:rPr>
           <w:rFonts w:asciiTheme="minorHAnsi" w:hAnsiTheme="minorHAnsi"/>
-          <w:sz w:val="22"/>
+          <w:noProof/>
+          <w:sz w:val="22"/>
+          <w:lang w:val="en-PH" w:eastAsia="en-PH"/>
         </w:rPr>
         <w:drawing>
           <wp:inline distT="0" distB="0" distL="0" distR="0" wp14:anchorId="6C72EAD3" wp14:editId="0FA79A44">
@@ -1024,13 +2378,303 @@
         <w:jc w:val="center"/>
         <w:rPr>
           <w:rFonts w:asciiTheme="minorHAnsi" w:hAnsiTheme="minorHAnsi"/>
-          <w:sz w:val="22"/>
-        </w:rPr>
-      </w:pPr>
-      <w:r>
-        <w:rPr>
-          <w:rFonts w:asciiTheme="minorHAnsi" w:hAnsiTheme="minorHAnsi"/>
-          <w:sz w:val="22"/>
+          <w:b/>
+          <w:i/>
+          <w:sz w:val="22"/>
+        </w:rPr>
+      </w:pPr>
+    </w:p>
+    <w:p>
+      <w:pPr>
+        <w:jc w:val="center"/>
+        <w:rPr>
+          <w:rFonts w:asciiTheme="minorHAnsi" w:hAnsiTheme="minorHAnsi"/>
+          <w:b/>
+          <w:i/>
+          <w:sz w:val="22"/>
+        </w:rPr>
+      </w:pPr>
+    </w:p>
+    <w:p>
+      <w:pPr>
+        <w:jc w:val="center"/>
+        <w:rPr>
+          <w:rFonts w:asciiTheme="minorHAnsi" w:hAnsiTheme="minorHAnsi"/>
+          <w:b/>
+          <w:i/>
+          <w:sz w:val="22"/>
+        </w:rPr>
+      </w:pPr>
+    </w:p>
+    <w:p>
+      <w:pPr>
+        <w:jc w:val="center"/>
+        <w:rPr>
+          <w:rFonts w:asciiTheme="minorHAnsi" w:hAnsiTheme="minorHAnsi"/>
+          <w:b/>
+          <w:i/>
+          <w:sz w:val="22"/>
+        </w:rPr>
+      </w:pPr>
+    </w:p>
+    <w:p>
+      <w:pPr>
+        <w:jc w:val="center"/>
+        <w:rPr>
+          <w:rFonts w:asciiTheme="minorHAnsi" w:hAnsiTheme="minorHAnsi"/>
+          <w:b/>
+          <w:i/>
+          <w:sz w:val="22"/>
+        </w:rPr>
+      </w:pPr>
+    </w:p>
+    <w:p>
+      <w:pPr>
+        <w:spacing w:after="66"/>
+        <w:ind w:left="427"/>
+        <w:rPr>
+          <w:sz w:val="22"/>
+        </w:rPr>
+      </w:pPr>
+      <w:r>
+        <w:rPr>
+          <w:noProof/>
+          <w:sz w:val="22"/>
+        </w:rPr>
+        <mc:AlternateContent>
+          <mc:Choice Requires="wpg">
+            <w:drawing>
+              <wp:inline distT="0" distB="0" distL="0" distR="0" wp14:anchorId="2BC9140B" wp14:editId="5C12B778">
+                <wp:extent cx="5405120" cy="38100"/>
+                <wp:effectExtent l="0" t="0" r="0" b="0"/>
+                <wp:docPr id="34" name="Group 34"/>
+                <wp:cNvGraphicFramePr/>
+                <a:graphic xmlns:a="http://schemas.openxmlformats.org/drawingml/2006/main">
+                  <a:graphicData uri="http://schemas.microsoft.com/office/word/2010/wordprocessingGroup">
+                    <wpg:wgp>
+                      <wpg:cNvGrpSpPr/>
+                      <wpg:grpSpPr>
+                        <a:xfrm>
+                          <a:off x="0" y="0"/>
+                          <a:ext cx="5405120" cy="38100"/>
+                          <a:chOff x="0" y="0"/>
+                          <a:chExt cx="5405120" cy="38100"/>
+                        </a:xfrm>
+                      </wpg:grpSpPr>
+                      <wps:wsp>
+                        <wps:cNvPr id="35" name="Shape 7"/>
+                        <wps:cNvSpPr/>
+                        <wps:spPr>
+                          <a:xfrm>
+                            <a:off x="4445" y="0"/>
+                            <a:ext cx="5400675" cy="0"/>
+                          </a:xfrm>
+                          <a:custGeom>
+                            <a:avLst/>
+                            <a:gdLst/>
+                            <a:ahLst/>
+                            <a:cxnLst/>
+                            <a:rect l="0" t="0" r="0" b="0"/>
+                            <a:pathLst>
+                              <a:path w="5400675">
+                                <a:moveTo>
+                                  <a:pt x="0" y="0"/>
+                                </a:moveTo>
+                                <a:lnTo>
+                                  <a:pt x="5400675" y="0"/>
+                                </a:lnTo>
+                              </a:path>
+                            </a:pathLst>
+                          </a:custGeom>
+                          <a:ln w="19050" cap="flat">
+                            <a:miter lim="100000"/>
+                          </a:ln>
+                        </wps:spPr>
+                        <wps:style>
+                          <a:lnRef idx="1">
+                            <a:srgbClr val="000000"/>
+                          </a:lnRef>
+                          <a:fillRef idx="0">
+                            <a:srgbClr val="000000">
+                              <a:alpha val="0"/>
+                            </a:srgbClr>
+                          </a:fillRef>
+                          <a:effectRef idx="0">
+                            <a:scrgbClr r="0" g="0" b="0"/>
+                          </a:effectRef>
+                          <a:fontRef idx="none"/>
+                        </wps:style>
+                        <wps:bodyPr/>
+                      </wps:wsp>
+                      <wps:wsp>
+                        <wps:cNvPr id="36" name="Shape 8"/>
+                        <wps:cNvSpPr/>
+                        <wps:spPr>
+                          <a:xfrm>
+                            <a:off x="0" y="38100"/>
+                            <a:ext cx="5400675" cy="0"/>
+                          </a:xfrm>
+                          <a:custGeom>
+                            <a:avLst/>
+                            <a:gdLst/>
+                            <a:ahLst/>
+                            <a:cxnLst/>
+                            <a:rect l="0" t="0" r="0" b="0"/>
+                            <a:pathLst>
+                              <a:path w="5400675">
+                                <a:moveTo>
+                                  <a:pt x="0" y="0"/>
+                                </a:moveTo>
+                                <a:lnTo>
+                                  <a:pt x="5400675" y="0"/>
+                                </a:lnTo>
+                              </a:path>
+                            </a:pathLst>
+                          </a:custGeom>
+                          <a:ln w="9525" cap="flat">
+                            <a:miter lim="100000"/>
+                          </a:ln>
+                        </wps:spPr>
+                        <wps:style>
+                          <a:lnRef idx="1">
+                            <a:srgbClr val="000000"/>
+                          </a:lnRef>
+                          <a:fillRef idx="0">
+                            <a:srgbClr val="000000">
+                              <a:alpha val="0"/>
+                            </a:srgbClr>
+                          </a:fillRef>
+                          <a:effectRef idx="0">
+                            <a:scrgbClr r="0" g="0" b="0"/>
+                          </a:effectRef>
+                          <a:fontRef idx="none"/>
+                        </wps:style>
+                        <wps:bodyPr/>
+                      </wps:wsp>
+                    </wpg:wgp>
+                  </a:graphicData>
+                </a:graphic>
+              </wp:inline>
+            </w:drawing>
+          </mc:Choice>
+          <mc:Fallback>
+            <w:pict>
+              <v:group w14:anchorId="71B31DE0" id="Group 34" o:spid="_x0000_s1026" style="width:425.6pt;height:3pt;mso-position-horizontal-relative:char;mso-position-vertical-relative:line" coordsize="54051,381" o:gfxdata="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">
+                <v:shape id="Shape 7" o:spid="_x0000_s1027" style="position:absolute;left:44;width:54007;height:0;visibility:visible;mso-wrap-style:square;v-text-anchor:top" coordsize="5400675,0" o:gfxdata="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" path="m,l5400675,e" filled="f" strokeweight="1.5pt">
+                  <v:stroke miterlimit="1" joinstyle="miter"/>
+                  <v:path arrowok="t" textboxrect="0,0,5400675,0"/>
+                </v:shape>
+                <v:shape id="Shape 8" o:spid="_x0000_s1028" style="position:absolute;top:381;width:54006;height:0;visibility:visible;mso-wrap-style:square;v-text-anchor:top" coordsize="5400675,0" o:gfxdata="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" path="m,l5400675,e" filled="f">
+                  <v:stroke miterlimit="1" joinstyle="miter"/>
+                  <v:path arrowok="t" textboxrect="0,0,5400675,0"/>
+                </v:shape>
+                <w10:anchorlock/>
+              </v:group>
+            </w:pict>
+          </mc:Fallback>
+        </mc:AlternateContent>
+      </w:r>
+    </w:p>
+    <w:p>
+      <w:pPr>
+        <w:spacing w:after="0"/>
+        <w:ind w:left="367"/>
+        <w:rPr>
+          <w:sz w:val="22"/>
+        </w:rPr>
+      </w:pPr>
+      <w:r>
+        <w:rPr>
+          <w:b/>
+          <w:sz w:val="22"/>
+        </w:rPr>
+        <w:t xml:space="preserve">ITSAR2 313 – SYSTEM INTEGRATION AND ARCHICTECTURE 2                              </w:t>
+      </w:r>
+      <w:r>
+        <w:rPr>
+          <w:sz w:val="22"/>
+        </w:rPr>
+        <w:t>Page 5 of 9</w:t>
+      </w:r>
+      <w:r>
+        <w:rPr>
+          <w:sz w:val="22"/>
+        </w:rPr>
+        <w:t xml:space="preserve"> </w:t>
+      </w:r>
+    </w:p>
+    <w:p>
+      <w:pPr>
+        <w:spacing w:after="0"/>
+        <w:ind w:left="367"/>
+        <w:rPr>
+          <w:sz w:val="22"/>
+        </w:rPr>
+      </w:pPr>
+      <w:r>
+        <w:rPr>
+          <w:sz w:val="22"/>
+        </w:rPr>
+        <w:t xml:space="preserve">by:  </w:t>
+      </w:r>
+      <w:r>
+        <w:rPr>
+          <w:b/>
+          <w:sz w:val="22"/>
+        </w:rPr>
+        <w:t xml:space="preserve">Engr. Joao </w:t>
+      </w:r>
+      <w:proofErr w:type="spellStart"/>
+      <w:r>
+        <w:rPr>
+          <w:b/>
+          <w:sz w:val="22"/>
+        </w:rPr>
+        <w:t>Roumil</w:t>
+      </w:r>
+      <w:proofErr w:type="spellEnd"/>
+      <w:r>
+        <w:rPr>
+          <w:b/>
+          <w:sz w:val="22"/>
+        </w:rPr>
+        <w:t xml:space="preserve"> G. Vergara, </w:t>
+      </w:r>
+      <w:proofErr w:type="spellStart"/>
+      <w:r>
+        <w:rPr>
+          <w:b/>
+          <w:sz w:val="22"/>
+        </w:rPr>
+        <w:t>CpE</w:t>
+      </w:r>
+      <w:proofErr w:type="spellEnd"/>
+    </w:p>
+    <w:p>
+      <w:pPr>
+        <w:jc w:val="center"/>
+        <w:rPr>
+          <w:rFonts w:asciiTheme="minorHAnsi" w:hAnsiTheme="minorHAnsi"/>
+          <w:b/>
+          <w:i/>
+          <w:sz w:val="22"/>
+        </w:rPr>
+      </w:pPr>
+    </w:p>
+    <w:p>
+      <w:pPr>
+        <w:jc w:val="center"/>
+        <w:rPr>
+          <w:rFonts w:asciiTheme="minorHAnsi" w:hAnsiTheme="minorHAnsi"/>
+          <w:sz w:val="22"/>
+        </w:rPr>
+      </w:pPr>
+      <w:r>
+        <w:rPr>
+          <w:rFonts w:asciiTheme="minorHAnsi" w:hAnsiTheme="minorHAnsi"/>
+          <w:noProof/>
+          <w:sz w:val="22"/>
+          <w:lang w:val="en-PH" w:eastAsia="en-PH"/>
         </w:rPr>
         <w:drawing>
           <wp:inline distT="0" distB="0" distL="0" distR="0" wp14:anchorId="4DEEDD9F" wp14:editId="7A10589B">
@@ -1080,7 +2724,9 @@
       <w:r>
         <w:rPr>
           <w:rFonts w:asciiTheme="minorHAnsi" w:hAnsiTheme="minorHAnsi"/>
-          <w:sz w:val="22"/>
+          <w:noProof/>
+          <w:sz w:val="22"/>
+          <w:lang w:val="en-PH" w:eastAsia="en-PH"/>
         </w:rPr>
         <w:drawing>
           <wp:inline distT="0" distB="0" distL="0" distR="0" wp14:anchorId="7620098D" wp14:editId="4A70B71A">
@@ -1136,6 +2782,233 @@
           <w:sz w:val="22"/>
         </w:rPr>
       </w:pPr>
+    </w:p>
+    <w:p>
+      <w:pPr>
+        <w:spacing w:before="240" w:after="120"/>
+        <w:rPr>
+          <w:rFonts w:asciiTheme="minorHAnsi" w:hAnsiTheme="minorHAnsi"/>
+          <w:sz w:val="22"/>
+        </w:rPr>
+      </w:pPr>
+    </w:p>
+    <w:p>
+      <w:pPr>
+        <w:spacing w:before="240" w:after="120"/>
+        <w:rPr>
+          <w:rFonts w:asciiTheme="minorHAnsi" w:hAnsiTheme="minorHAnsi"/>
+          <w:sz w:val="22"/>
+        </w:rPr>
+      </w:pPr>
+    </w:p>
+    <w:p>
+      <w:pPr>
+        <w:spacing w:after="66"/>
+        <w:ind w:left="427"/>
+        <w:rPr>
+          <w:sz w:val="22"/>
+        </w:rPr>
+      </w:pPr>
+      <w:r>
+        <w:rPr>
+          <w:noProof/>
+          <w:sz w:val="22"/>
+        </w:rPr>
+        <mc:AlternateContent>
+          <mc:Choice Requires="wpg">
+            <w:drawing>
+              <wp:inline distT="0" distB="0" distL="0" distR="0" wp14:anchorId="2BC9140B" wp14:editId="5C12B778">
+                <wp:extent cx="5405120" cy="38100"/>
+                <wp:effectExtent l="0" t="0" r="0" b="0"/>
+                <wp:docPr id="37" name="Group 37"/>
+                <wp:cNvGraphicFramePr/>
+                <a:graphic xmlns:a="http://schemas.openxmlformats.org/drawingml/2006/main">
+                  <a:graphicData uri="http://schemas.microsoft.com/office/word/2010/wordprocessingGroup">
+                    <wpg:wgp>
+                      <wpg:cNvGrpSpPr/>
+                      <wpg:grpSpPr>
+                        <a:xfrm>
+                          <a:off x="0" y="0"/>
+                          <a:ext cx="5405120" cy="38100"/>
+                          <a:chOff x="0" y="0"/>
+                          <a:chExt cx="5405120" cy="38100"/>
+                        </a:xfrm>
+                      </wpg:grpSpPr>
+                      <wps:wsp>
+                        <wps:cNvPr id="38" name="Shape 7"/>
+                        <wps:cNvSpPr/>
+                        <wps:spPr>
+                          <a:xfrm>
+                            <a:off x="4445" y="0"/>
+                            <a:ext cx="5400675" cy="0"/>
+                          </a:xfrm>
+                          <a:custGeom>
+                            <a:avLst/>
+                            <a:gdLst/>
+                            <a:ahLst/>
+                            <a:cxnLst/>
+                            <a:rect l="0" t="0" r="0" b="0"/>
+                            <a:pathLst>
+                              <a:path w="5400675">
+                                <a:moveTo>
+                                  <a:pt x="0" y="0"/>
+                                </a:moveTo>
+                                <a:lnTo>
+                                  <a:pt x="5400675" y="0"/>
+                                </a:lnTo>
+                              </a:path>
+                            </a:pathLst>
+                          </a:custGeom>
+                          <a:ln w="19050" cap="flat">
+                            <a:miter lim="100000"/>
+                          </a:ln>
+                        </wps:spPr>
+                        <wps:style>
+                          <a:lnRef idx="1">
+                            <a:srgbClr val="000000"/>
+                          </a:lnRef>
+                          <a:fillRef idx="0">
+                            <a:srgbClr val="000000">
+                              <a:alpha val="0"/>
+                            </a:srgbClr>
+                          </a:fillRef>
+                          <a:effectRef idx="0">
+                            <a:scrgbClr r="0" g="0" b="0"/>
+                          </a:effectRef>
+                          <a:fontRef idx="none"/>
+                        </wps:style>
+                        <wps:bodyPr/>
+                      </wps:wsp>
+                      <wps:wsp>
+                        <wps:cNvPr id="39" name="Shape 8"/>
+                        <wps:cNvSpPr/>
+                        <wps:spPr>
+                          <a:xfrm>
+                            <a:off x="0" y="38100"/>
+                            <a:ext cx="5400675" cy="0"/>
+                          </a:xfrm>
+                          <a:custGeom>
+                            <a:avLst/>
+                            <a:gdLst/>
+                            <a:ahLst/>
+                            <a:cxnLst/>
+                            <a:rect l="0" t="0" r="0" b="0"/>
+                            <a:pathLst>
+                              <a:path w="5400675">
+                                <a:moveTo>
+                                  <a:pt x="0" y="0"/>
+                                </a:moveTo>
+                                <a:lnTo>
+                                  <a:pt x="5400675" y="0"/>
+                                </a:lnTo>
+                              </a:path>
+                            </a:pathLst>
+                          </a:custGeom>
+                          <a:ln w="9525" cap="flat">
+                            <a:miter lim="100000"/>
+                          </a:ln>
+                        </wps:spPr>
+                        <wps:style>
+                          <a:lnRef idx="1">
+                            <a:srgbClr val="000000"/>
+                          </a:lnRef>
+                          <a:fillRef idx="0">
+                            <a:srgbClr val="000000">
+                              <a:alpha val="0"/>
+                            </a:srgbClr>
+                          </a:fillRef>
+                          <a:effectRef idx="0">
+                            <a:scrgbClr r="0" g="0" b="0"/>
+                          </a:effectRef>
+                          <a:fontRef idx="none"/>
+                        </wps:style>
+                        <wps:bodyPr/>
+                      </wps:wsp>
+                    </wpg:wgp>
+                  </a:graphicData>
+                </a:graphic>
+              </wp:inline>
+            </w:drawing>
+          </mc:Choice>
+          <mc:Fallback>
+            <w:pict>
+              <v:group w14:anchorId="7CCBE938" id="Group 37" o:spid="_x0000_s1026" style="width:425.6pt;height:3pt;mso-position-horizontal-relative:char;mso-position-vertical-relative:line" coordsize="54051,381" o:gfxdata="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">
+                <v:shape id="Shape 7" o:spid="_x0000_s1027" style="position:absolute;left:44;width:54007;height:0;visibility:visible;mso-wrap-style:square;v-text-anchor:top" coordsize="5400675,0" o:gfxdata="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" path="m,l5400675,e" filled="f" strokeweight="1.5pt">
+                  <v:stroke miterlimit="1" joinstyle="miter"/>
+                  <v:path arrowok="t" textboxrect="0,0,5400675,0"/>
+                </v:shape>
+                <v:shape id="Shape 8" o:spid="_x0000_s1028" style="position:absolute;top:381;width:54006;height:0;visibility:visible;mso-wrap-style:square;v-text-anchor:top" coordsize="5400675,0" o:gfxdata="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" path="m,l5400675,e" filled="f">
+                  <v:stroke miterlimit="1" joinstyle="miter"/>
+                  <v:path arrowok="t" textboxrect="0,0,5400675,0"/>
+                </v:shape>
+                <w10:anchorlock/>
+              </v:group>
+            </w:pict>
+          </mc:Fallback>
+        </mc:AlternateContent>
+      </w:r>
+    </w:p>
+    <w:p>
+      <w:pPr>
+        <w:spacing w:after="0"/>
+        <w:ind w:left="367"/>
+        <w:rPr>
+          <w:sz w:val="22"/>
+        </w:rPr>
+      </w:pPr>
+      <w:r>
+        <w:rPr>
+          <w:b/>
+          <w:sz w:val="22"/>
+        </w:rPr>
+        <w:t xml:space="preserve">ITSAR2 313 – SYSTEM INTEGRATION AND ARCHICTECTURE 2                              </w:t>
+      </w:r>
+      <w:r>
+        <w:rPr>
+          <w:sz w:val="22"/>
+        </w:rPr>
+        <w:t>Page 6 of 9</w:t>
+      </w:r>
+    </w:p>
+    <w:p>
+      <w:pPr>
+        <w:spacing w:after="0"/>
+        <w:ind w:left="367"/>
+        <w:rPr>
+          <w:sz w:val="22"/>
+        </w:rPr>
+      </w:pPr>
+      <w:r>
+        <w:rPr>
+          <w:sz w:val="22"/>
+        </w:rPr>
+        <w:t xml:space="preserve">by:  </w:t>
+      </w:r>
+      <w:r>
+        <w:rPr>
+          <w:b/>
+          <w:sz w:val="22"/>
+        </w:rPr>
+        <w:t xml:space="preserve">Engr. Joao Roumil G. Vergara, </w:t>
+      </w:r>
+      <w:proofErr w:type="spellStart"/>
+      <w:r>
+        <w:rPr>
+          <w:b/>
+          <w:sz w:val="22"/>
+        </w:rPr>
+        <w:t>CpE</w:t>
+      </w:r>
+      <w:proofErr w:type="spellEnd"/>
+    </w:p>
+    <w:p>
+      <w:pPr>
+        <w:spacing w:before="240" w:after="120"/>
+        <w:rPr>
+          <w:rFonts w:asciiTheme="minorHAnsi" w:hAnsiTheme="minorHAnsi"/>
+          <w:sz w:val="22"/>
+        </w:rPr>
+      </w:pPr>
       <w:r>
         <w:rPr>
           <w:rFonts w:asciiTheme="minorHAnsi" w:hAnsiTheme="minorHAnsi"/>
@@ -1158,35 +3031,121 @@
           <w:rFonts w:asciiTheme="minorHAnsi" w:hAnsiTheme="minorHAnsi"/>
           <w:sz w:val="22"/>
         </w:rPr>
-        <w:t>Switching between backends produced identical user-facing behavior — the same student, course, and enrollment data appeared in the same Blade views regardless of whether the data was fetched f</w:t>
-      </w:r>
-      <w:r>
-        <w:rPr>
-          <w:rFonts w:asciiTheme="minorHAnsi" w:hAnsiTheme="minorHAnsi"/>
-          <w:sz w:val="22"/>
-        </w:rPr>
-        <w:t>rom the local SQLite database or from remote microservices. The topbar badge updated to reflect the active mode (</w:t>
-      </w:r>
-      <w:r>
-        <w:rPr>
-          <w:rFonts w:asciiTheme="minorHAnsi" w:hAnsiTheme="minorHAnsi"/>
-          <w:sz w:val="22"/>
-        </w:rPr>
-        <w:t xml:space="preserve">Microservices or </w:t>
-      </w:r>
-      <w:r>
-        <w:rPr>
-          <w:rFonts w:asciiTheme="minorHAnsi" w:hAnsiTheme="minorHAnsi"/>
-          <w:sz w:val="22"/>
-        </w:rPr>
-        <w:t>Monolithic) after running php artisan config:clear and refreshing the browser. Data consistency was maintained across both</w:t>
-      </w:r>
-      <w:r>
-        <w:rPr>
-          <w:rFonts w:asciiTheme="minorHAnsi" w:hAnsiTheme="minorHAnsi"/>
-          <w:sz w:val="22"/>
-        </w:rPr>
-        <w:t xml:space="preserve"> modes: creating a student in microservices mode wrote to the student-service’s SQLite database, and switching to monolithic mode showed only the data in the monolith’s own database.</w:t>
+        <w:t xml:space="preserve">Switching between </w:t>
+      </w:r>
+      <w:proofErr w:type="spellStart"/>
+      <w:r>
+        <w:rPr>
+          <w:rFonts w:asciiTheme="minorHAnsi" w:hAnsiTheme="minorHAnsi"/>
+          <w:sz w:val="22"/>
+        </w:rPr>
+        <w:t>backends</w:t>
+      </w:r>
+      <w:proofErr w:type="spellEnd"/>
+      <w:r>
+        <w:rPr>
+          <w:rFonts w:asciiTheme="minorHAnsi" w:hAnsiTheme="minorHAnsi"/>
+          <w:sz w:val="22"/>
+        </w:rPr>
+        <w:t xml:space="preserve"> produced identical user-facing behavior — the same student, course, and enrollment data appeared in the same Blade views regardless of whether the data was fetched from the local SQLite database or from remote </w:t>
+      </w:r>
+      <w:proofErr w:type="spellStart"/>
+      <w:r>
+        <w:rPr>
+          <w:rFonts w:asciiTheme="minorHAnsi" w:hAnsiTheme="minorHAnsi"/>
+          <w:sz w:val="22"/>
+        </w:rPr>
+        <w:t>microservices</w:t>
+      </w:r>
+      <w:proofErr w:type="spellEnd"/>
+      <w:r>
+        <w:rPr>
+          <w:rFonts w:asciiTheme="minorHAnsi" w:hAnsiTheme="minorHAnsi"/>
+          <w:sz w:val="22"/>
+        </w:rPr>
+        <w:t xml:space="preserve">. The </w:t>
+      </w:r>
+      <w:proofErr w:type="spellStart"/>
+      <w:r>
+        <w:rPr>
+          <w:rFonts w:asciiTheme="minorHAnsi" w:hAnsiTheme="minorHAnsi"/>
+          <w:sz w:val="22"/>
+        </w:rPr>
+        <w:t>topbar</w:t>
+      </w:r>
+      <w:proofErr w:type="spellEnd"/>
+      <w:r>
+        <w:rPr>
+          <w:rFonts w:asciiTheme="minorHAnsi" w:hAnsiTheme="minorHAnsi"/>
+          <w:sz w:val="22"/>
+        </w:rPr>
+        <w:t xml:space="preserve"> badge updated to reflect the active mode (</w:t>
+      </w:r>
+      <w:proofErr w:type="spellStart"/>
+      <w:r>
+        <w:rPr>
+          <w:rFonts w:asciiTheme="minorHAnsi" w:hAnsiTheme="minorHAnsi"/>
+          <w:sz w:val="22"/>
+        </w:rPr>
+        <w:t>Microservices</w:t>
+      </w:r>
+      <w:proofErr w:type="spellEnd"/>
+      <w:r>
+        <w:rPr>
+          <w:rFonts w:asciiTheme="minorHAnsi" w:hAnsiTheme="minorHAnsi"/>
+          <w:sz w:val="22"/>
+        </w:rPr>
+        <w:t xml:space="preserve"> or Monolithic) after running </w:t>
+      </w:r>
+      <w:proofErr w:type="spellStart"/>
+      <w:r>
+        <w:rPr>
+          <w:rFonts w:asciiTheme="minorHAnsi" w:hAnsiTheme="minorHAnsi"/>
+          <w:sz w:val="22"/>
+        </w:rPr>
+        <w:t>php</w:t>
+      </w:r>
+      <w:proofErr w:type="spellEnd"/>
+      <w:r>
+        <w:rPr>
+          <w:rFonts w:asciiTheme="minorHAnsi" w:hAnsiTheme="minorHAnsi"/>
+          <w:sz w:val="22"/>
+        </w:rPr>
+        <w:t xml:space="preserve"> artisan </w:t>
+      </w:r>
+      <w:proofErr w:type="spellStart"/>
+      <w:proofErr w:type="gramStart"/>
+      <w:r>
+        <w:rPr>
+          <w:rFonts w:asciiTheme="minorHAnsi" w:hAnsiTheme="minorHAnsi"/>
+          <w:sz w:val="22"/>
+        </w:rPr>
+        <w:t>config:clear</w:t>
+      </w:r>
+      <w:proofErr w:type="spellEnd"/>
+      <w:proofErr w:type="gramEnd"/>
+      <w:r>
+        <w:rPr>
+          <w:rFonts w:asciiTheme="minorHAnsi" w:hAnsiTheme="minorHAnsi"/>
+          <w:sz w:val="22"/>
+        </w:rPr>
+        <w:t xml:space="preserve"> and refreshing the browser. Data consistency was maintained across both modes: creating a student in </w:t>
+      </w:r>
+      <w:proofErr w:type="spellStart"/>
+      <w:r>
+        <w:rPr>
+          <w:rFonts w:asciiTheme="minorHAnsi" w:hAnsiTheme="minorHAnsi"/>
+          <w:sz w:val="22"/>
+        </w:rPr>
+        <w:t>microservices</w:t>
+      </w:r>
+      <w:proofErr w:type="spellEnd"/>
+      <w:r>
+        <w:rPr>
+          <w:rFonts w:asciiTheme="minorHAnsi" w:hAnsiTheme="minorHAnsi"/>
+          <w:sz w:val="22"/>
+        </w:rPr>
+        <w:t xml:space="preserve"> mode wrote to the student-service’s SQLite database, and switching to monolithic mode showed only the data in the monolith’s own database.</w:t>
       </w:r>
     </w:p>
     <w:p>
@@ -1201,28 +3160,39 @@
           <w:rFonts w:asciiTheme="minorHAnsi" w:hAnsiTheme="minorHAnsi"/>
           <w:sz w:val="22"/>
         </w:rPr>
-        <w:t>Cascade delete behavior differed between the two architectures. In monoli</w:t>
-      </w:r>
-      <w:r>
-        <w:rPr>
-          <w:rFonts w:asciiTheme="minorHAnsi" w:hAnsiTheme="minorHAnsi"/>
-          <w:sz w:val="22"/>
-        </w:rPr>
-        <w:t>thic mode, deleting a student automatically removed all associated enrollments in the same database transaction via the Repository layer. In microservices mode, deleting a student from the student-service left orphaned enrollment records in the enrollment-</w:t>
-      </w:r>
-      <w:r>
-        <w:rPr>
-          <w:rFonts w:asciiTheme="minorHAnsi" w:hAnsiTheme="minorHAnsi"/>
-          <w:sz w:val="22"/>
-        </w:rPr>
-        <w:t>service — there is no cross-service cascade mechanism. Latency was noticeably different: monolithic operations completed instantly (in-process), while microservices operations introduced visible network round-trip delay, especially when the enrollment-serv</w:t>
-      </w:r>
-      <w:r>
-        <w:rPr>
-          <w:rFonts w:asciiTheme="minorHAnsi" w:hAnsiTheme="minorHAnsi"/>
-          <w:sz w:val="22"/>
-        </w:rPr>
-        <w:t>ice made two sequential HTTP calls to validate foreign keys.</w:t>
+        <w:t xml:space="preserve">Cascade delete behavior differed between the two architectures. In monolithic mode, deleting a student automatically removed all associated enrollments in the same database transaction via the Repository layer. In </w:t>
+      </w:r>
+      <w:proofErr w:type="spellStart"/>
+      <w:r>
+        <w:rPr>
+          <w:rFonts w:asciiTheme="minorHAnsi" w:hAnsiTheme="minorHAnsi"/>
+          <w:sz w:val="22"/>
+        </w:rPr>
+        <w:t>microservices</w:t>
+      </w:r>
+      <w:proofErr w:type="spellEnd"/>
+      <w:r>
+        <w:rPr>
+          <w:rFonts w:asciiTheme="minorHAnsi" w:hAnsiTheme="minorHAnsi"/>
+          <w:sz w:val="22"/>
+        </w:rPr>
+        <w:t xml:space="preserve"> mode, deleting a student from the student-service left orphaned enrollment records in the enrollment-service — there is no cross-service cascade mechanism. Latency was noticeably different: monolithic operations completed instantly (in-process), while </w:t>
+      </w:r>
+      <w:proofErr w:type="spellStart"/>
+      <w:r>
+        <w:rPr>
+          <w:rFonts w:asciiTheme="minorHAnsi" w:hAnsiTheme="minorHAnsi"/>
+          <w:sz w:val="22"/>
+        </w:rPr>
+        <w:t>microservices</w:t>
+      </w:r>
+      <w:proofErr w:type="spellEnd"/>
+      <w:r>
+        <w:rPr>
+          <w:rFonts w:asciiTheme="minorHAnsi" w:hAnsiTheme="minorHAnsi"/>
+          <w:sz w:val="22"/>
+        </w:rPr>
+        <w:t xml:space="preserve"> operations introduced visible network round-trip delay, especially when the enrollment-service made two sequential HTTP calls to validate foreign keys.</w:t>
       </w:r>
     </w:p>
     <w:tbl>
@@ -1306,6 +3276,7 @@
                 <w:sz w:val="22"/>
               </w:rPr>
             </w:pPr>
+            <w:proofErr w:type="spellStart"/>
             <w:r>
               <w:rPr>
                 <w:rFonts w:asciiTheme="minorHAnsi" w:hAnsiTheme="minorHAnsi"/>
@@ -1315,6 +3286,7 @@
               </w:rPr>
               <w:t>Microservices</w:t>
             </w:r>
+            <w:proofErr w:type="spellEnd"/>
           </w:p>
         </w:tc>
       </w:tr>
@@ -1425,7 +3397,23 @@
                 <w:rFonts w:asciiTheme="minorHAnsi" w:hAnsiTheme="minorHAnsi"/>
                 <w:sz w:val="22"/>
               </w:rPr>
-              <w:t>One command — php artisan serve</w:t>
+              <w:t xml:space="preserve">One command — </w:t>
+            </w:r>
+            <w:proofErr w:type="spellStart"/>
+            <w:r>
+              <w:rPr>
+                <w:rFonts w:asciiTheme="minorHAnsi" w:hAnsiTheme="minorHAnsi"/>
+                <w:sz w:val="22"/>
+              </w:rPr>
+              <w:t>php</w:t>
+            </w:r>
+            <w:proofErr w:type="spellEnd"/>
+            <w:r>
+              <w:rPr>
+                <w:rFonts w:asciiTheme="minorHAnsi" w:hAnsiTheme="minorHAnsi"/>
+                <w:sz w:val="22"/>
+              </w:rPr>
+              <w:t xml:space="preserve"> artisan serve</w:t>
             </w:r>
           </w:p>
         </w:tc>
@@ -1446,14 +3434,7 @@
                 <w:rFonts w:asciiTheme="minorHAnsi" w:hAnsiTheme="minorHAnsi"/>
                 <w:sz w:val="22"/>
               </w:rPr>
-              <w:t xml:space="preserve">4 terminals, startup order </w:t>
-            </w:r>
-            <w:r>
-              <w:rPr>
-                <w:rFonts w:asciiTheme="minorHAnsi" w:hAnsiTheme="minorHAnsi"/>
-                <w:sz w:val="22"/>
-              </w:rPr>
-              <w:t>matters</w:t>
+              <w:t>4 terminals, startup order matters</w:t>
             </w:r>
           </w:p>
         </w:tc>
@@ -1800,20 +3781,11 @@
     </w:p>
     <w:p>
       <w:pPr>
-        <w:spacing w:before="240" w:after="120"/>
-        <w:rPr>
-          <w:rFonts w:asciiTheme="minorHAnsi" w:hAnsiTheme="minorHAnsi"/>
-          <w:sz w:val="22"/>
-        </w:rPr>
-      </w:pPr>
-      <w:r>
-        <w:rPr>
-          <w:rFonts w:asciiTheme="minorHAnsi" w:hAnsiTheme="minorHAnsi"/>
-          <w:b/>
-          <w:sz w:val="22"/>
-        </w:rPr>
-        <w:t>IV. LAB DISCUSSIONS / COMPUTATIONS</w:t>
-      </w:r>
+        <w:rPr>
+          <w:rFonts w:asciiTheme="minorHAnsi" w:hAnsiTheme="minorHAnsi"/>
+          <w:sz w:val="22"/>
+        </w:rPr>
+      </w:pPr>
     </w:p>
     <w:p>
       <w:pPr>
@@ -1822,203 +3794,550 @@
           <w:sz w:val="22"/>
         </w:rPr>
       </w:pPr>
-      <w:r>
-        <w:rPr>
-          <w:rFonts w:asciiTheme="minorHAnsi" w:hAnsiTheme="minorHAnsi"/>
-          <w:sz w:val="22"/>
-        </w:rPr>
-        <w:t xml:space="preserve">The Repository Interface is the central design decision that enabled the ENV switch mechanism. Because each Controller </w:t>
-      </w:r>
-      <w:r>
-        <w:rPr>
-          <w:rFonts w:asciiTheme="minorHAnsi" w:hAnsiTheme="minorHAnsi"/>
-          <w:sz w:val="22"/>
-        </w:rPr>
-        <w:t xml:space="preserve">method type-hints an interface rather than a concrete class, swapping from Eloquent Repositories to HTTP Service Clients requires only a binding change in AppServiceProvider. Each controller method is three to five lines — it calls the interface method </w:t>
-      </w:r>
-      <w:r>
-        <w:rPr>
-          <w:rFonts w:asciiTheme="minorHAnsi" w:hAnsiTheme="minorHAnsi"/>
-          <w:sz w:val="22"/>
-        </w:rPr>
-        <w:lastRenderedPageBreak/>
-        <w:t>and</w:t>
-      </w:r>
-      <w:r>
-        <w:rPr>
-          <w:rFonts w:asciiTheme="minorHAnsi" w:hAnsiTheme="minorHAnsi"/>
-          <w:sz w:val="22"/>
-        </w:rPr>
-        <w:t xml:space="preserve"> returns the result to the view. In plain MVC, Eloquent queries would be embedded directly in controller methods, making backend substitution impossible without rewriting every method.</w:t>
-      </w:r>
     </w:p>
     <w:p>
       <w:pPr>
-        <w:rPr>
-          <w:rFonts w:asciiTheme="minorHAnsi" w:hAnsiTheme="minorHAnsi"/>
-          <w:sz w:val="22"/>
-        </w:rPr>
-      </w:pPr>
-      <w:r>
-        <w:rPr>
-          <w:rFonts w:asciiTheme="minorHAnsi" w:hAnsiTheme="minorHAnsi"/>
-          <w:sz w:val="22"/>
-        </w:rPr>
-        <w:t>Cascade deletes are trivial in the monolith because all data lives in o</w:t>
-      </w:r>
-      <w:r>
-        <w:rPr>
-          <w:rFonts w:asciiTheme="minorHAnsi" w:hAnsiTheme="minorHAnsi"/>
-          <w:sz w:val="22"/>
-        </w:rPr>
-        <w:t>ne SQLite database with one transaction scope. The StudentRepository calls enrollments()-&gt;delete() before removing the student record. In microservices, the same operation would require domain events — the student-service would need to publish a StudentDel</w:t>
-      </w:r>
-      <w:r>
-        <w:rPr>
-          <w:rFonts w:asciiTheme="minorHAnsi" w:hAnsiTheme="minorHAnsi"/>
-          <w:sz w:val="22"/>
-        </w:rPr>
-        <w:t>eted event, and the enrollment-service would need to subscribe and remove matching records. Blade server-side rendering was chosen over a single-page application because it provides a single entry point, avoids CORS configuration, and means the professor o</w:t>
-      </w:r>
-      <w:r>
-        <w:rPr>
-          <w:rFonts w:asciiTheme="minorHAnsi" w:hAnsiTheme="minorHAnsi"/>
-          <w:sz w:val="22"/>
-        </w:rPr>
-        <w:t>nly needs one URL to grade the system. The monolith is effectively a 1-tier deployment. The microservices approach a 3-tier model: presentation (academe), application (the three services), and data (individual SQLite files).</w:t>
+        <w:spacing w:after="66"/>
+        <w:ind w:left="427"/>
+        <w:rPr>
+          <w:sz w:val="22"/>
+        </w:rPr>
+      </w:pPr>
+      <w:r>
+        <w:rPr>
+          <w:noProof/>
+          <w:sz w:val="22"/>
+        </w:rPr>
+        <mc:AlternateContent>
+          <mc:Choice Requires="wpg">
+            <w:drawing>
+              <wp:inline distT="0" distB="0" distL="0" distR="0" wp14:anchorId="2BC9140B" wp14:editId="5C12B778">
+                <wp:extent cx="5405120" cy="38100"/>
+                <wp:effectExtent l="0" t="0" r="0" b="0"/>
+                <wp:docPr id="40" name="Group 40"/>
+                <wp:cNvGraphicFramePr/>
+                <a:graphic xmlns:a="http://schemas.openxmlformats.org/drawingml/2006/main">
+                  <a:graphicData uri="http://schemas.microsoft.com/office/word/2010/wordprocessingGroup">
+                    <wpg:wgp>
+                      <wpg:cNvGrpSpPr/>
+                      <wpg:grpSpPr>
+                        <a:xfrm>
+                          <a:off x="0" y="0"/>
+                          <a:ext cx="5405120" cy="38100"/>
+                          <a:chOff x="0" y="0"/>
+                          <a:chExt cx="5405120" cy="38100"/>
+                        </a:xfrm>
+                      </wpg:grpSpPr>
+                      <wps:wsp>
+                        <wps:cNvPr id="41" name="Shape 7"/>
+                        <wps:cNvSpPr/>
+                        <wps:spPr>
+                          <a:xfrm>
+                            <a:off x="4445" y="0"/>
+                            <a:ext cx="5400675" cy="0"/>
+                          </a:xfrm>
+                          <a:custGeom>
+                            <a:avLst/>
+                            <a:gdLst/>
+                            <a:ahLst/>
+                            <a:cxnLst/>
+                            <a:rect l="0" t="0" r="0" b="0"/>
+                            <a:pathLst>
+                              <a:path w="5400675">
+                                <a:moveTo>
+                                  <a:pt x="0" y="0"/>
+                                </a:moveTo>
+                                <a:lnTo>
+                                  <a:pt x="5400675" y="0"/>
+                                </a:lnTo>
+                              </a:path>
+                            </a:pathLst>
+                          </a:custGeom>
+                          <a:ln w="19050" cap="flat">
+                            <a:miter lim="100000"/>
+                          </a:ln>
+                        </wps:spPr>
+                        <wps:style>
+                          <a:lnRef idx="1">
+                            <a:srgbClr val="000000"/>
+                          </a:lnRef>
+                          <a:fillRef idx="0">
+                            <a:srgbClr val="000000">
+                              <a:alpha val="0"/>
+                            </a:srgbClr>
+                          </a:fillRef>
+                          <a:effectRef idx="0">
+                            <a:scrgbClr r="0" g="0" b="0"/>
+                          </a:effectRef>
+                          <a:fontRef idx="none"/>
+                        </wps:style>
+                        <wps:bodyPr/>
+                      </wps:wsp>
+                      <wps:wsp>
+                        <wps:cNvPr id="42" name="Shape 8"/>
+                        <wps:cNvSpPr/>
+                        <wps:spPr>
+                          <a:xfrm>
+                            <a:off x="0" y="38100"/>
+                            <a:ext cx="5400675" cy="0"/>
+                          </a:xfrm>
+                          <a:custGeom>
+                            <a:avLst/>
+                            <a:gdLst/>
+                            <a:ahLst/>
+                            <a:cxnLst/>
+                            <a:rect l="0" t="0" r="0" b="0"/>
+                            <a:pathLst>
+                              <a:path w="5400675">
+                                <a:moveTo>
+                                  <a:pt x="0" y="0"/>
+                                </a:moveTo>
+                                <a:lnTo>
+                                  <a:pt x="5400675" y="0"/>
+                                </a:lnTo>
+                              </a:path>
+                            </a:pathLst>
+                          </a:custGeom>
+                          <a:ln w="9525" cap="flat">
+                            <a:miter lim="100000"/>
+                          </a:ln>
+                        </wps:spPr>
+                        <wps:style>
+                          <a:lnRef idx="1">
+                            <a:srgbClr val="000000"/>
+                          </a:lnRef>
+                          <a:fillRef idx="0">
+                            <a:srgbClr val="000000">
+                              <a:alpha val="0"/>
+                            </a:srgbClr>
+                          </a:fillRef>
+                          <a:effectRef idx="0">
+                            <a:scrgbClr r="0" g="0" b="0"/>
+                          </a:effectRef>
+                          <a:fontRef idx="none"/>
+                        </wps:style>
+                        <wps:bodyPr/>
+                      </wps:wsp>
+                    </wpg:wgp>
+                  </a:graphicData>
+                </a:graphic>
+              </wp:inline>
+            </w:drawing>
+          </mc:Choice>
+          <mc:Fallback>
+            <w:pict>
+              <v:group w14:anchorId="661A1120" id="Group 40" o:spid="_x0000_s1026" style="width:425.6pt;height:3pt;mso-position-horizontal-relative:char;mso-position-vertical-relative:line" coordsize="54051,381" o:gfxdata="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">
+                <v:shape id="Shape 7" o:spid="_x0000_s1027" style="position:absolute;left:44;width:54007;height:0;visibility:visible;mso-wrap-style:square;v-text-anchor:top" coordsize="5400675,0" o:gfxdata="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" path="m,l5400675,e" filled="f" strokeweight="1.5pt">
+                  <v:stroke miterlimit="1" joinstyle="miter"/>
+                  <v:path arrowok="t" textboxrect="0,0,5400675,0"/>
+                </v:shape>
+                <v:shape id="Shape 8" o:spid="_x0000_s1028" style="position:absolute;top:381;width:54006;height:0;visibility:visible;mso-wrap-style:square;v-text-anchor:top" coordsize="5400675,0" o:gfxdata="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" path="m,l5400675,e" filled="f">
+                  <v:stroke miterlimit="1" joinstyle="miter"/>
+                  <v:path arrowok="t" textboxrect="0,0,5400675,0"/>
+                </v:shape>
+                <w10:anchorlock/>
+              </v:group>
+            </w:pict>
+          </mc:Fallback>
+        </mc:AlternateContent>
       </w:r>
     </w:p>
     <w:p>
       <w:pPr>
-        <w:rPr>
-          <w:rFonts w:asciiTheme="minorHAnsi" w:hAnsiTheme="minorHAnsi"/>
-          <w:sz w:val="22"/>
-        </w:rPr>
-      </w:pPr>
-      <w:r>
-        <w:rPr>
-          <w:rFonts w:asciiTheme="minorHAnsi" w:hAnsiTheme="minorHAnsi"/>
-          <w:sz w:val="22"/>
-        </w:rPr>
-        <w:t>The three Repository interfaces</w:t>
-      </w:r>
-      <w:r>
-        <w:rPr>
-          <w:rFonts w:asciiTheme="minorHAnsi" w:hAnsiTheme="minorHAnsi"/>
-          <w:sz w:val="22"/>
-        </w:rPr>
-        <w:t xml:space="preserve"> — StudentRepositoryInterface, CourseRepositoryInterface, and EnrollmentRepositoryInterface — map exactly to the three microservices. This is not coincidental. The domain boundaries were drawn correctly from the start: each interface encapsulates one aggre</w:t>
-      </w:r>
-      <w:r>
-        <w:rPr>
-          <w:rFonts w:asciiTheme="minorHAnsi" w:hAnsiTheme="minorHAnsi"/>
-          <w:sz w:val="22"/>
-        </w:rPr>
-        <w:t>gate root with its own CRUD operations. The Repository Pattern provided the abstraction seam that made the monolith-to-microservices transition a configuration change rather than a rewrite.</w:t>
+        <w:spacing w:after="0"/>
+        <w:ind w:left="367"/>
+        <w:rPr>
+          <w:sz w:val="22"/>
+        </w:rPr>
+      </w:pPr>
+      <w:r>
+        <w:rPr>
+          <w:b/>
+          <w:sz w:val="22"/>
+        </w:rPr>
+        <w:t xml:space="preserve">ITSAR2 313 – SYSTEM INTEGRATION AND ARCHICTECTURE 2                              </w:t>
+      </w:r>
+      <w:r>
+        <w:rPr>
+          <w:sz w:val="22"/>
+        </w:rPr>
+        <w:t>Page 7 of 9</w:t>
       </w:r>
     </w:p>
     <w:p>
       <w:pPr>
-        <w:spacing w:before="240" w:after="120"/>
-        <w:rPr>
-          <w:rFonts w:asciiTheme="minorHAnsi" w:hAnsiTheme="minorHAnsi"/>
-          <w:sz w:val="22"/>
-        </w:rPr>
-      </w:pPr>
-      <w:r>
-        <w:rPr>
-          <w:rFonts w:asciiTheme="minorHAnsi" w:hAnsiTheme="minorHAnsi"/>
+        <w:spacing w:after="0"/>
+        <w:ind w:left="367"/>
+        <w:rPr>
+          <w:sz w:val="22"/>
+        </w:rPr>
+      </w:pPr>
+      <w:r>
+        <w:rPr>
+          <w:sz w:val="22"/>
+        </w:rPr>
+        <w:t xml:space="preserve">by:  </w:t>
+      </w:r>
+      <w:r>
+        <w:rPr>
           <w:b/>
           <w:sz w:val="22"/>
         </w:rPr>
-        <w:t>V. CONCLUSIONS</w:t>
-      </w:r>
+        <w:t xml:space="preserve">Engr. Joao </w:t>
+      </w:r>
+      <w:proofErr w:type="spellStart"/>
+      <w:r>
+        <w:rPr>
+          <w:b/>
+          <w:sz w:val="22"/>
+        </w:rPr>
+        <w:t>Roumil</w:t>
+      </w:r>
+      <w:proofErr w:type="spellEnd"/>
+      <w:r>
+        <w:rPr>
+          <w:b/>
+          <w:sz w:val="22"/>
+        </w:rPr>
+        <w:t xml:space="preserve"> G. Vergara, </w:t>
+      </w:r>
+      <w:proofErr w:type="spellStart"/>
+      <w:r>
+        <w:rPr>
+          <w:b/>
+          <w:sz w:val="22"/>
+        </w:rPr>
+        <w:t>CpE</w:t>
+      </w:r>
+      <w:proofErr w:type="spellEnd"/>
     </w:p>
     <w:p>
       <w:pPr>
-        <w:rPr>
-          <w:rFonts w:asciiTheme="minorHAnsi" w:hAnsiTheme="minorHAnsi"/>
-          <w:sz w:val="22"/>
-        </w:rPr>
-      </w:pPr>
-      <w:r>
-        <w:rPr>
-          <w:rFonts w:asciiTheme="minorHAnsi" w:hAnsiTheme="minorHAnsi"/>
-          <w:sz w:val="22"/>
-        </w:rPr>
-        <w:t xml:space="preserve">Monolithic architecture is the preferred choice at </w:t>
-      </w:r>
-      <w:r>
-        <w:rPr>
-          <w:rFonts w:asciiTheme="minorHAnsi" w:hAnsiTheme="minorHAnsi"/>
-          <w:sz w:val="22"/>
-        </w:rPr>
-        <w:t>this project scale. The Repository Pattern proved its value — the backend switch from Eloquent Repositories to HTTP Service Clients is a configuration change in .env, not a code change in the Controllers. Microservices would be the right choice at team sca</w:t>
-      </w:r>
-      <w:r>
-        <w:rPr>
-          <w:rFonts w:asciiTheme="minorHAnsi" w:hAnsiTheme="minorHAnsi"/>
-          <w:sz w:val="22"/>
-        </w:rPr>
-        <w:t xml:space="preserve">le with independent deployment needs, horizontal scaling requirements, and organizational autonomy across service boundaries. The Repository boundaries in the monolith map directly to the three microservice boundaries, meaning future service extraction is </w:t>
-      </w:r>
-      <w:r>
-        <w:rPr>
-          <w:rFonts w:asciiTheme="minorHAnsi" w:hAnsiTheme="minorHAnsi"/>
-          <w:sz w:val="22"/>
-        </w:rPr>
-        <w:t>a natural evolution when the business requires it.</w:t>
+        <w:spacing w:before="240" w:after="120"/>
+        <w:rPr>
+          <w:rFonts w:asciiTheme="minorHAnsi" w:hAnsiTheme="minorHAnsi"/>
+          <w:sz w:val="22"/>
+        </w:rPr>
+      </w:pPr>
+      <w:r>
+        <w:rPr>
+          <w:rFonts w:asciiTheme="minorHAnsi" w:hAnsiTheme="minorHAnsi"/>
+          <w:b/>
+          <w:sz w:val="22"/>
+        </w:rPr>
+        <w:lastRenderedPageBreak/>
+        <w:t>IV. LAB DISCUSSIONS / COMPUTATIONS</w:t>
       </w:r>
     </w:p>
     <w:p>
       <w:pPr>
-        <w:spacing w:before="240" w:after="120"/>
-        <w:rPr>
-          <w:rFonts w:asciiTheme="minorHAnsi" w:hAnsiTheme="minorHAnsi"/>
-          <w:b/>
-          <w:sz w:val="22"/>
-        </w:rPr>
-      </w:pPr>
+        <w:rPr>
+          <w:rFonts w:asciiTheme="minorHAnsi" w:hAnsiTheme="minorHAnsi"/>
+          <w:sz w:val="22"/>
+        </w:rPr>
+      </w:pPr>
+      <w:r>
+        <w:rPr>
+          <w:rFonts w:asciiTheme="minorHAnsi" w:hAnsiTheme="minorHAnsi"/>
+          <w:sz w:val="22"/>
+        </w:rPr>
+        <w:t xml:space="preserve">The Repository Interface is the central design decision that enabled the ENV switch mechanism. Because each Controller method type-hints an interface rather than a concrete class, swapping from Eloquent Repositories to HTTP Service Clients requires only a binding change in </w:t>
+      </w:r>
+      <w:proofErr w:type="spellStart"/>
+      <w:r>
+        <w:rPr>
+          <w:rFonts w:asciiTheme="minorHAnsi" w:hAnsiTheme="minorHAnsi"/>
+          <w:sz w:val="22"/>
+        </w:rPr>
+        <w:t>AppServiceProvider</w:t>
+      </w:r>
+      <w:proofErr w:type="spellEnd"/>
+      <w:r>
+        <w:rPr>
+          <w:rFonts w:asciiTheme="minorHAnsi" w:hAnsiTheme="minorHAnsi"/>
+          <w:sz w:val="22"/>
+        </w:rPr>
+        <w:t>. Each controller method is three to five lines — it calls the interface method and returns the result to the view. In plain MVC, Eloquent queries would be embedded directly in controller methods, making backend substitution impossible without rewriting every method.</w:t>
+      </w:r>
     </w:p>
     <w:p>
       <w:pPr>
-        <w:spacing w:before="240" w:after="120"/>
-        <w:rPr>
-          <w:rFonts w:asciiTheme="minorHAnsi" w:hAnsiTheme="minorHAnsi"/>
-          <w:b/>
-          <w:sz w:val="22"/>
-        </w:rPr>
-      </w:pPr>
+        <w:rPr>
+          <w:rFonts w:asciiTheme="minorHAnsi" w:hAnsiTheme="minorHAnsi"/>
+          <w:sz w:val="22"/>
+        </w:rPr>
+      </w:pPr>
+      <w:r>
+        <w:rPr>
+          <w:rFonts w:asciiTheme="minorHAnsi" w:hAnsiTheme="minorHAnsi"/>
+          <w:sz w:val="22"/>
+        </w:rPr>
+        <w:t xml:space="preserve">Cascade deletes are trivial in the monolith because all data lives in one SQLite database with one transaction scope. The </w:t>
+      </w:r>
+      <w:proofErr w:type="spellStart"/>
+      <w:r>
+        <w:rPr>
+          <w:rFonts w:asciiTheme="minorHAnsi" w:hAnsiTheme="minorHAnsi"/>
+          <w:sz w:val="22"/>
+        </w:rPr>
+        <w:t>StudentRepository</w:t>
+      </w:r>
+      <w:proofErr w:type="spellEnd"/>
+      <w:r>
+        <w:rPr>
+          <w:rFonts w:asciiTheme="minorHAnsi" w:hAnsiTheme="minorHAnsi"/>
+          <w:sz w:val="22"/>
+        </w:rPr>
+        <w:t xml:space="preserve"> calls enrollments()-&gt;</w:t>
+      </w:r>
+      <w:proofErr w:type="gramStart"/>
+      <w:r>
+        <w:rPr>
+          <w:rFonts w:asciiTheme="minorHAnsi" w:hAnsiTheme="minorHAnsi"/>
+          <w:sz w:val="22"/>
+        </w:rPr>
+        <w:t>delete(</w:t>
+      </w:r>
+      <w:proofErr w:type="gramEnd"/>
+      <w:r>
+        <w:rPr>
+          <w:rFonts w:asciiTheme="minorHAnsi" w:hAnsiTheme="minorHAnsi"/>
+          <w:sz w:val="22"/>
+        </w:rPr>
+        <w:t xml:space="preserve">) before removing the student record. In </w:t>
+      </w:r>
+      <w:proofErr w:type="spellStart"/>
+      <w:r>
+        <w:rPr>
+          <w:rFonts w:asciiTheme="minorHAnsi" w:hAnsiTheme="minorHAnsi"/>
+          <w:sz w:val="22"/>
+        </w:rPr>
+        <w:t>microservices</w:t>
+      </w:r>
+      <w:proofErr w:type="spellEnd"/>
+      <w:r>
+        <w:rPr>
+          <w:rFonts w:asciiTheme="minorHAnsi" w:hAnsiTheme="minorHAnsi"/>
+          <w:sz w:val="22"/>
+        </w:rPr>
+        <w:t xml:space="preserve">, the same operation would require domain events — the student-service would need to publish a </w:t>
+      </w:r>
+      <w:proofErr w:type="spellStart"/>
+      <w:r>
+        <w:rPr>
+          <w:rFonts w:asciiTheme="minorHAnsi" w:hAnsiTheme="minorHAnsi"/>
+          <w:sz w:val="22"/>
+        </w:rPr>
+        <w:t>StudentDeleted</w:t>
+      </w:r>
+      <w:proofErr w:type="spellEnd"/>
+      <w:r>
+        <w:rPr>
+          <w:rFonts w:asciiTheme="minorHAnsi" w:hAnsiTheme="minorHAnsi"/>
+          <w:sz w:val="22"/>
+        </w:rPr>
+        <w:t xml:space="preserve"> event, and the enrollment-service would need to subscribe and remove matching records. Blade server-side rendering was chosen over a single-page application because it provides a single entry point, avoids CORS configuration, and means the professor only needs one URL to grade the system. The monolith is effectively a 1-tier deployment. The </w:t>
+      </w:r>
+      <w:proofErr w:type="spellStart"/>
+      <w:r>
+        <w:rPr>
+          <w:rFonts w:asciiTheme="minorHAnsi" w:hAnsiTheme="minorHAnsi"/>
+          <w:sz w:val="22"/>
+        </w:rPr>
+        <w:t>microservices</w:t>
+      </w:r>
+      <w:proofErr w:type="spellEnd"/>
+      <w:r>
+        <w:rPr>
+          <w:rFonts w:asciiTheme="minorHAnsi" w:hAnsiTheme="minorHAnsi"/>
+          <w:sz w:val="22"/>
+        </w:rPr>
+        <w:t xml:space="preserve"> approach a 3-tier model: presentation (academe), application (the three services), and data (individual SQLite files).</w:t>
+      </w:r>
     </w:p>
     <w:p>
       <w:pPr>
-        <w:spacing w:before="240" w:after="120"/>
-        <w:rPr>
-          <w:rFonts w:asciiTheme="minorHAnsi" w:hAnsiTheme="minorHAnsi"/>
-          <w:b/>
-          <w:sz w:val="22"/>
-        </w:rPr>
-      </w:pPr>
+        <w:rPr>
+          <w:rFonts w:asciiTheme="minorHAnsi" w:hAnsiTheme="minorHAnsi"/>
+          <w:sz w:val="22"/>
+        </w:rPr>
+      </w:pPr>
+      <w:r>
+        <w:rPr>
+          <w:rFonts w:asciiTheme="minorHAnsi" w:hAnsiTheme="minorHAnsi"/>
+          <w:sz w:val="22"/>
+        </w:rPr>
+        <w:t xml:space="preserve">The three Repository interfaces — </w:t>
+      </w:r>
+      <w:proofErr w:type="spellStart"/>
+      <w:r>
+        <w:rPr>
+          <w:rFonts w:asciiTheme="minorHAnsi" w:hAnsiTheme="minorHAnsi"/>
+          <w:sz w:val="22"/>
+        </w:rPr>
+        <w:t>StudentRepositoryInterface</w:t>
+      </w:r>
+      <w:proofErr w:type="spellEnd"/>
+      <w:r>
+        <w:rPr>
+          <w:rFonts w:asciiTheme="minorHAnsi" w:hAnsiTheme="minorHAnsi"/>
+          <w:sz w:val="22"/>
+        </w:rPr>
+        <w:t xml:space="preserve">, </w:t>
+      </w:r>
+      <w:proofErr w:type="spellStart"/>
+      <w:r>
+        <w:rPr>
+          <w:rFonts w:asciiTheme="minorHAnsi" w:hAnsiTheme="minorHAnsi"/>
+          <w:sz w:val="22"/>
+        </w:rPr>
+        <w:t>CourseRepositoryInterface</w:t>
+      </w:r>
+      <w:proofErr w:type="spellEnd"/>
+      <w:r>
+        <w:rPr>
+          <w:rFonts w:asciiTheme="minorHAnsi" w:hAnsiTheme="minorHAnsi"/>
+          <w:sz w:val="22"/>
+        </w:rPr>
+        <w:t xml:space="preserve">, and </w:t>
+      </w:r>
+      <w:proofErr w:type="spellStart"/>
+      <w:r>
+        <w:rPr>
+          <w:rFonts w:asciiTheme="minorHAnsi" w:hAnsiTheme="minorHAnsi"/>
+          <w:sz w:val="22"/>
+        </w:rPr>
+        <w:t>EnrollmentRepositoryInterface</w:t>
+      </w:r>
+      <w:proofErr w:type="spellEnd"/>
+      <w:r>
+        <w:rPr>
+          <w:rFonts w:asciiTheme="minorHAnsi" w:hAnsiTheme="minorHAnsi"/>
+          <w:sz w:val="22"/>
+        </w:rPr>
+        <w:t xml:space="preserve"> — map exactly to the three </w:t>
+      </w:r>
+      <w:proofErr w:type="spellStart"/>
+      <w:r>
+        <w:rPr>
+          <w:rFonts w:asciiTheme="minorHAnsi" w:hAnsiTheme="minorHAnsi"/>
+          <w:sz w:val="22"/>
+        </w:rPr>
+        <w:t>microservices</w:t>
+      </w:r>
+      <w:proofErr w:type="spellEnd"/>
+      <w:r>
+        <w:rPr>
+          <w:rFonts w:asciiTheme="minorHAnsi" w:hAnsiTheme="minorHAnsi"/>
+          <w:sz w:val="22"/>
+        </w:rPr>
+        <w:t>. This is not coincidental. The domain boundaries were drawn correctly from the start: each interface encapsulates one aggregate root with its own CRUD operations. The Repository Pattern provided the abstraction seam that made the monolith-to-</w:t>
+      </w:r>
+      <w:proofErr w:type="spellStart"/>
+      <w:r>
+        <w:rPr>
+          <w:rFonts w:asciiTheme="minorHAnsi" w:hAnsiTheme="minorHAnsi"/>
+          <w:sz w:val="22"/>
+        </w:rPr>
+        <w:t>microservices</w:t>
+      </w:r>
+      <w:proofErr w:type="spellEnd"/>
+      <w:r>
+        <w:rPr>
+          <w:rFonts w:asciiTheme="minorHAnsi" w:hAnsiTheme="minorHAnsi"/>
+          <w:sz w:val="22"/>
+        </w:rPr>
+        <w:t xml:space="preserve"> transition a configuration change rather than a rewrite.</w:t>
+      </w:r>
     </w:p>
     <w:p>
       <w:pPr>
         <w:spacing w:before="240" w:after="120"/>
         <w:rPr>
           <w:rFonts w:asciiTheme="minorHAnsi" w:hAnsiTheme="minorHAnsi"/>
+          <w:sz w:val="22"/>
+        </w:rPr>
+      </w:pPr>
+      <w:r>
+        <w:rPr>
+          <w:rFonts w:asciiTheme="minorHAnsi" w:hAnsiTheme="minorHAnsi"/>
           <w:b/>
           <w:sz w:val="22"/>
         </w:rPr>
-      </w:pPr>
+        <w:t>V. CONCLUSIONS</w:t>
+      </w:r>
     </w:p>
     <w:p>
       <w:pPr>
-        <w:spacing w:before="240" w:after="120"/>
-        <w:rPr>
-          <w:rFonts w:asciiTheme="minorHAnsi" w:hAnsiTheme="minorHAnsi"/>
-          <w:b/>
-          <w:sz w:val="22"/>
-        </w:rPr>
-      </w:pPr>
+        <w:rPr>
+          <w:rFonts w:asciiTheme="minorHAnsi" w:hAnsiTheme="minorHAnsi"/>
+          <w:sz w:val="22"/>
+        </w:rPr>
+      </w:pPr>
+      <w:r>
+        <w:rPr>
+          <w:rFonts w:asciiTheme="minorHAnsi" w:hAnsiTheme="minorHAnsi"/>
+          <w:sz w:val="22"/>
+        </w:rPr>
+        <w:t xml:space="preserve">Monolithic architecture is the preferred choice at this project scale. The Repository Pattern proved its value — the backend switch from Eloquent Repositories to HTTP Service Clients is a configuration change </w:t>
+      </w:r>
+      <w:proofErr w:type="gramStart"/>
+      <w:r>
+        <w:rPr>
+          <w:rFonts w:asciiTheme="minorHAnsi" w:hAnsiTheme="minorHAnsi"/>
+          <w:sz w:val="22"/>
+        </w:rPr>
+        <w:t>in .</w:t>
+      </w:r>
+      <w:proofErr w:type="spellStart"/>
+      <w:r>
+        <w:rPr>
+          <w:rFonts w:asciiTheme="minorHAnsi" w:hAnsiTheme="minorHAnsi"/>
+          <w:sz w:val="22"/>
+        </w:rPr>
+        <w:t>env</w:t>
+      </w:r>
+      <w:proofErr w:type="spellEnd"/>
+      <w:proofErr w:type="gramEnd"/>
+      <w:r>
+        <w:rPr>
+          <w:rFonts w:asciiTheme="minorHAnsi" w:hAnsiTheme="minorHAnsi"/>
+          <w:sz w:val="22"/>
+        </w:rPr>
+        <w:t xml:space="preserve">, not a code change in the Controllers. </w:t>
+      </w:r>
+      <w:proofErr w:type="spellStart"/>
+      <w:r>
+        <w:rPr>
+          <w:rFonts w:asciiTheme="minorHAnsi" w:hAnsiTheme="minorHAnsi"/>
+          <w:sz w:val="22"/>
+        </w:rPr>
+        <w:t>Microservices</w:t>
+      </w:r>
+      <w:proofErr w:type="spellEnd"/>
+      <w:r>
+        <w:rPr>
+          <w:rFonts w:asciiTheme="minorHAnsi" w:hAnsiTheme="minorHAnsi"/>
+          <w:sz w:val="22"/>
+        </w:rPr>
+        <w:t xml:space="preserve"> would be the right choice at team scale with independent deployment needs, horizontal scaling requirements, and organizational autonomy across service boundaries. The Repository boundaries in the monolith map directly to the three </w:t>
+      </w:r>
+      <w:proofErr w:type="spellStart"/>
+      <w:r>
+        <w:rPr>
+          <w:rFonts w:asciiTheme="minorHAnsi" w:hAnsiTheme="minorHAnsi"/>
+          <w:sz w:val="22"/>
+        </w:rPr>
+        <w:t>microservice</w:t>
+      </w:r>
+      <w:proofErr w:type="spellEnd"/>
+      <w:r>
+        <w:rPr>
+          <w:rFonts w:asciiTheme="minorHAnsi" w:hAnsiTheme="minorHAnsi"/>
+          <w:sz w:val="22"/>
+        </w:rPr>
+        <w:t xml:space="preserve"> boundaries, meaning future service extraction is a natural evolution when the business requires it.</w:t>
+      </w:r>
     </w:p>
     <w:p>
       <w:pPr>
@@ -2049,11 +4368,234 @@
           <w:sz w:val="22"/>
         </w:rPr>
       </w:pPr>
-      <w:bookmarkStart w:id="0" w:name="_GoBack"/>
-      <w:bookmarkEnd w:id="0"/>
     </w:p>
     <w:p>
       <w:pPr>
+        <w:spacing w:after="66"/>
+        <w:ind w:left="427"/>
+        <w:rPr>
+          <w:sz w:val="22"/>
+        </w:rPr>
+      </w:pPr>
+      <w:r>
+        <w:rPr>
+          <w:noProof/>
+          <w:sz w:val="22"/>
+        </w:rPr>
+        <mc:AlternateContent>
+          <mc:Choice Requires="wpg">
+            <w:drawing>
+              <wp:inline distT="0" distB="0" distL="0" distR="0" wp14:anchorId="2BC9140B" wp14:editId="5C12B778">
+                <wp:extent cx="5405120" cy="38100"/>
+                <wp:effectExtent l="0" t="0" r="0" b="0"/>
+                <wp:docPr id="43" name="Group 43"/>
+                <wp:cNvGraphicFramePr/>
+                <a:graphic xmlns:a="http://schemas.openxmlformats.org/drawingml/2006/main">
+                  <a:graphicData uri="http://schemas.microsoft.com/office/word/2010/wordprocessingGroup">
+                    <wpg:wgp>
+                      <wpg:cNvGrpSpPr/>
+                      <wpg:grpSpPr>
+                        <a:xfrm>
+                          <a:off x="0" y="0"/>
+                          <a:ext cx="5405120" cy="38100"/>
+                          <a:chOff x="0" y="0"/>
+                          <a:chExt cx="5405120" cy="38100"/>
+                        </a:xfrm>
+                      </wpg:grpSpPr>
+                      <wps:wsp>
+                        <wps:cNvPr id="44" name="Shape 7"/>
+                        <wps:cNvSpPr/>
+                        <wps:spPr>
+                          <a:xfrm>
+                            <a:off x="4445" y="0"/>
+                            <a:ext cx="5400675" cy="0"/>
+                          </a:xfrm>
+                          <a:custGeom>
+                            <a:avLst/>
+                            <a:gdLst/>
+                            <a:ahLst/>
+                            <a:cxnLst/>
+                            <a:rect l="0" t="0" r="0" b="0"/>
+                            <a:pathLst>
+                              <a:path w="5400675">
+                                <a:moveTo>
+                                  <a:pt x="0" y="0"/>
+                                </a:moveTo>
+                                <a:lnTo>
+                                  <a:pt x="5400675" y="0"/>
+                                </a:lnTo>
+                              </a:path>
+                            </a:pathLst>
+                          </a:custGeom>
+                          <a:ln w="19050" cap="flat">
+                            <a:miter lim="100000"/>
+                          </a:ln>
+                        </wps:spPr>
+                        <wps:style>
+                          <a:lnRef idx="1">
+                            <a:srgbClr val="000000"/>
+                          </a:lnRef>
+                          <a:fillRef idx="0">
+                            <a:srgbClr val="000000">
+                              <a:alpha val="0"/>
+                            </a:srgbClr>
+                          </a:fillRef>
+                          <a:effectRef idx="0">
+                            <a:scrgbClr r="0" g="0" b="0"/>
+                          </a:effectRef>
+                          <a:fontRef idx="none"/>
+                        </wps:style>
+                        <wps:bodyPr/>
+                      </wps:wsp>
+                      <wps:wsp>
+                        <wps:cNvPr id="45" name="Shape 8"/>
+                        <wps:cNvSpPr/>
+                        <wps:spPr>
+                          <a:xfrm>
+                            <a:off x="0" y="38100"/>
+                            <a:ext cx="5400675" cy="0"/>
+                          </a:xfrm>
+                          <a:custGeom>
+                            <a:avLst/>
+                            <a:gdLst/>
+                            <a:ahLst/>
+                            <a:cxnLst/>
+                            <a:rect l="0" t="0" r="0" b="0"/>
+                            <a:pathLst>
+                              <a:path w="5400675">
+                                <a:moveTo>
+                                  <a:pt x="0" y="0"/>
+                                </a:moveTo>
+                                <a:lnTo>
+                                  <a:pt x="5400675" y="0"/>
+                                </a:lnTo>
+                              </a:path>
+                            </a:pathLst>
+                          </a:custGeom>
+                          <a:ln w="9525" cap="flat">
+                            <a:miter lim="100000"/>
+                          </a:ln>
+                        </wps:spPr>
+                        <wps:style>
+                          <a:lnRef idx="1">
+                            <a:srgbClr val="000000"/>
+                          </a:lnRef>
+                          <a:fillRef idx="0">
+                            <a:srgbClr val="000000">
+                              <a:alpha val="0"/>
+                            </a:srgbClr>
+                          </a:fillRef>
+                          <a:effectRef idx="0">
+                            <a:scrgbClr r="0" g="0" b="0"/>
+                          </a:effectRef>
+                          <a:fontRef idx="none"/>
+                        </wps:style>
+                        <wps:bodyPr/>
+                      </wps:wsp>
+                    </wpg:wgp>
+                  </a:graphicData>
+                </a:graphic>
+              </wp:inline>
+            </w:drawing>
+          </mc:Choice>
+          <mc:Fallback>
+            <w:pict>
+              <v:group w14:anchorId="25E81BDA" id="Group 43" o:spid="_x0000_s1026" style="width:425.6pt;height:3pt;mso-position-horizontal-relative:char;mso-position-vertical-relative:line" coordsize="54051,381" o:gfxdata="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">
+                <v:shape id="Shape 7" o:spid="_x0000_s1027" style="position:absolute;left:44;width:54007;height:0;visibility:visible;mso-wrap-style:square;v-text-anchor:top" coordsize="5400675,0" o:gfxdata="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" path="m,l5400675,e" filled="f" strokeweight="1.5pt">
+                  <v:stroke miterlimit="1" joinstyle="miter"/>
+                  <v:path arrowok="t" textboxrect="0,0,5400675,0"/>
+                </v:shape>
+                <v:shape id="Shape 8" o:spid="_x0000_s1028" style="position:absolute;top:381;width:54006;height:0;visibility:visible;mso-wrap-style:square;v-text-anchor:top" coordsize="5400675,0" o:gfxdata="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" path="m,l5400675,e" filled="f">
+                  <v:stroke miterlimit="1" joinstyle="miter"/>
+                  <v:path arrowok="t" textboxrect="0,0,5400675,0"/>
+                </v:shape>
+                <w10:anchorlock/>
+              </v:group>
+            </w:pict>
+          </mc:Fallback>
+        </mc:AlternateContent>
+      </w:r>
+    </w:p>
+    <w:p>
+      <w:pPr>
+        <w:spacing w:after="0"/>
+        <w:ind w:left="367"/>
+        <w:rPr>
+          <w:sz w:val="22"/>
+        </w:rPr>
+      </w:pPr>
+      <w:r>
+        <w:rPr>
+          <w:b/>
+          <w:sz w:val="22"/>
+        </w:rPr>
+        <w:t xml:space="preserve">ITSAR2 313 – SYSTEM INTEGRATION AND ARCHICTECTURE 2                              </w:t>
+      </w:r>
+      <w:r>
+        <w:rPr>
+          <w:sz w:val="22"/>
+        </w:rPr>
+        <w:t>Page 8 of 9</w:t>
+      </w:r>
+    </w:p>
+    <w:p>
+      <w:pPr>
+        <w:spacing w:after="0"/>
+        <w:ind w:left="367"/>
+        <w:rPr>
+          <w:sz w:val="22"/>
+        </w:rPr>
+      </w:pPr>
+      <w:r>
+        <w:rPr>
+          <w:sz w:val="22"/>
+        </w:rPr>
+        <w:t xml:space="preserve">by:  </w:t>
+      </w:r>
+      <w:r>
+        <w:rPr>
+          <w:b/>
+          <w:sz w:val="22"/>
+        </w:rPr>
+        <w:t xml:space="preserve">Engr. Joao </w:t>
+      </w:r>
+      <w:proofErr w:type="spellStart"/>
+      <w:r>
+        <w:rPr>
+          <w:b/>
+          <w:sz w:val="22"/>
+        </w:rPr>
+        <w:t>Roumil</w:t>
+      </w:r>
+      <w:proofErr w:type="spellEnd"/>
+      <w:r>
+        <w:rPr>
+          <w:b/>
+          <w:sz w:val="22"/>
+        </w:rPr>
+        <w:t xml:space="preserve"> G. Vergara, </w:t>
+      </w:r>
+      <w:proofErr w:type="spellStart"/>
+      <w:r>
+        <w:rPr>
+          <w:b/>
+          <w:sz w:val="22"/>
+        </w:rPr>
+        <w:t>CpE</w:t>
+      </w:r>
+      <w:proofErr w:type="spellEnd"/>
+    </w:p>
+    <w:p>
+      <w:pPr>
+        <w:spacing w:after="0"/>
+        <w:ind w:left="367"/>
+        <w:rPr>
+          <w:sz w:val="22"/>
+        </w:rPr>
+      </w:pPr>
+    </w:p>
+    <w:p>
+      <w:pPr>
         <w:spacing w:before="240" w:after="120"/>
         <w:rPr>
           <w:rFonts w:asciiTheme="minorHAnsi" w:hAnsiTheme="minorHAnsi"/>
@@ -2078,12 +4620,53 @@
           <w:sz w:val="22"/>
         </w:rPr>
       </w:pPr>
-      <w:r>
-        <w:rPr>
-          <w:rFonts w:asciiTheme="minorHAnsi" w:hAnsiTheme="minorHAnsi"/>
-          <w:sz w:val="22"/>
-        </w:rPr>
-        <w:t xml:space="preserve">Laravel Documentation. (2024). The PHP Framework for Web Artisans. </w:t>
+      <w:proofErr w:type="spellStart"/>
+      <w:r>
+        <w:rPr>
+          <w:rFonts w:asciiTheme="minorHAnsi" w:hAnsiTheme="minorHAnsi"/>
+          <w:sz w:val="22"/>
+        </w:rPr>
+        <w:t>Laravel</w:t>
+      </w:r>
+      <w:proofErr w:type="spellEnd"/>
+      <w:r>
+        <w:rPr>
+          <w:rFonts w:asciiTheme="minorHAnsi" w:hAnsiTheme="minorHAnsi"/>
+          <w:sz w:val="22"/>
+        </w:rPr>
+        <w:t xml:space="preserve"> LLC. (2024). </w:t>
+      </w:r>
+      <w:proofErr w:type="spellStart"/>
+      <w:r>
+        <w:rPr>
+          <w:rFonts w:asciiTheme="minorHAnsi" w:hAnsiTheme="minorHAnsi"/>
+          <w:sz w:val="22"/>
+        </w:rPr>
+        <w:t>Laravel</w:t>
+      </w:r>
+      <w:proofErr w:type="spellEnd"/>
+      <w:r>
+        <w:rPr>
+          <w:rFonts w:asciiTheme="minorHAnsi" w:hAnsiTheme="minorHAnsi"/>
+          <w:sz w:val="22"/>
+        </w:rPr>
+        <w:t>: The PHP framework for web artisans.</w:t>
+      </w:r>
+    </w:p>
+    <w:p>
+      <w:pPr>
+        <w:ind w:left="720" w:hanging="720"/>
+        <w:rPr>
+          <w:rFonts w:asciiTheme="minorHAnsi" w:hAnsiTheme="minorHAnsi"/>
+          <w:sz w:val="22"/>
+        </w:rPr>
+      </w:pPr>
+      <w:r>
+        <w:rPr>
+          <w:rFonts w:asciiTheme="minorHAnsi" w:hAnsiTheme="minorHAnsi"/>
+          <w:sz w:val="22"/>
+        </w:rPr>
+        <w:t xml:space="preserve">    </w:t>
       </w:r>
       <w:hyperlink r:id="rId17" w:history="1">
         <w:r>
@@ -2095,13 +4678,6 @@
           <w:t>https://laravel.com/docs</w:t>
         </w:r>
       </w:hyperlink>
-      <w:r>
-        <w:rPr>
-          <w:rFonts w:asciiTheme="minorHAnsi" w:hAnsiTheme="minorHAnsi"/>
-          <w:sz w:val="22"/>
-        </w:rPr>
-        <w:t xml:space="preserve"> </w:t>
-      </w:r>
     </w:p>
     <w:p>
       <w:pPr>
@@ -2116,7 +4692,7 @@
           <w:rFonts w:asciiTheme="minorHAnsi" w:hAnsiTheme="minorHAnsi"/>
           <w:sz w:val="22"/>
         </w:rPr>
-        <w:t>Fowler, M. (2002). Patterns of Enterprise Application Architecture. Addison-Wesley.</w:t>
+        <w:t>Fowler, M. (2002). Patterns of enterprise application architecture.</w:t>
       </w:r>
     </w:p>
     <w:p>
@@ -2132,14 +4708,7 @@
           <w:rFonts w:asciiTheme="minorHAnsi" w:hAnsiTheme="minorHAnsi"/>
           <w:sz w:val="22"/>
         </w:rPr>
-        <w:t>Richardson, C. (20</w:t>
-      </w:r>
-      <w:r>
-        <w:rPr>
-          <w:rFonts w:asciiTheme="minorHAnsi" w:hAnsiTheme="minorHAnsi"/>
-          <w:sz w:val="22"/>
-        </w:rPr>
-        <w:t>18). Microservices Patterns. Manning Publications.</w:t>
+        <w:t xml:space="preserve">    Addison-Wesley.</w:t>
       </w:r>
     </w:p>
     <w:p>
@@ -2155,7 +4724,71 @@
           <w:rFonts w:asciiTheme="minorHAnsi" w:hAnsiTheme="minorHAnsi"/>
           <w:sz w:val="22"/>
         </w:rPr>
-        <w:t xml:space="preserve">Microsoft. (2023). Repository Pattern. </w:t>
+        <w:t xml:space="preserve">Richardson, C. (2018). </w:t>
+      </w:r>
+      <w:proofErr w:type="spellStart"/>
+      <w:r>
+        <w:rPr>
+          <w:rFonts w:asciiTheme="minorHAnsi" w:hAnsiTheme="minorHAnsi"/>
+          <w:sz w:val="22"/>
+        </w:rPr>
+        <w:t>Microservices</w:t>
+      </w:r>
+      <w:proofErr w:type="spellEnd"/>
+      <w:r>
+        <w:rPr>
+          <w:rFonts w:asciiTheme="minorHAnsi" w:hAnsiTheme="minorHAnsi"/>
+          <w:sz w:val="22"/>
+        </w:rPr>
+        <w:t xml:space="preserve"> patterns: Designing and deploying</w:t>
+      </w:r>
+    </w:p>
+    <w:p>
+      <w:pPr>
+        <w:ind w:left="720" w:hanging="720"/>
+        <w:rPr>
+          <w:rFonts w:asciiTheme="minorHAnsi" w:hAnsiTheme="minorHAnsi"/>
+          <w:sz w:val="22"/>
+        </w:rPr>
+      </w:pPr>
+      <w:r>
+        <w:rPr>
+          <w:rFonts w:asciiTheme="minorHAnsi" w:hAnsiTheme="minorHAnsi"/>
+          <w:sz w:val="22"/>
+        </w:rPr>
+        <w:t xml:space="preserve">    cloud native applications. Manning Publications.</w:t>
+      </w:r>
+    </w:p>
+    <w:p>
+      <w:pPr>
+        <w:ind w:left="720" w:hanging="720"/>
+        <w:rPr>
+          <w:rFonts w:asciiTheme="minorHAnsi" w:hAnsiTheme="minorHAnsi"/>
+          <w:sz w:val="22"/>
+        </w:rPr>
+      </w:pPr>
+      <w:r>
+        <w:rPr>
+          <w:rFonts w:asciiTheme="minorHAnsi" w:hAnsiTheme="minorHAnsi"/>
+          <w:sz w:val="22"/>
+        </w:rPr>
+        <w:t>Microsoft. (2023). Repository pattern.</w:t>
+      </w:r>
+    </w:p>
+    <w:p>
+      <w:pPr>
+        <w:ind w:left="720" w:hanging="720"/>
+        <w:rPr>
+          <w:rFonts w:asciiTheme="minorHAnsi" w:hAnsiTheme="minorHAnsi"/>
+          <w:sz w:val="22"/>
+        </w:rPr>
+      </w:pPr>
+      <w:r>
+        <w:rPr>
+          <w:rFonts w:asciiTheme="minorHAnsi" w:hAnsiTheme="minorHAnsi"/>
+          <w:sz w:val="22"/>
+        </w:rPr>
+        <w:t xml:space="preserve">    </w:t>
       </w:r>
       <w:hyperlink r:id="rId18" w:history="1">
         <w:r>
@@ -2167,6 +4800,48 @@
           <w:t>https://docs.microsoft.com/en-us/dotnet/architecture</w:t>
         </w:r>
       </w:hyperlink>
+    </w:p>
+    <w:p>
+      <w:pPr>
+        <w:ind w:left="720" w:hanging="720"/>
+        <w:rPr>
+          <w:rFonts w:asciiTheme="minorHAnsi" w:hAnsiTheme="minorHAnsi"/>
+          <w:sz w:val="22"/>
+        </w:rPr>
+      </w:pPr>
+      <w:r>
+        <w:rPr>
+          <w:rFonts w:asciiTheme="minorHAnsi" w:hAnsiTheme="minorHAnsi"/>
+          <w:sz w:val="22"/>
+        </w:rPr>
+        <w:t>Mozilla Developer Network. (2024). HTTP response status codes.</w:t>
+      </w:r>
+    </w:p>
+    <w:p>
+      <w:pPr>
+        <w:ind w:left="720" w:hanging="720"/>
+        <w:rPr>
+          <w:rFonts w:asciiTheme="minorHAnsi" w:hAnsiTheme="minorHAnsi"/>
+          <w:sz w:val="22"/>
+        </w:rPr>
+      </w:pPr>
+      <w:r>
+        <w:rPr>
+          <w:rFonts w:asciiTheme="minorHAnsi" w:hAnsiTheme="minorHAnsi"/>
+          <w:sz w:val="22"/>
+        </w:rPr>
+        <w:t xml:space="preserve">    </w:t>
+      </w:r>
+      <w:hyperlink r:id="rId19" w:history="1">
+        <w:r>
+          <w:rPr>
+            <w:rStyle w:val="Hyperlink"/>
+            <w:rFonts w:asciiTheme="minorHAnsi" w:hAnsiTheme="minorHAnsi"/>
+            <w:sz w:val="22"/>
+          </w:rPr>
+          <w:t>https://developer.mozilla.org/en-US/docs/Web/HTTP/Status</w:t>
+        </w:r>
+      </w:hyperlink>
       <w:r>
         <w:rPr>
           <w:rFonts w:asciiTheme="minorHAnsi" w:hAnsiTheme="minorHAnsi"/>
@@ -2174,10 +4849,382 @@
         </w:rPr>
         <w:t xml:space="preserve"> </w:t>
       </w:r>
+    </w:p>
+    <w:p>
+      <w:pPr>
+        <w:ind w:left="720" w:hanging="720"/>
+        <w:rPr>
+          <w:rFonts w:asciiTheme="minorHAnsi" w:hAnsiTheme="minorHAnsi"/>
+          <w:sz w:val="22"/>
+        </w:rPr>
+      </w:pPr>
+      <w:r>
+        <w:rPr>
+          <w:rFonts w:asciiTheme="minorHAnsi" w:hAnsiTheme="minorHAnsi"/>
+          <w:sz w:val="22"/>
+        </w:rPr>
+        <w:t>Stenberg, D. (2024). curl: Command line tool and library for</w:t>
+      </w:r>
+    </w:p>
+    <w:p>
+      <w:pPr>
+        <w:ind w:left="720" w:hanging="720"/>
+        <w:rPr>
+          <w:rFonts w:asciiTheme="minorHAnsi" w:hAnsiTheme="minorHAnsi"/>
+          <w:sz w:val="22"/>
+        </w:rPr>
+      </w:pPr>
+      <w:r>
+        <w:rPr>
+          <w:rFonts w:asciiTheme="minorHAnsi" w:hAnsiTheme="minorHAnsi"/>
+          <w:sz w:val="22"/>
+        </w:rPr>
+        <w:t xml:space="preserve">    transferring data with URLs. </w:t>
+      </w:r>
+      <w:hyperlink r:id="rId20" w:history="1">
+        <w:r>
+          <w:rPr>
+            <w:rStyle w:val="Hyperlink"/>
+            <w:rFonts w:asciiTheme="minorHAnsi" w:hAnsiTheme="minorHAnsi"/>
+            <w:sz w:val="22"/>
+          </w:rPr>
+          <w:t>https://curl.se/docs/</w:t>
+        </w:r>
+      </w:hyperlink>
+    </w:p>
+    <w:p>
+      <w:pPr>
+        <w:ind w:left="720" w:hanging="720"/>
+        <w:rPr>
+          <w:rFonts w:asciiTheme="minorHAnsi" w:hAnsiTheme="minorHAnsi"/>
+          <w:sz w:val="22"/>
+        </w:rPr>
+      </w:pPr>
+    </w:p>
+    <w:p>
+      <w:pPr>
+        <w:ind w:left="720" w:hanging="720"/>
+        <w:rPr>
+          <w:rFonts w:asciiTheme="minorHAnsi" w:hAnsiTheme="minorHAnsi"/>
+          <w:sz w:val="22"/>
+        </w:rPr>
+      </w:pPr>
+    </w:p>
+    <w:p>
+      <w:pPr>
+        <w:ind w:left="720" w:hanging="720"/>
+        <w:rPr>
+          <w:rFonts w:asciiTheme="minorHAnsi" w:hAnsiTheme="minorHAnsi"/>
+          <w:sz w:val="22"/>
+        </w:rPr>
+      </w:pPr>
+    </w:p>
+    <w:p>
+      <w:pPr>
+        <w:ind w:left="720" w:hanging="720"/>
+        <w:rPr>
+          <w:rFonts w:asciiTheme="minorHAnsi" w:hAnsiTheme="minorHAnsi"/>
+          <w:sz w:val="22"/>
+        </w:rPr>
+      </w:pPr>
+    </w:p>
+    <w:p>
+      <w:pPr>
+        <w:ind w:left="720" w:hanging="720"/>
+        <w:rPr>
+          <w:rFonts w:asciiTheme="minorHAnsi" w:hAnsiTheme="minorHAnsi"/>
+          <w:sz w:val="22"/>
+        </w:rPr>
+      </w:pPr>
+    </w:p>
+    <w:p>
+      <w:pPr>
+        <w:ind w:left="720" w:hanging="720"/>
+        <w:rPr>
+          <w:rFonts w:asciiTheme="minorHAnsi" w:hAnsiTheme="minorHAnsi"/>
+          <w:sz w:val="22"/>
+        </w:rPr>
+      </w:pPr>
+    </w:p>
+    <w:p>
+      <w:pPr>
+        <w:ind w:left="720" w:hanging="720"/>
+        <w:rPr>
+          <w:rFonts w:asciiTheme="minorHAnsi" w:hAnsiTheme="minorHAnsi"/>
+          <w:sz w:val="22"/>
+        </w:rPr>
+      </w:pPr>
+    </w:p>
+    <w:p>
+      <w:pPr>
+        <w:ind w:left="720" w:hanging="720"/>
+        <w:rPr>
+          <w:rFonts w:asciiTheme="minorHAnsi" w:hAnsiTheme="minorHAnsi"/>
+          <w:sz w:val="22"/>
+        </w:rPr>
+      </w:pPr>
+      <w:bookmarkStart w:id="0" w:name="_GoBack"/>
+    </w:p>
+    <w:bookmarkEnd w:id="0"/>
+    <w:p>
+      <w:pPr>
+        <w:ind w:left="720" w:hanging="720"/>
+        <w:rPr>
+          <w:rFonts w:asciiTheme="minorHAnsi" w:hAnsiTheme="minorHAnsi"/>
+          <w:sz w:val="22"/>
+        </w:rPr>
+      </w:pPr>
+    </w:p>
+    <w:p>
+      <w:pPr>
+        <w:rPr>
+          <w:rFonts w:asciiTheme="minorHAnsi" w:hAnsiTheme="minorHAnsi"/>
+          <w:sz w:val="22"/>
+        </w:rPr>
+      </w:pPr>
+    </w:p>
+    <w:p>
+      <w:pPr>
+        <w:ind w:left="720" w:hanging="720"/>
+        <w:rPr>
+          <w:rFonts w:asciiTheme="minorHAnsi" w:hAnsiTheme="minorHAnsi"/>
+          <w:sz w:val="22"/>
+        </w:rPr>
+      </w:pPr>
+    </w:p>
+    <w:p>
+      <w:pPr>
+        <w:spacing w:after="66"/>
+        <w:ind w:left="427"/>
+        <w:rPr>
+          <w:sz w:val="22"/>
+        </w:rPr>
+      </w:pPr>
+      <w:r>
+        <w:rPr>
+          <w:noProof/>
+          <w:sz w:val="22"/>
+        </w:rPr>
+        <mc:AlternateContent>
+          <mc:Choice Requires="wpg">
+            <w:drawing>
+              <wp:inline distT="0" distB="0" distL="0" distR="0" wp14:anchorId="34692732" wp14:editId="41117EBC">
+                <wp:extent cx="5405120" cy="38100"/>
+                <wp:effectExtent l="0" t="0" r="0" b="0"/>
+                <wp:docPr id="46" name="Group 46"/>
+                <wp:cNvGraphicFramePr/>
+                <a:graphic xmlns:a="http://schemas.openxmlformats.org/drawingml/2006/main">
+                  <a:graphicData uri="http://schemas.microsoft.com/office/word/2010/wordprocessingGroup">
+                    <wpg:wgp>
+                      <wpg:cNvGrpSpPr/>
+                      <wpg:grpSpPr>
+                        <a:xfrm>
+                          <a:off x="0" y="0"/>
+                          <a:ext cx="5405120" cy="38100"/>
+                          <a:chOff x="0" y="0"/>
+                          <a:chExt cx="5405120" cy="38100"/>
+                        </a:xfrm>
+                      </wpg:grpSpPr>
+                      <wps:wsp>
+                        <wps:cNvPr id="47" name="Shape 7"/>
+                        <wps:cNvSpPr/>
+                        <wps:spPr>
+                          <a:xfrm>
+                            <a:off x="4445" y="0"/>
+                            <a:ext cx="5400675" cy="0"/>
+                          </a:xfrm>
+                          <a:custGeom>
+                            <a:avLst/>
+                            <a:gdLst/>
+                            <a:ahLst/>
+                            <a:cxnLst/>
+                            <a:rect l="0" t="0" r="0" b="0"/>
+                            <a:pathLst>
+                              <a:path w="5400675">
+                                <a:moveTo>
+                                  <a:pt x="0" y="0"/>
+                                </a:moveTo>
+                                <a:lnTo>
+                                  <a:pt x="5400675" y="0"/>
+                                </a:lnTo>
+                              </a:path>
+                            </a:pathLst>
+                          </a:custGeom>
+                          <a:ln w="19050" cap="flat">
+                            <a:miter lim="100000"/>
+                          </a:ln>
+                        </wps:spPr>
+                        <wps:style>
+                          <a:lnRef idx="1">
+                            <a:srgbClr val="000000"/>
+                          </a:lnRef>
+                          <a:fillRef idx="0">
+                            <a:srgbClr val="000000">
+                              <a:alpha val="0"/>
+                            </a:srgbClr>
+                          </a:fillRef>
+                          <a:effectRef idx="0">
+                            <a:scrgbClr r="0" g="0" b="0"/>
+                          </a:effectRef>
+                          <a:fontRef idx="none"/>
+                        </wps:style>
+                        <wps:bodyPr/>
+                      </wps:wsp>
+                      <wps:wsp>
+                        <wps:cNvPr id="48" name="Shape 8"/>
+                        <wps:cNvSpPr/>
+                        <wps:spPr>
+                          <a:xfrm>
+                            <a:off x="0" y="38100"/>
+                            <a:ext cx="5400675" cy="0"/>
+                          </a:xfrm>
+                          <a:custGeom>
+                            <a:avLst/>
+                            <a:gdLst/>
+                            <a:ahLst/>
+                            <a:cxnLst/>
+                            <a:rect l="0" t="0" r="0" b="0"/>
+                            <a:pathLst>
+                              <a:path w="5400675">
+                                <a:moveTo>
+                                  <a:pt x="0" y="0"/>
+                                </a:moveTo>
+                                <a:lnTo>
+                                  <a:pt x="5400675" y="0"/>
+                                </a:lnTo>
+                              </a:path>
+                            </a:pathLst>
+                          </a:custGeom>
+                          <a:ln w="9525" cap="flat">
+                            <a:miter lim="100000"/>
+                          </a:ln>
+                        </wps:spPr>
+                        <wps:style>
+                          <a:lnRef idx="1">
+                            <a:srgbClr val="000000"/>
+                          </a:lnRef>
+                          <a:fillRef idx="0">
+                            <a:srgbClr val="000000">
+                              <a:alpha val="0"/>
+                            </a:srgbClr>
+                          </a:fillRef>
+                          <a:effectRef idx="0">
+                            <a:scrgbClr r="0" g="0" b="0"/>
+                          </a:effectRef>
+                          <a:fontRef idx="none"/>
+                        </wps:style>
+                        <wps:bodyPr/>
+                      </wps:wsp>
+                    </wpg:wgp>
+                  </a:graphicData>
+                </a:graphic>
+              </wp:inline>
+            </w:drawing>
+          </mc:Choice>
+          <mc:Fallback>
+            <w:pict>
+              <v:group w14:anchorId="068ABD16" id="Group 46" o:spid="_x0000_s1026" style="width:425.6pt;height:3pt;mso-position-horizontal-relative:char;mso-position-vertical-relative:line" coordsize="54051,381" o:gfxdata="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">
+                <v:shape id="Shape 7" o:spid="_x0000_s1027" style="position:absolute;left:44;width:54007;height:0;visibility:visible;mso-wrap-style:square;v-text-anchor:top" coordsize="5400675,0" o:gfxdata="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" path="m,l5400675,e" filled="f" strokeweight="1.5pt">
+                  <v:stroke miterlimit="1" joinstyle="miter"/>
+                  <v:path arrowok="t" textboxrect="0,0,5400675,0"/>
+                </v:shape>
+                <v:shape id="Shape 8" o:spid="_x0000_s1028" style="position:absolute;top:381;width:54006;height:0;visibility:visible;mso-wrap-style:square;v-text-anchor:top" coordsize="5400675,0" o:gfxdata="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" path="m,l5400675,e" filled="f">
+                  <v:stroke miterlimit="1" joinstyle="miter"/>
+                  <v:path arrowok="t" textboxrect="0,0,5400675,0"/>
+                </v:shape>
+                <w10:anchorlock/>
+              </v:group>
+            </w:pict>
+          </mc:Fallback>
+        </mc:AlternateContent>
+      </w:r>
+    </w:p>
+    <w:p>
+      <w:pPr>
+        <w:spacing w:after="0"/>
+        <w:ind w:left="367"/>
+        <w:rPr>
+          <w:sz w:val="22"/>
+        </w:rPr>
+      </w:pPr>
+      <w:r>
+        <w:rPr>
+          <w:b/>
+          <w:sz w:val="22"/>
+        </w:rPr>
+        <w:t xml:space="preserve">ITSAR2 313 – SYSTEM INTEGRATION AND ARCHICTECTURE 2                              </w:t>
+      </w:r>
+      <w:r>
+        <w:rPr>
+          <w:sz w:val="22"/>
+        </w:rPr>
+        <w:t>Page 9</w:t>
+      </w:r>
+      <w:r>
+        <w:rPr>
+          <w:sz w:val="22"/>
+        </w:rPr>
+        <w:t xml:space="preserve"> of 9</w:t>
+      </w:r>
+    </w:p>
+    <w:p>
+      <w:pPr>
+        <w:spacing w:after="0"/>
+        <w:ind w:left="367"/>
+        <w:rPr>
+          <w:sz w:val="22"/>
+        </w:rPr>
+      </w:pPr>
+      <w:r>
+        <w:rPr>
+          <w:sz w:val="22"/>
+        </w:rPr>
+        <w:t xml:space="preserve">by:  </w:t>
+      </w:r>
+      <w:r>
+        <w:rPr>
+          <w:b/>
+          <w:sz w:val="22"/>
+        </w:rPr>
+        <w:t xml:space="preserve">Engr. Joao </w:t>
+      </w:r>
+      <w:proofErr w:type="spellStart"/>
+      <w:r>
+        <w:rPr>
+          <w:b/>
+          <w:sz w:val="22"/>
+        </w:rPr>
+        <w:t>Roumil</w:t>
+      </w:r>
+      <w:proofErr w:type="spellEnd"/>
+      <w:r>
+        <w:rPr>
+          <w:b/>
+          <w:sz w:val="22"/>
+        </w:rPr>
+        <w:t xml:space="preserve"> G. Vergara, </w:t>
+      </w:r>
+      <w:proofErr w:type="spellStart"/>
+      <w:r>
+        <w:rPr>
+          <w:b/>
+          <w:sz w:val="22"/>
+        </w:rPr>
+        <w:t>CpE</w:t>
+      </w:r>
+      <w:proofErr w:type="spellEnd"/>
+    </w:p>
+    <w:p>
+      <w:pPr>
+        <w:ind w:left="720" w:hanging="720"/>
+        <w:rPr>
+          <w:rFonts w:asciiTheme="minorHAnsi" w:hAnsiTheme="minorHAnsi"/>
+          <w:sz w:val="22"/>
+        </w:rPr>
+      </w:pPr>
     </w:p>
     <w:sectPr>
-      <w:headerReference w:type="default" r:id="rId19"/>
-      <w:footerReference w:type="default" r:id="rId20"/>
+      <w:footerReference w:type="default" r:id="rId21"/>
       <w:pgSz w:w="12240" w:h="15840"/>
       <w:pgMar w:top="1440" w:right="1440" w:bottom="1440" w:left="1440" w:header="720" w:footer="720" w:gutter="0"/>
       <w:cols w:space="720"/>
@@ -2219,54 +5266,6 @@
       <w:pStyle w:val="Footer"/>
       <w:jc w:val="center"/>
     </w:pPr>
-    <w:r>
-      <w:rPr>
-        <w:sz w:val="18"/>
-      </w:rPr>
-      <w:t xml:space="preserve">Page </w:t>
-    </w:r>
-    <w:r>
-      <w:fldChar w:fldCharType="begin"/>
-    </w:r>
-    <w:r>
-      <w:instrText xml:space="preserve"> PAGE </w:instrText>
-    </w:r>
-    <w:r>
-      <w:fldChar w:fldCharType="separate"/>
-    </w:r>
-    <w:r>
-      <w:rPr>
-        <w:noProof/>
-      </w:rPr>
-      <w:t>8</w:t>
-    </w:r>
-    <w:r>
-      <w:fldChar w:fldCharType="end"/>
-    </w:r>
-    <w:r>
-      <w:rPr>
-        <w:sz w:val="18"/>
-      </w:rPr>
-      <w:t xml:space="preserve"> of </w:t>
-    </w:r>
-    <w:r>
-      <w:fldChar w:fldCharType="begin"/>
-    </w:r>
-    <w:r>
-      <w:instrText xml:space="preserve"> NUMPAGES </w:instrText>
-    </w:r>
-    <w:r>
-      <w:fldChar w:fldCharType="separate"/>
-    </w:r>
-    <w:r>
-      <w:rPr>
-        <w:noProof/>
-      </w:rPr>
-      <w:t>8</w:t>
-    </w:r>
-    <w:r>
-      <w:fldChar w:fldCharType="end"/>
-    </w:r>
   </w:p>
 </w:ftr>
 </file>
@@ -2294,31 +5293,6 @@
     </w:p>
   </w:footnote>
 </w:footnotes>
-</file>
-
-<file path=word/header1.xml><?xml version="1.0" encoding="utf-8"?>
-<w:hdr xmlns:wpc="http://schemas.microsoft.com/office/word/2010/wordprocessingCanvas" xmlns:cx="http://schemas.microsoft.com/office/drawing/2014/chartex" xmlns:mc="http://schemas.openxmlformats.org/markup-compatibility/2006" xmlns:o="urn:schemas-microsoft-com:office:office" xmlns:r="http://schemas.openxmlformats.org/officeDocument/2006/relationships" xmlns:m="http://schemas.openxmlformats.org/officeDocument/2006/math" xmlns:v="urn:schemas-microsoft-com:vml" xmlns:wp14="http://schemas.microsoft.com/office/word/2010/wordprocessingDrawing" xmlns:wp="http://schemas.openxmlformats.org/drawingml/2006/wordprocessingDrawing" xmlns:w10="urn:schemas-microsoft-com:office:word" xmlns:w="http://schemas.openxmlformats.org/wordprocessingml/2006/main" xmlns:w14="http://schemas.microsoft.com/office/word/2010/wordml" xmlns:w15="http://schemas.microsoft.com/office/word/2012/wordml" xmlns:w16se="http://schemas.microsoft.com/office/word/2015/wordml/symex" xmlns:wpg="http://schemas.microsoft.com/office/word/2010/wordprocessingGroup" xmlns:wpi="http://schemas.microsoft.com/office/word/2010/wordprocessingInk" xmlns:wne="http://schemas.microsoft.com/office/word/2006/wordml" xmlns:wps="http://schemas.microsoft.com/office/word/2010/wordprocessingShape" mc:Ignorable="w14 w15 w16se wp14">
-  <w:p>
-    <w:pPr>
-      <w:pStyle w:val="Header"/>
-      <w:jc w:val="center"/>
-    </w:pPr>
-    <w:r>
-      <w:rPr>
-        <w:i/>
-        <w:sz w:val="18"/>
-      </w:rPr>
-      <w:t>ITSAR2 313 – SYSTEM INTEGRATION AND ARCHITE</w:t>
-    </w:r>
-    <w:r>
-      <w:rPr>
-        <w:i/>
-        <w:sz w:val="18"/>
-      </w:rPr>
-      <w:t>CTURE 2</w:t>
-    </w:r>
-  </w:p>
-</w:hdr>
 </file>
 
 <file path=word/numbering.xml><?xml version="1.0" encoding="utf-8"?>
@@ -2908,7 +5882,7 @@
   <w:style w:type="paragraph" w:default="1" w:styleId="Normal">
     <w:name w:val="Normal"/>
     <w:qFormat/>
-    <w:rsid w:val="00FC693F"/>
+    <w:rsid w:val="002449FF"/>
     <w:rPr>
       <w:rFonts w:ascii="Cambria" w:hAnsi="Cambria" w:cs="Cambria"/>
       <w:sz w:val="20"/>
@@ -14240,7 +17214,7 @@
 </file>
 
 <file path=customXml/itemProps1.xml><?xml version="1.0" encoding="utf-8"?>
-<ds:datastoreItem xmlns:ds="http://schemas.openxmlformats.org/officeDocument/2006/customXml" ds:itemID="{03817C4D-371A-40C6-9EBA-E74BDF5FBB25}">
+<ds:datastoreItem xmlns:ds="http://schemas.openxmlformats.org/officeDocument/2006/customXml" ds:itemID="{7FC492EE-02A7-43E1-835B-BB5ABB648ABC}">
   <ds:schemaRefs>
     <ds:schemaRef ds:uri="http://schemas.openxmlformats.org/officeDocument/2006/bibliography"/>
   </ds:schemaRefs>

</xml_diff>